<commit_message>
Mémoire technique v2 : visuels, annexes intégrées et nouveaux arguments
- Modifications de Loyk intégrées (conducteur de travaux 5 ans, encadrant
  technique SS4, suppression du callout Notre atout, 48h)
- Références bailleurs bretons, labels HANDIBAT/QUALIBAT, ergothérapeutes,
  réunions de suivi, garantie produit 10 ans, engagement 4 semaines,
  logistique GEODIS 5 j ouvrés, 6 modes opératoires SS4 + DUERP
- Visuels dans le langage graphique du triptyque VISAP : logo et photo
  officiels extraits, graphique CA, chronologie verticale, chaîne
  logistique, schéma INTERFAST, montage photos avant/après
- Annexes reproduites : VISAP 3 volets, PV de réception, notice entretien
- Générateur : helper images, graphiques.py, assets dans le dépôt

Co-Authored-By: Claude Fable 5 <noreply@anthropic.com>
Claude-Session: https://claude.ai/code/session_01K5LwA8NCS9B4vD9dp2U7H2
</commit_message>
<xml_diff>
--- a/documents/MEMOIRE_TECHNIQUE_ADOM_SENIOR_MORBIHAN_HABITAT.docx
+++ b/documents/MEMOIRE_TECHNIQUE_ADOM_SENIOR_MORBIHAN_HABITAT.docx
@@ -4,39 +4,59 @@
   <w:body>
     <w:p>
       <w:pPr>
-        <w:spacing w:after="0" w:before="1200"/>
-      </w:pPr>
-    </w:p>
-    <w:p>
-      <w:pPr>
-        <w:spacing w:after="80"/>
-      </w:pPr>
-      <w:r>
-        <w:rPr>
-          <w:rFonts w:ascii="Georgia" w:cs="Georgia" w:eastAsia="Georgia" w:hAnsi="Georgia"/>
-          <w:b/>
-          <w:bCs/>
-          <w:color w:val="073E47"/>
-          <w:sz w:val="60"/>
-          <w:szCs w:val="60"/>
-        </w:rPr>
-        <w:t xml:space="preserve">Adom</w:t>
-      </w:r>
-      <w:r>
-        <w:rPr>
-          <w:rFonts w:ascii="Georgia" w:cs="Georgia" w:eastAsia="Georgia" w:hAnsi="Georgia"/>
-          <w:b/>
-          <w:bCs/>
-          <w:color w:val="DB982D"/>
-          <w:sz w:val="60"/>
-          <w:szCs w:val="60"/>
-        </w:rPr>
-        <w:t xml:space="preserve">senior</w:t>
-      </w:r>
-    </w:p>
-    <w:p>
-      <w:pPr>
-        <w:spacing w:after="120"/>
+        <w:spacing w:after="0" w:before="400"/>
+      </w:pPr>
+    </w:p>
+    <w:p>
+      <w:pPr>
+        <w:spacing w:after="120" w:before="80"/>
+        <w:jc w:val="center"/>
+      </w:pPr>
+      <w:r>
+        <w:drawing>
+          <wp:inline distT="0" distB="0" distL="0" distR="0">
+            <wp:extent cx="2857500" cy="533400"/>
+            <wp:effectExtent t="0" r="0" b="0" l="0"/>
+            <wp:docPr id="1" name="" descr="" title=""/>
+            <wp:cNvGraphicFramePr>
+              <a:graphicFrameLocks xmlns:a="http://schemas.openxmlformats.org/drawingml/2006/main" noChangeAspect="1"/>
+            </wp:cNvGraphicFramePr>
+            <a:graphic xmlns:a="http://schemas.openxmlformats.org/drawingml/2006/main">
+              <a:graphicData uri="http://schemas.openxmlformats.org/drawingml/2006/picture">
+                <pic:pic xmlns:pic="http://schemas.openxmlformats.org/drawingml/2006/picture">
+                  <pic:nvPicPr>
+                    <pic:cNvPr id="0" name="" descr=""/>
+                    <pic:cNvPicPr>
+                      <a:picLocks noChangeAspect="1" noChangeArrowheads="1"/>
+                    </pic:cNvPicPr>
+                  </pic:nvPicPr>
+                  <pic:blipFill>
+                    <a:blip r:embed="rId9" cstate="none"/>
+                    <a:srcRect/>
+                    <a:stretch>
+                      <a:fillRect/>
+                    </a:stretch>
+                  </pic:blipFill>
+                  <pic:spPr bwMode="auto">
+                    <a:xfrm>
+                      <a:off x="0" y="0"/>
+                      <a:ext cx="2857500" cy="533400"/>
+                    </a:xfrm>
+                    <a:prstGeom prst="rect">
+                      <a:avLst/>
+                    </a:prstGeom>
+                  </pic:spPr>
+                </pic:pic>
+              </a:graphicData>
+            </a:graphic>
+          </wp:inline>
+        </w:drawing>
+      </w:r>
+    </w:p>
+    <w:p>
+      <w:pPr>
+        <w:spacing w:after="120" w:before="120"/>
+        <w:jc w:val="center"/>
       </w:pPr>
       <w:r>
         <w:rPr>
@@ -52,7 +72,8 @@
     </w:p>
     <w:p>
       <w:pPr>
-        <w:spacing w:after="400"/>
+        <w:spacing w:after="240"/>
+        <w:jc w:val="center"/>
       </w:pPr>
       <w:r>
         <w:rPr>
@@ -68,24 +89,53 @@
     </w:p>
     <w:p>
       <w:pPr>
-        <w:pStyle w:val="Heading3"/>
-        <w:spacing w:after="80" w:before="160"/>
-      </w:pPr>
-      <w:r>
-        <w:rPr>
-          <w:rFonts w:ascii="Arial" w:cs="Arial" w:eastAsia="Arial" w:hAnsi="Arial"/>
-          <w:b/>
-          <w:bCs/>
-          <w:color w:val="073E47"/>
-          <w:sz w:val="20"/>
-          <w:szCs w:val="20"/>
-        </w:rPr>
-        <w:t xml:space="preserve">Adaptation de logements pour le maintien à domicile des locataires seniors et PMR — plomberie, sanitaire, douches sécurisées</w:t>
-      </w:r>
-    </w:p>
-    <w:p>
-      <w:pPr>
-        <w:spacing w:after="200"/>
+        <w:spacing w:after="120" w:before="80"/>
+        <w:jc w:val="center"/>
+      </w:pPr>
+      <w:r>
+        <w:drawing>
+          <wp:inline distT="0" distB="0" distL="0" distR="0">
+            <wp:extent cx="2381250" cy="3362325"/>
+            <wp:effectExtent t="0" r="0" b="0" l="0"/>
+            <wp:docPr id="1" name="" descr="" title=""/>
+            <wp:cNvGraphicFramePr>
+              <a:graphicFrameLocks xmlns:a="http://schemas.openxmlformats.org/drawingml/2006/main" noChangeAspect="1"/>
+            </wp:cNvGraphicFramePr>
+            <a:graphic xmlns:a="http://schemas.openxmlformats.org/drawingml/2006/main">
+              <a:graphicData uri="http://schemas.openxmlformats.org/drawingml/2006/picture">
+                <pic:pic xmlns:pic="http://schemas.openxmlformats.org/drawingml/2006/picture">
+                  <pic:nvPicPr>
+                    <pic:cNvPr id="0" name="" descr=""/>
+                    <pic:cNvPicPr>
+                      <a:picLocks noChangeAspect="1" noChangeArrowheads="1"/>
+                    </pic:cNvPicPr>
+                  </pic:nvPicPr>
+                  <pic:blipFill>
+                    <a:blip r:embed="rId10" cstate="none"/>
+                    <a:srcRect/>
+                    <a:stretch>
+                      <a:fillRect/>
+                    </a:stretch>
+                  </pic:blipFill>
+                  <pic:spPr bwMode="auto">
+                    <a:xfrm>
+                      <a:off x="0" y="0"/>
+                      <a:ext cx="2381250" cy="3362325"/>
+                    </a:xfrm>
+                    <a:prstGeom prst="rect">
+                      <a:avLst/>
+                    </a:prstGeom>
+                  </pic:spPr>
+                </pic:pic>
+              </a:graphicData>
+            </a:graphic>
+          </wp:inline>
+        </w:drawing>
+      </w:r>
+    </w:p>
+    <w:p>
+      <w:pPr>
+        <w:spacing w:after="160"/>
       </w:pPr>
     </w:p>
     <w:tbl>
@@ -619,7 +669,7 @@
           <w:sz w:val="21"/>
           <w:szCs w:val="21"/>
         </w:rPr>
-        <w:t xml:space="preserve">	5</w:t>
+        <w:t xml:space="preserve">	6</w:t>
       </w:r>
     </w:p>
     <w:p>
@@ -649,7 +699,7 @@
           <w:sz w:val="21"/>
           <w:szCs w:val="21"/>
         </w:rPr>
-        <w:t xml:space="preserve">	6</w:t>
+        <w:t xml:space="preserve">	7</w:t>
       </w:r>
     </w:p>
     <w:p>
@@ -679,7 +729,7 @@
           <w:sz w:val="21"/>
           <w:szCs w:val="21"/>
         </w:rPr>
-        <w:t xml:space="preserve">	8</w:t>
+        <w:t xml:space="preserve">	9</w:t>
       </w:r>
     </w:p>
     <w:p>
@@ -709,7 +759,7 @@
           <w:sz w:val="21"/>
           <w:szCs w:val="21"/>
         </w:rPr>
-        <w:t xml:space="preserve">	10</w:t>
+        <w:t xml:space="preserve">	12</w:t>
       </w:r>
     </w:p>
     <w:p>
@@ -739,7 +789,7 @@
           <w:sz w:val="21"/>
           <w:szCs w:val="21"/>
         </w:rPr>
-        <w:t xml:space="preserve">	12</w:t>
+        <w:t xml:space="preserve">	14</w:t>
       </w:r>
     </w:p>
     <w:p>
@@ -769,7 +819,7 @@
           <w:sz w:val="21"/>
           <w:szCs w:val="21"/>
         </w:rPr>
-        <w:t xml:space="preserve">	13</w:t>
+        <w:t xml:space="preserve">	16</w:t>
       </w:r>
     </w:p>
     <w:p>
@@ -799,7 +849,7 @@
           <w:sz w:val="21"/>
           <w:szCs w:val="21"/>
         </w:rPr>
-        <w:t xml:space="preserve">	14</w:t>
+        <w:t xml:space="preserve">	18</w:t>
       </w:r>
     </w:p>
     <w:p>
@@ -829,7 +879,7 @@
           <w:sz w:val="21"/>
           <w:szCs w:val="21"/>
         </w:rPr>
-        <w:t xml:space="preserve">	15</w:t>
+        <w:t xml:space="preserve">	19</w:t>
       </w:r>
     </w:p>
     <w:p>
@@ -859,7 +909,7 @@
           <w:sz w:val="21"/>
           <w:szCs w:val="21"/>
         </w:rPr>
-        <w:t xml:space="preserve">	16</w:t>
+        <w:t xml:space="preserve">	20</w:t>
       </w:r>
     </w:p>
     <w:p>
@@ -889,7 +939,7 @@
           <w:sz w:val="21"/>
           <w:szCs w:val="21"/>
         </w:rPr>
-        <w:t xml:space="preserve">	17</w:t>
+        <w:t xml:space="preserve">	21</w:t>
       </w:r>
     </w:p>
     <w:p>
@@ -919,7 +969,37 @@
           <w:sz w:val="21"/>
           <w:szCs w:val="21"/>
         </w:rPr>
-        <w:t xml:space="preserve">	18</w:t>
+        <w:t xml:space="preserve">	22</w:t>
+      </w:r>
+    </w:p>
+    <w:p>
+      <w:pPr>
+        <w:tabs>
+          <w:tab w:val="right" w:pos="9360" w:leader="dot"/>
+        </w:tabs>
+        <w:spacing w:after="140" w:line="276"/>
+      </w:pPr>
+      <w:r>
+        <w:rPr>
+          <w:rFonts w:ascii="Arial" w:cs="Arial" w:eastAsia="Arial" w:hAnsi="Arial"/>
+          <w:b/>
+          <w:bCs/>
+          <w:color w:val="073E47"/>
+          <w:sz w:val="21"/>
+          <w:szCs w:val="21"/>
+        </w:rPr>
+        <w:t xml:space="preserve">Annexes reproduites — VISAP, PV de réception, notice d’entretien</w:t>
+      </w:r>
+      <w:r>
+        <w:rPr>
+          <w:rFonts w:ascii="Arial" w:cs="Arial" w:eastAsia="Arial" w:hAnsi="Arial"/>
+          <w:b/>
+          <w:bCs/>
+          <w:color w:val="0F6470"/>
+          <w:sz w:val="21"/>
+          <w:szCs w:val="21"/>
+        </w:rPr>
+        <w:t xml:space="preserve">	23</w:t>
       </w:r>
     </w:p>
     <w:p>
@@ -1554,6 +1634,64 @@
                 <w:sz w:val="18"/>
                 <w:szCs w:val="18"/>
               </w:rPr>
+              <w:t xml:space="preserve">Labels</w:t>
+            </w:r>
+          </w:p>
+        </w:tc>
+        <w:tc>
+          <w:tcPr>
+            <w:tcW w:type="dxa" w:w="6560"/>
+            <w:tcMar>
+              <w:top w:type="dxa" w:w="60"/>
+              <w:left w:type="dxa" w:w="100"/>
+              <w:bottom w:type="dxa" w:w="60"/>
+              <w:right w:type="dxa" w:w="100"/>
+            </w:tcMar>
+            <w:vAlign w:val="center"/>
+          </w:tcPr>
+          <w:p>
+            <w:pPr>
+              <w:spacing w:line="240"/>
+            </w:pPr>
+            <w:r>
+              <w:rPr>
+                <w:rFonts w:ascii="Arial" w:cs="Arial" w:eastAsia="Arial" w:hAnsi="Arial"/>
+                <w:b w:val="false"/>
+                <w:bCs w:val="false"/>
+                <w:color w:val="243238"/>
+                <w:sz w:val="18"/>
+                <w:szCs w:val="18"/>
+              </w:rPr>
+              <w:t xml:space="preserve">HANDIBAT (labélisés) ; QUALIBAT en cours d’obtention</w:t>
+            </w:r>
+          </w:p>
+        </w:tc>
+      </w:tr>
+      <w:tr>
+        <w:tc>
+          <w:tcPr>
+            <w:tcW w:type="dxa" w:w="2800"/>
+            <w:tcMar>
+              <w:top w:type="dxa" w:w="60"/>
+              <w:left w:type="dxa" w:w="100"/>
+              <w:bottom w:type="dxa" w:w="60"/>
+              <w:right w:type="dxa" w:w="100"/>
+            </w:tcMar>
+            <w:vAlign w:val="center"/>
+          </w:tcPr>
+          <w:p>
+            <w:pPr>
+              <w:spacing w:line="240"/>
+            </w:pPr>
+            <w:r>
+              <w:rPr>
+                <w:rFonts w:ascii="Arial" w:cs="Arial" w:eastAsia="Arial" w:hAnsi="Arial"/>
+                <w:b/>
+                <w:bCs/>
+                <w:color w:val="243238"/>
+                <w:sz w:val="18"/>
+                <w:szCs w:val="18"/>
+              </w:rPr>
               <w:t xml:space="preserve">Expérience</w:t>
             </w:r>
           </w:p>
@@ -1612,6 +1750,135 @@
     </w:p>
     <w:p>
       <w:pPr>
+        <w:spacing w:after="120" w:before="80"/>
+        <w:jc w:val="center"/>
+      </w:pPr>
+      <w:r>
+        <w:drawing>
+          <wp:inline distT="0" distB="0" distL="0" distR="0">
+            <wp:extent cx="5905500" cy="3257550"/>
+            <wp:effectExtent t="0" r="0" b="0" l="0"/>
+            <wp:docPr id="1" name="" descr="" title=""/>
+            <wp:cNvGraphicFramePr>
+              <a:graphicFrameLocks xmlns:a="http://schemas.openxmlformats.org/drawingml/2006/main" noChangeAspect="1"/>
+            </wp:cNvGraphicFramePr>
+            <a:graphic xmlns:a="http://schemas.openxmlformats.org/drawingml/2006/main">
+              <a:graphicData uri="http://schemas.openxmlformats.org/drawingml/2006/picture">
+                <pic:pic xmlns:pic="http://schemas.openxmlformats.org/drawingml/2006/picture">
+                  <pic:nvPicPr>
+                    <pic:cNvPr id="0" name="" descr=""/>
+                    <pic:cNvPicPr>
+                      <a:picLocks noChangeAspect="1" noChangeArrowheads="1"/>
+                    </pic:cNvPicPr>
+                  </pic:nvPicPr>
+                  <pic:blipFill>
+                    <a:blip r:embed="rId11" cstate="none"/>
+                    <a:srcRect/>
+                    <a:stretch>
+                      <a:fillRect/>
+                    </a:stretch>
+                  </pic:blipFill>
+                  <pic:spPr bwMode="auto">
+                    <a:xfrm>
+                      <a:off x="0" y="0"/>
+                      <a:ext cx="5905500" cy="3257550"/>
+                    </a:xfrm>
+                    <a:prstGeom prst="rect">
+                      <a:avLst/>
+                    </a:prstGeom>
+                  </pic:spPr>
+                </pic:pic>
+              </a:graphicData>
+            </a:graphic>
+          </wp:inline>
+        </w:drawing>
+      </w:r>
+    </w:p>
+    <w:p>
+      <w:pPr>
+        <w:spacing w:after="40"/>
+      </w:pPr>
+    </w:p>
+    <w:tbl>
+      <w:tblPr>
+        <w:tblW w:type="dxa" w:w="9360"/>
+        <w:tblBorders>
+          <w:top w:val="none"/>
+          <w:left w:val="single" w:color="0F6470" w:sz="24"/>
+          <w:bottom w:val="none"/>
+          <w:right w:val="none"/>
+          <w:insideH w:val="none"/>
+          <w:insideV w:val="none"/>
+        </w:tblBorders>
+      </w:tblPr>
+      <w:tblGrid>
+        <w:gridCol w:w="9360"/>
+      </w:tblGrid>
+      <w:tr>
+        <w:tc>
+          <w:tcPr>
+            <w:tcW w:type="dxa" w:w="9360"/>
+            <w:shd w:fill="EAF2F3" w:val="clear"/>
+            <w:tcMar>
+              <w:top w:type="dxa" w:w="90"/>
+              <w:left w:type="dxa" w:w="140"/>
+              <w:bottom w:type="dxa" w:w="90"/>
+              <w:right w:type="dxa" w:w="140"/>
+            </w:tcMar>
+          </w:tcPr>
+          <w:p>
+            <w:pPr>
+              <w:spacing w:line="252"/>
+              <w:jc w:val="both"/>
+            </w:pPr>
+            <w:r>
+              <w:rPr>
+                <w:rFonts w:ascii="Arial" w:cs="Arial" w:eastAsia="Arial" w:hAnsi="Arial"/>
+                <w:b/>
+                <w:bCs/>
+                <w:color w:val="073E47"/>
+                <w:sz w:val="19"/>
+                <w:szCs w:val="19"/>
+              </w:rPr>
+              <w:t xml:space="preserve">RÉFÉRENCE MORBIHAN HABITAT  </w:t>
+            </w:r>
+            <w:r>
+              <w:rPr>
+                <w:rFonts w:ascii="Arial" w:cs="Arial" w:eastAsia="Arial" w:hAnsi="Arial"/>
+                <w:color w:val="243238"/>
+                <w:sz w:val="19"/>
+                <w:szCs w:val="19"/>
+              </w:rPr>
+              <w:t xml:space="preserve">En 2025, ADOM SENIOR a réalisé 150 K€ de chiffre d’affaires pour 105 chantiers exécutés en sous-traitance d’ASH sur le patrimoine de Morbihan Habitat. Les équipes qui interviendront sur ce marché connaissent donc déjà le parc, les locataires, les circuits de validation et les attendus du bailleur.</w:t>
+            </w:r>
+          </w:p>
+        </w:tc>
+      </w:tr>
+    </w:tbl>
+    <w:p>
+      <w:pPr>
+        <w:spacing w:after="120"/>
+      </w:pPr>
+    </w:p>
+    <w:p>
+      <w:pPr>
+        <w:pStyle w:val="Heading2"/>
+        <w:spacing w:after="100" w:before="200"/>
+      </w:pPr>
+      <w:r>
+        <w:rPr>
+          <w:rFonts w:ascii="Arial" w:cs="Arial" w:eastAsia="Arial" w:hAnsi="Arial"/>
+          <w:b/>
+          <w:bCs/>
+          <w:color w:val="0F6470"/>
+          <w:sz w:val="22"/>
+          <w:szCs w:val="22"/>
+        </w:rPr>
+        <w:t xml:space="preserve">Un ancrage breton assumé</w:t>
+      </w:r>
+    </w:p>
+    <w:p>
+      <w:pPr>
         <w:spacing w:after="120" w:line="264"/>
         <w:jc w:val="both"/>
       </w:pPr>
@@ -1622,7 +1889,883 @@
           <w:sz w:val="19"/>
           <w:szCs w:val="19"/>
         </w:rPr>
-        <w:t xml:space="preserve">ADOM SENIOR connaît une croissance forte et continue, portée par la qualité de ses interventions et la fidélité de ses partenaires bailleurs :</w:t>
+        <w:t xml:space="preserve">Contrairement aux opérateurs nationaux, ADOM SENIOR concentre son activité sur la Bretagne. Ce choix de proximité est un engagement de service : des équipes locales, des délais de déplacement courts, une connaissance fine du tissu territorial (agences de proximité, fournisseurs locaux, entreprises partenaires) et une réactivité réelle en cas de SAV ou d’urgence.</w:t>
+      </w:r>
+    </w:p>
+    <w:p>
+      <w:pPr>
+        <w:pStyle w:val="ListParagraph"/>
+        <w:numPr>
+          <w:ilvl w:val="0"/>
+          <w:numId w:val="2"/>
+        </w:numPr>
+        <w:spacing w:after="60" w:line="252"/>
+        <w:jc w:val="both"/>
+      </w:pPr>
+      <w:r>
+        <w:rPr>
+          <w:rFonts w:ascii="Arial" w:cs="Arial" w:eastAsia="Arial" w:hAnsi="Arial"/>
+          <w:color w:val="243238"/>
+          <w:sz w:val="19"/>
+          <w:szCs w:val="19"/>
+        </w:rPr>
+        <w:t xml:space="preserve">Des tournées optimisées à l’échelle du département — pas de poseurs « détachés » venant de l’autre bout de la France ;</w:t>
+      </w:r>
+    </w:p>
+    <w:p>
+      <w:pPr>
+        <w:pStyle w:val="ListParagraph"/>
+        <w:numPr>
+          <w:ilvl w:val="0"/>
+          <w:numId w:val="2"/>
+        </w:numPr>
+        <w:spacing w:after="60" w:line="252"/>
+        <w:jc w:val="both"/>
+      </w:pPr>
+      <w:r>
+        <w:rPr>
+          <w:rFonts w:ascii="Arial" w:cs="Arial" w:eastAsia="Arial" w:hAnsi="Arial"/>
+          <w:color w:val="243238"/>
+          <w:sz w:val="19"/>
+          <w:szCs w:val="19"/>
+        </w:rPr>
+        <w:t xml:space="preserve">Un approvisionnement de proximité via le réseau CEDEO du Morbihan (Lorient, Lanester, Auray, Theix–Vannes, Vannes Ouest, Ploërmel, Saint-Thuriau) ;</w:t>
+      </w:r>
+    </w:p>
+    <w:p>
+      <w:pPr>
+        <w:pStyle w:val="ListParagraph"/>
+        <w:numPr>
+          <w:ilvl w:val="0"/>
+          <w:numId w:val="2"/>
+        </w:numPr>
+        <w:spacing w:after="60" w:line="252"/>
+        <w:jc w:val="both"/>
+      </w:pPr>
+      <w:r>
+        <w:rPr>
+          <w:rFonts w:ascii="Arial" w:cs="Arial" w:eastAsia="Arial" w:hAnsi="Arial"/>
+          <w:color w:val="243238"/>
+          <w:sz w:val="19"/>
+          <w:szCs w:val="19"/>
+        </w:rPr>
+        <w:t xml:space="preserve">Une capacité à se rendre sur site sous 48h pour toute situation urgente ou visite complémentaire.</w:t>
+      </w:r>
+    </w:p>
+    <w:p>
+      <w:pPr>
+        <w:spacing w:after="60"/>
+      </w:pPr>
+    </w:p>
+    <w:p>
+      <w:pPr>
+        <w:pStyle w:val="Heading2"/>
+        <w:spacing w:after="100" w:before="200"/>
+      </w:pPr>
+      <w:r>
+        <w:rPr>
+          <w:rFonts w:ascii="Arial" w:cs="Arial" w:eastAsia="Arial" w:hAnsi="Arial"/>
+          <w:b/>
+          <w:bCs/>
+          <w:color w:val="0F6470"/>
+          <w:sz w:val="22"/>
+          <w:szCs w:val="22"/>
+        </w:rPr>
+        <w:t xml:space="preserve">Notre histoire : l’organisation qui réalisait déjà les poses</w:t>
+      </w:r>
+    </w:p>
+    <w:p>
+      <w:pPr>
+        <w:spacing w:after="120" w:line="264"/>
+        <w:jc w:val="both"/>
+      </w:pPr>
+      <w:r>
+        <w:rPr>
+          <w:rFonts w:ascii="Arial" w:cs="Arial" w:eastAsia="Arial" w:hAnsi="Arial"/>
+          <w:color w:val="243238"/>
+          <w:sz w:val="19"/>
+          <w:szCs w:val="19"/>
+        </w:rPr>
+        <w:t xml:space="preserve">ADOM SENIOR s’est structurée autour du savoir-faire des équipes qui exécutaient la majorité des interventions d’adaptation PMR réalisées en Bretagne en sous-traitance d’ASH (Aménagement Séniors Habitat). À la suite de la liquidation d’ASH, ADOM SENIOR a repris les actifs et intégré les hommes clés de cette organisation :</w:t>
+      </w:r>
+    </w:p>
+    <w:p>
+      <w:pPr>
+        <w:pStyle w:val="ListParagraph"/>
+        <w:numPr>
+          <w:ilvl w:val="0"/>
+          <w:numId w:val="2"/>
+        </w:numPr>
+        <w:spacing w:after="60" w:line="252"/>
+        <w:jc w:val="both"/>
+      </w:pPr>
+      <w:r>
+        <w:rPr>
+          <w:rFonts w:ascii="Arial" w:cs="Arial" w:eastAsia="Arial" w:hAnsi="Arial"/>
+          <w:color w:val="243238"/>
+          <w:sz w:val="19"/>
+          <w:szCs w:val="19"/>
+        </w:rPr>
+        <w:t xml:space="preserve">Loyk Duporge, ancien salarié d’ASH, conducteur de travaux (5 ans d’expérience), encadrant technique SS4, assure la direction et la supervision des engagements de l’entreprise ;</w:t>
+      </w:r>
+    </w:p>
+    <w:p>
+      <w:pPr>
+        <w:pStyle w:val="ListParagraph"/>
+        <w:numPr>
+          <w:ilvl w:val="0"/>
+          <w:numId w:val="2"/>
+        </w:numPr>
+        <w:spacing w:after="60" w:line="252"/>
+        <w:jc w:val="both"/>
+      </w:pPr>
+      <w:r>
+        <w:rPr>
+          <w:rFonts w:ascii="Arial" w:cs="Arial" w:eastAsia="Arial" w:hAnsi="Arial"/>
+          <w:color w:val="243238"/>
+          <w:sz w:val="19"/>
+          <w:szCs w:val="19"/>
+        </w:rPr>
+        <w:t xml:space="preserve">Charles de Lestrange, ancien commercial Bretagne d’ASH, demeure l’interlocuteur unique des bailleurs sur le territoire breton ;</w:t>
+      </w:r>
+    </w:p>
+    <w:p>
+      <w:pPr>
+        <w:pStyle w:val="ListParagraph"/>
+        <w:numPr>
+          <w:ilvl w:val="0"/>
+          <w:numId w:val="2"/>
+        </w:numPr>
+        <w:spacing w:after="60" w:line="252"/>
+        <w:jc w:val="both"/>
+      </w:pPr>
+      <w:r>
+        <w:rPr>
+          <w:rFonts w:ascii="Arial" w:cs="Arial" w:eastAsia="Arial" w:hAnsi="Arial"/>
+          <w:color w:val="243238"/>
+          <w:sz w:val="19"/>
+          <w:szCs w:val="19"/>
+        </w:rPr>
+        <w:t xml:space="preserve">Les équipes de pose expérimentées, formées aux produits, aux méthodes et à l’intervention en logement occupé.</w:t>
+      </w:r>
+    </w:p>
+    <w:p>
+      <w:pPr>
+        <w:spacing w:after="120" w:line="264"/>
+        <w:jc w:val="both"/>
+      </w:pPr>
+      <w:r>
+        <w:rPr>
+          <w:rFonts w:ascii="Arial" w:cs="Arial" w:eastAsia="Arial" w:hAnsi="Arial"/>
+          <w:color w:val="243238"/>
+          <w:sz w:val="19"/>
+          <w:szCs w:val="19"/>
+        </w:rPr>
+        <w:t xml:space="preserve">Cette continuité humaine et technique signifie qu’ADOM SENIOR n’a pas de « phase de rodage » : les gestes techniques, les produits, les contrôles et la relation avec les locataires en logement occupé sont éprouvés.</w:t>
+      </w:r>
+    </w:p>
+    <w:p>
+      <w:pPr>
+        <w:pStyle w:val="Heading2"/>
+        <w:spacing w:after="100" w:before="200"/>
+      </w:pPr>
+      <w:r>
+        <w:rPr>
+          <w:rFonts w:ascii="Arial" w:cs="Arial" w:eastAsia="Arial" w:hAnsi="Arial"/>
+          <w:b/>
+          <w:bCs/>
+          <w:color w:val="0F6470"/>
+          <w:sz w:val="22"/>
+          <w:szCs w:val="22"/>
+        </w:rPr>
+        <w:t xml:space="preserve">Ils nous font confiance en Bretagne</w:t>
+      </w:r>
+    </w:p>
+    <w:p>
+      <w:pPr>
+        <w:spacing w:after="120" w:line="264"/>
+        <w:jc w:val="both"/>
+      </w:pPr>
+      <w:r>
+        <w:rPr>
+          <w:rFonts w:ascii="Arial" w:cs="Arial" w:eastAsia="Arial" w:hAnsi="Arial"/>
+          <w:color w:val="243238"/>
+          <w:sz w:val="19"/>
+          <w:szCs w:val="19"/>
+        </w:rPr>
+        <w:t xml:space="preserve">Nos équipes sont déjà intervenues pour de nombreux bailleurs sociaux bretons, en marché direct ou en sous-traitance :</w:t>
+      </w:r>
+    </w:p>
+    <w:tbl>
+      <w:tblPr>
+        <w:tblW w:type="dxa" w:w="9360"/>
+        <w:tblBorders>
+          <w:top w:val="single" w:color="C9D8DB" w:sz="4"/>
+          <w:left w:val="single" w:color="C9D8DB" w:sz="4"/>
+          <w:bottom w:val="single" w:color="C9D8DB" w:sz="4"/>
+          <w:right w:val="single" w:color="C9D8DB" w:sz="4"/>
+          <w:insideH w:val="single" w:color="C9D8DB" w:sz="4"/>
+          <w:insideV w:val="single" w:color="C9D8DB" w:sz="4"/>
+        </w:tblBorders>
+      </w:tblPr>
+      <w:tblGrid>
+        <w:gridCol w:w="3400"/>
+        <w:gridCol w:w="5960"/>
+      </w:tblGrid>
+      <w:tr>
+        <w:trPr>
+          <w:tblHeader/>
+        </w:trPr>
+        <w:tc>
+          <w:tcPr>
+            <w:tcW w:type="dxa" w:w="3400"/>
+            <w:shd w:fill="0F6470" w:val="clear"/>
+            <w:tcMar>
+              <w:top w:type="dxa" w:w="60"/>
+              <w:left w:type="dxa" w:w="100"/>
+              <w:bottom w:type="dxa" w:w="60"/>
+              <w:right w:type="dxa" w:w="100"/>
+            </w:tcMar>
+            <w:vAlign w:val="center"/>
+          </w:tcPr>
+          <w:p>
+            <w:pPr>
+              <w:jc w:val="left"/>
+            </w:pPr>
+            <w:r>
+              <w:rPr>
+                <w:rFonts w:ascii="Arial" w:cs="Arial" w:eastAsia="Arial" w:hAnsi="Arial"/>
+                <w:b/>
+                <w:bCs/>
+                <w:color w:val="FFFFFF"/>
+                <w:sz w:val="18"/>
+                <w:szCs w:val="18"/>
+              </w:rPr>
+              <w:t xml:space="preserve">Bailleur</w:t>
+            </w:r>
+          </w:p>
+        </w:tc>
+        <w:tc>
+          <w:tcPr>
+            <w:tcW w:type="dxa" w:w="5960"/>
+            <w:shd w:fill="0F6470" w:val="clear"/>
+            <w:tcMar>
+              <w:top w:type="dxa" w:w="60"/>
+              <w:left w:type="dxa" w:w="100"/>
+              <w:bottom w:type="dxa" w:w="60"/>
+              <w:right w:type="dxa" w:w="100"/>
+            </w:tcMar>
+            <w:vAlign w:val="center"/>
+          </w:tcPr>
+          <w:p>
+            <w:pPr>
+              <w:jc w:val="left"/>
+            </w:pPr>
+            <w:r>
+              <w:rPr>
+                <w:rFonts w:ascii="Arial" w:cs="Arial" w:eastAsia="Arial" w:hAnsi="Arial"/>
+                <w:b/>
+                <w:bCs/>
+                <w:color w:val="FFFFFF"/>
+                <w:sz w:val="18"/>
+                <w:szCs w:val="18"/>
+              </w:rPr>
+              <w:t xml:space="preserve">Territoire</w:t>
+            </w:r>
+          </w:p>
+        </w:tc>
+      </w:tr>
+      <w:tr>
+        <w:tc>
+          <w:tcPr>
+            <w:tcW w:type="dxa" w:w="3400"/>
+            <w:tcMar>
+              <w:top w:type="dxa" w:w="60"/>
+              <w:left w:type="dxa" w:w="100"/>
+              <w:bottom w:type="dxa" w:w="60"/>
+              <w:right w:type="dxa" w:w="100"/>
+            </w:tcMar>
+            <w:vAlign w:val="center"/>
+          </w:tcPr>
+          <w:p>
+            <w:pPr>
+              <w:spacing w:line="240"/>
+            </w:pPr>
+            <w:r>
+              <w:rPr>
+                <w:rFonts w:ascii="Arial" w:cs="Arial" w:eastAsia="Arial" w:hAnsi="Arial"/>
+                <w:b/>
+                <w:bCs/>
+                <w:color w:val="243238"/>
+                <w:sz w:val="18"/>
+                <w:szCs w:val="18"/>
+              </w:rPr>
+              <w:t xml:space="preserve">Morbihan Habitat</w:t>
+            </w:r>
+          </w:p>
+        </w:tc>
+        <w:tc>
+          <w:tcPr>
+            <w:tcW w:type="dxa" w:w="5960"/>
+            <w:tcMar>
+              <w:top w:type="dxa" w:w="60"/>
+              <w:left w:type="dxa" w:w="100"/>
+              <w:bottom w:type="dxa" w:w="60"/>
+              <w:right w:type="dxa" w:w="100"/>
+            </w:tcMar>
+            <w:vAlign w:val="center"/>
+          </w:tcPr>
+          <w:p>
+            <w:pPr>
+              <w:spacing w:line="240"/>
+            </w:pPr>
+            <w:r>
+              <w:rPr>
+                <w:rFonts w:ascii="Arial" w:cs="Arial" w:eastAsia="Arial" w:hAnsi="Arial"/>
+                <w:b w:val="false"/>
+                <w:bCs w:val="false"/>
+                <w:color w:val="243238"/>
+                <w:sz w:val="18"/>
+                <w:szCs w:val="18"/>
+              </w:rPr>
+              <w:t xml:space="preserve">Morbihan — 105 chantiers d’adaptation réalisés en 2025</w:t>
+            </w:r>
+          </w:p>
+        </w:tc>
+      </w:tr>
+      <w:tr>
+        <w:tc>
+          <w:tcPr>
+            <w:tcW w:type="dxa" w:w="3400"/>
+            <w:tcMar>
+              <w:top w:type="dxa" w:w="60"/>
+              <w:left w:type="dxa" w:w="100"/>
+              <w:bottom w:type="dxa" w:w="60"/>
+              <w:right w:type="dxa" w:w="100"/>
+            </w:tcMar>
+            <w:vAlign w:val="center"/>
+          </w:tcPr>
+          <w:p>
+            <w:pPr>
+              <w:spacing w:line="240"/>
+            </w:pPr>
+            <w:r>
+              <w:rPr>
+                <w:rFonts w:ascii="Arial" w:cs="Arial" w:eastAsia="Arial" w:hAnsi="Arial"/>
+                <w:b/>
+                <w:bCs/>
+                <w:color w:val="243238"/>
+                <w:sz w:val="18"/>
+                <w:szCs w:val="18"/>
+              </w:rPr>
+              <w:t xml:space="preserve">Archipel Habitat</w:t>
+            </w:r>
+          </w:p>
+        </w:tc>
+        <w:tc>
+          <w:tcPr>
+            <w:tcW w:type="dxa" w:w="5960"/>
+            <w:tcMar>
+              <w:top w:type="dxa" w:w="60"/>
+              <w:left w:type="dxa" w:w="100"/>
+              <w:bottom w:type="dxa" w:w="60"/>
+              <w:right w:type="dxa" w:w="100"/>
+            </w:tcMar>
+            <w:vAlign w:val="center"/>
+          </w:tcPr>
+          <w:p>
+            <w:pPr>
+              <w:spacing w:line="240"/>
+            </w:pPr>
+            <w:r>
+              <w:rPr>
+                <w:rFonts w:ascii="Arial" w:cs="Arial" w:eastAsia="Arial" w:hAnsi="Arial"/>
+                <w:b w:val="false"/>
+                <w:bCs w:val="false"/>
+                <w:color w:val="243238"/>
+                <w:sz w:val="18"/>
+                <w:szCs w:val="18"/>
+              </w:rPr>
+              <w:t xml:space="preserve">Rennes Métropole</w:t>
+            </w:r>
+          </w:p>
+        </w:tc>
+      </w:tr>
+      <w:tr>
+        <w:tc>
+          <w:tcPr>
+            <w:tcW w:type="dxa" w:w="3400"/>
+            <w:tcMar>
+              <w:top w:type="dxa" w:w="60"/>
+              <w:left w:type="dxa" w:w="100"/>
+              <w:bottom w:type="dxa" w:w="60"/>
+              <w:right w:type="dxa" w:w="100"/>
+            </w:tcMar>
+            <w:vAlign w:val="center"/>
+          </w:tcPr>
+          <w:p>
+            <w:pPr>
+              <w:spacing w:line="240"/>
+            </w:pPr>
+            <w:r>
+              <w:rPr>
+                <w:rFonts w:ascii="Arial" w:cs="Arial" w:eastAsia="Arial" w:hAnsi="Arial"/>
+                <w:b/>
+                <w:bCs/>
+                <w:color w:val="243238"/>
+                <w:sz w:val="18"/>
+                <w:szCs w:val="18"/>
+              </w:rPr>
+              <w:t xml:space="preserve">Brest Métropole Habitat</w:t>
+            </w:r>
+          </w:p>
+        </w:tc>
+        <w:tc>
+          <w:tcPr>
+            <w:tcW w:type="dxa" w:w="5960"/>
+            <w:tcMar>
+              <w:top w:type="dxa" w:w="60"/>
+              <w:left w:type="dxa" w:w="100"/>
+              <w:bottom w:type="dxa" w:w="60"/>
+              <w:right w:type="dxa" w:w="100"/>
+            </w:tcMar>
+            <w:vAlign w:val="center"/>
+          </w:tcPr>
+          <w:p>
+            <w:pPr>
+              <w:spacing w:line="240"/>
+            </w:pPr>
+            <w:r>
+              <w:rPr>
+                <w:rFonts w:ascii="Arial" w:cs="Arial" w:eastAsia="Arial" w:hAnsi="Arial"/>
+                <w:b w:val="false"/>
+                <w:bCs w:val="false"/>
+                <w:color w:val="243238"/>
+                <w:sz w:val="18"/>
+                <w:szCs w:val="18"/>
+              </w:rPr>
+              <w:t xml:space="preserve">Brest Métropole</w:t>
+            </w:r>
+          </w:p>
+        </w:tc>
+      </w:tr>
+      <w:tr>
+        <w:tc>
+          <w:tcPr>
+            <w:tcW w:type="dxa" w:w="3400"/>
+            <w:tcMar>
+              <w:top w:type="dxa" w:w="60"/>
+              <w:left w:type="dxa" w:w="100"/>
+              <w:bottom w:type="dxa" w:w="60"/>
+              <w:right w:type="dxa" w:w="100"/>
+            </w:tcMar>
+            <w:vAlign w:val="center"/>
+          </w:tcPr>
+          <w:p>
+            <w:pPr>
+              <w:spacing w:line="240"/>
+            </w:pPr>
+            <w:r>
+              <w:rPr>
+                <w:rFonts w:ascii="Arial" w:cs="Arial" w:eastAsia="Arial" w:hAnsi="Arial"/>
+                <w:b/>
+                <w:bCs/>
+                <w:color w:val="243238"/>
+                <w:sz w:val="18"/>
+                <w:szCs w:val="18"/>
+              </w:rPr>
+              <w:t xml:space="preserve">Aiguillon Construction</w:t>
+            </w:r>
+          </w:p>
+        </w:tc>
+        <w:tc>
+          <w:tcPr>
+            <w:tcW w:type="dxa" w:w="5960"/>
+            <w:tcMar>
+              <w:top w:type="dxa" w:w="60"/>
+              <w:left w:type="dxa" w:w="100"/>
+              <w:bottom w:type="dxa" w:w="60"/>
+              <w:right w:type="dxa" w:w="100"/>
+            </w:tcMar>
+            <w:vAlign w:val="center"/>
+          </w:tcPr>
+          <w:p>
+            <w:pPr>
+              <w:spacing w:line="240"/>
+            </w:pPr>
+            <w:r>
+              <w:rPr>
+                <w:rFonts w:ascii="Arial" w:cs="Arial" w:eastAsia="Arial" w:hAnsi="Arial"/>
+                <w:b w:val="false"/>
+                <w:bCs w:val="false"/>
+                <w:color w:val="243238"/>
+                <w:sz w:val="18"/>
+                <w:szCs w:val="18"/>
+              </w:rPr>
+              <w:t xml:space="preserve">Bretagne et Pays de la Loire</w:t>
+            </w:r>
+          </w:p>
+        </w:tc>
+      </w:tr>
+      <w:tr>
+        <w:tc>
+          <w:tcPr>
+            <w:tcW w:type="dxa" w:w="3400"/>
+            <w:tcMar>
+              <w:top w:type="dxa" w:w="60"/>
+              <w:left w:type="dxa" w:w="100"/>
+              <w:bottom w:type="dxa" w:w="60"/>
+              <w:right w:type="dxa" w:w="100"/>
+            </w:tcMar>
+            <w:vAlign w:val="center"/>
+          </w:tcPr>
+          <w:p>
+            <w:pPr>
+              <w:spacing w:line="240"/>
+            </w:pPr>
+            <w:r>
+              <w:rPr>
+                <w:rFonts w:ascii="Arial" w:cs="Arial" w:eastAsia="Arial" w:hAnsi="Arial"/>
+                <w:b/>
+                <w:bCs/>
+                <w:color w:val="243238"/>
+                <w:sz w:val="18"/>
+                <w:szCs w:val="18"/>
+              </w:rPr>
+              <w:t xml:space="preserve">Espacil Habitat</w:t>
+            </w:r>
+          </w:p>
+        </w:tc>
+        <w:tc>
+          <w:tcPr>
+            <w:tcW w:type="dxa" w:w="5960"/>
+            <w:tcMar>
+              <w:top w:type="dxa" w:w="60"/>
+              <w:left w:type="dxa" w:w="100"/>
+              <w:bottom w:type="dxa" w:w="60"/>
+              <w:right w:type="dxa" w:w="100"/>
+            </w:tcMar>
+            <w:vAlign w:val="center"/>
+          </w:tcPr>
+          <w:p>
+            <w:pPr>
+              <w:spacing w:line="240"/>
+            </w:pPr>
+            <w:r>
+              <w:rPr>
+                <w:rFonts w:ascii="Arial" w:cs="Arial" w:eastAsia="Arial" w:hAnsi="Arial"/>
+                <w:b w:val="false"/>
+                <w:bCs w:val="false"/>
+                <w:color w:val="243238"/>
+                <w:sz w:val="18"/>
+                <w:szCs w:val="18"/>
+              </w:rPr>
+              <w:t xml:space="preserve">Bretagne et Grand Ouest</w:t>
+            </w:r>
+          </w:p>
+        </w:tc>
+      </w:tr>
+    </w:tbl>
+    <w:p>
+      <w:pPr>
+        <w:spacing w:after="120"/>
+      </w:pPr>
+    </w:p>
+    <w:p>
+      <w:pPr>
+        <w:pStyle w:val="Heading2"/>
+        <w:spacing w:after="100" w:before="200"/>
+      </w:pPr>
+      <w:r>
+        <w:rPr>
+          <w:rFonts w:ascii="Arial" w:cs="Arial" w:eastAsia="Arial" w:hAnsi="Arial"/>
+          <w:b/>
+          <w:bCs/>
+          <w:color w:val="0F6470"/>
+          <w:sz w:val="22"/>
+          <w:szCs w:val="22"/>
+        </w:rPr>
+        <w:t xml:space="preserve">Nos réalisations : la preuve par l’image</w:t>
+      </w:r>
+    </w:p>
+    <w:p>
+      <w:pPr>
+        <w:spacing w:after="120" w:before="80"/>
+        <w:jc w:val="center"/>
+      </w:pPr>
+      <w:r>
+        <w:drawing>
+          <wp:inline distT="0" distB="0" distL="0" distR="0">
+            <wp:extent cx="6286500" cy="2143125"/>
+            <wp:effectExtent t="0" r="0" b="0" l="0"/>
+            <wp:docPr id="1" name="" descr="" title=""/>
+            <wp:cNvGraphicFramePr>
+              <a:graphicFrameLocks xmlns:a="http://schemas.openxmlformats.org/drawingml/2006/main" noChangeAspect="1"/>
+            </wp:cNvGraphicFramePr>
+            <a:graphic xmlns:a="http://schemas.openxmlformats.org/drawingml/2006/main">
+              <a:graphicData uri="http://schemas.openxmlformats.org/drawingml/2006/picture">
+                <pic:pic xmlns:pic="http://schemas.openxmlformats.org/drawingml/2006/picture">
+                  <pic:nvPicPr>
+                    <pic:cNvPr id="0" name="" descr=""/>
+                    <pic:cNvPicPr>
+                      <a:picLocks noChangeAspect="1" noChangeArrowheads="1"/>
+                    </pic:cNvPicPr>
+                  </pic:nvPicPr>
+                  <pic:blipFill>
+                    <a:blip r:embed="rId12" cstate="none"/>
+                    <a:srcRect/>
+                    <a:stretch>
+                      <a:fillRect/>
+                    </a:stretch>
+                  </pic:blipFill>
+                  <pic:spPr bwMode="auto">
+                    <a:xfrm>
+                      <a:off x="0" y="0"/>
+                      <a:ext cx="6286500" cy="2143125"/>
+                    </a:xfrm>
+                    <a:prstGeom prst="rect">
+                      <a:avLst/>
+                    </a:prstGeom>
+                  </pic:spPr>
+                </pic:pic>
+              </a:graphicData>
+            </a:graphic>
+          </wp:inline>
+        </w:drawing>
+      </w:r>
+    </w:p>
+    <w:p>
+      <w:pPr>
+        <w:spacing w:after="120" w:line="264"/>
+        <w:jc w:val="both"/>
+      </w:pPr>
+      <w:r>
+        <w:rPr>
+          <w:rFonts w:ascii="Arial" w:cs="Arial" w:eastAsia="Arial" w:hAnsi="Arial"/>
+          <w:color w:val="243238"/>
+          <w:sz w:val="19"/>
+          <w:szCs w:val="19"/>
+        </w:rPr>
+        <w:t xml:space="preserve">Retrouvez l’ensemble de nos réalisations avant / après, nos solutions et nos actualités sur </w:t>
+      </w:r>
+      <w:r>
+        <w:rPr>
+          <w:rFonts w:ascii="Arial" w:cs="Arial" w:eastAsia="Arial" w:hAnsi="Arial"/>
+          <w:b/>
+          <w:bCs/>
+          <w:color w:val="0F6470"/>
+          <w:sz w:val="19"/>
+          <w:szCs w:val="19"/>
+        </w:rPr>
+        <w:t xml:space="preserve">adomsenior.fr</w:t>
+      </w:r>
+      <w:r>
+        <w:rPr>
+          <w:rFonts w:ascii="Arial" w:cs="Arial" w:eastAsia="Arial" w:hAnsi="Arial"/>
+          <w:color w:val="243238"/>
+          <w:sz w:val="19"/>
+          <w:szCs w:val="19"/>
+        </w:rPr>
+        <w:t xml:space="preserve">.</w:t>
+      </w:r>
+    </w:p>
+    <w:p>
+      <w:pPr>
+        <w:pStyle w:val="Heading2"/>
+        <w:spacing w:after="100" w:before="200"/>
+      </w:pPr>
+      <w:r>
+        <w:rPr>
+          <w:rFonts w:ascii="Arial" w:cs="Arial" w:eastAsia="Arial" w:hAnsi="Arial"/>
+          <w:b/>
+          <w:bCs/>
+          <w:color w:val="0F6470"/>
+          <w:sz w:val="22"/>
+          <w:szCs w:val="22"/>
+        </w:rPr>
+        <w:t xml:space="preserve">Nos valeurs</w:t>
+      </w:r>
+    </w:p>
+    <w:p>
+      <w:pPr>
+        <w:pStyle w:val="ListParagraph"/>
+        <w:numPr>
+          <w:ilvl w:val="0"/>
+          <w:numId w:val="2"/>
+        </w:numPr>
+        <w:spacing w:after="60" w:line="252"/>
+        <w:jc w:val="both"/>
+      </w:pPr>
+      <w:r>
+        <w:rPr>
+          <w:rFonts w:ascii="Arial" w:cs="Arial" w:eastAsia="Arial" w:hAnsi="Arial"/>
+          <w:color w:val="243238"/>
+          <w:sz w:val="19"/>
+          <w:szCs w:val="19"/>
+        </w:rPr>
+        <w:t xml:space="preserve">Le respect du locataire : intervenir chez une personne âgée ou fragile exige écoute, douceur et rigueur ;</w:t>
+      </w:r>
+    </w:p>
+    <w:p>
+      <w:pPr>
+        <w:pStyle w:val="ListParagraph"/>
+        <w:numPr>
+          <w:ilvl w:val="0"/>
+          <w:numId w:val="2"/>
+        </w:numPr>
+        <w:spacing w:after="60" w:line="252"/>
+        <w:jc w:val="both"/>
+      </w:pPr>
+      <w:r>
+        <w:rPr>
+          <w:rFonts w:ascii="Arial" w:cs="Arial" w:eastAsia="Arial" w:hAnsi="Arial"/>
+          <w:color w:val="243238"/>
+          <w:sz w:val="19"/>
+          <w:szCs w:val="19"/>
+        </w:rPr>
+        <w:t xml:space="preserve">La qualité d’exécution : des finitions soignées, contrôlées et documentées à chaque étape ;</w:t>
+      </w:r>
+    </w:p>
+    <w:p>
+      <w:pPr>
+        <w:pStyle w:val="ListParagraph"/>
+        <w:numPr>
+          <w:ilvl w:val="0"/>
+          <w:numId w:val="2"/>
+        </w:numPr>
+        <w:spacing w:after="60" w:line="252"/>
+        <w:jc w:val="both"/>
+      </w:pPr>
+      <w:r>
+        <w:rPr>
+          <w:rFonts w:ascii="Arial" w:cs="Arial" w:eastAsia="Arial" w:hAnsi="Arial"/>
+          <w:color w:val="243238"/>
+          <w:sz w:val="19"/>
+          <w:szCs w:val="19"/>
+        </w:rPr>
+        <w:t xml:space="preserve">La transparence : un suivi partagé avec le bailleur, des preuves photographiques et des documents structurés ;</w:t>
+      </w:r>
+    </w:p>
+    <w:p>
+      <w:pPr>
+        <w:pStyle w:val="ListParagraph"/>
+        <w:numPr>
+          <w:ilvl w:val="0"/>
+          <w:numId w:val="2"/>
+        </w:numPr>
+        <w:spacing w:after="60" w:line="252"/>
+        <w:jc w:val="both"/>
+      </w:pPr>
+      <w:r>
+        <w:rPr>
+          <w:rFonts w:ascii="Arial" w:cs="Arial" w:eastAsia="Arial" w:hAnsi="Arial"/>
+          <w:color w:val="243238"/>
+          <w:sz w:val="19"/>
+          <w:szCs w:val="19"/>
+        </w:rPr>
+        <w:t xml:space="preserve">La proximité : une entreprise bretonne, au service des bailleurs bretons.</w:t>
+      </w:r>
+    </w:p>
+    <w:p>
+      <w:r>
+        <w:br w:type="page"/>
+      </w:r>
+    </w:p>
+    <w:tbl>
+      <w:tblPr>
+        <w:tblW w:type="dxa" w:w="3600"/>
+        <w:tblBorders>
+          <w:top w:val="none" w:color="FFFFFF" w:sz="0"/>
+          <w:left w:val="none" w:color="FFFFFF" w:sz="0"/>
+          <w:bottom w:val="none" w:color="FFFFFF" w:sz="0"/>
+          <w:right w:val="none" w:color="FFFFFF" w:sz="0"/>
+          <w:insideH w:val="none" w:color="FFFFFF" w:sz="0"/>
+          <w:insideV w:val="none" w:color="FFFFFF" w:sz="0"/>
+        </w:tblBorders>
+      </w:tblPr>
+      <w:tblGrid>
+        <w:gridCol w:w="3600"/>
+      </w:tblGrid>
+      <w:tr>
+        <w:tc>
+          <w:tcPr>
+            <w:tcW w:type="dxa" w:w="3600"/>
+            <w:shd w:fill="DB982D" w:val="clear"/>
+            <w:tcMar>
+              <w:top w:type="dxa" w:w="60"/>
+              <w:left w:type="dxa" w:w="100"/>
+              <w:bottom w:type="dxa" w:w="60"/>
+              <w:right w:type="dxa" w:w="100"/>
+            </w:tcMar>
+          </w:tcPr>
+          <w:p>
+            <w:r>
+              <w:rPr>
+                <w:rFonts w:ascii="Arial" w:cs="Arial" w:eastAsia="Arial" w:hAnsi="Arial"/>
+                <w:b/>
+                <w:bCs/>
+                <w:color w:val="FFFFFF"/>
+                <w:sz w:val="16"/>
+                <w:szCs w:val="16"/>
+              </w:rPr>
+              <w:t xml:space="preserve">VOTRE MARCHÉ</w:t>
+            </w:r>
+          </w:p>
+        </w:tc>
+      </w:tr>
+    </w:tbl>
+    <w:p>
+      <w:pPr>
+        <w:spacing w:after="60"/>
+      </w:pPr>
+    </w:p>
+    <w:p>
+      <w:pPr>
+        <w:pStyle w:val="Heading1"/>
+        <w:spacing w:after="120" w:before="120"/>
+      </w:pPr>
+      <w:r>
+        <w:rPr>
+          <w:rFonts w:ascii="Arial" w:cs="Arial" w:eastAsia="Arial" w:hAnsi="Arial"/>
+          <w:b/>
+          <w:bCs/>
+          <w:color w:val="073E47"/>
+          <w:sz w:val="30"/>
+          <w:szCs w:val="30"/>
+        </w:rPr>
+        <w:t xml:space="preserve">2. Notre compréhension de votre marché</w:t>
+      </w:r>
+    </w:p>
+    <w:p>
+      <w:pPr>
+        <w:pStyle w:val="Heading2"/>
+        <w:spacing w:after="100" w:before="200"/>
+      </w:pPr>
+      <w:r>
+        <w:rPr>
+          <w:rFonts w:ascii="Arial" w:cs="Arial" w:eastAsia="Arial" w:hAnsi="Arial"/>
+          <w:b/>
+          <w:bCs/>
+          <w:color w:val="0F6470"/>
+          <w:sz w:val="22"/>
+          <w:szCs w:val="22"/>
+        </w:rPr>
+        <w:t xml:space="preserve">Morbihan Habitat, un acteur territorial de premier plan</w:t>
+      </w:r>
+    </w:p>
+    <w:p>
+      <w:pPr>
+        <w:spacing w:after="120" w:line="264"/>
+        <w:jc w:val="both"/>
+      </w:pPr>
+      <w:r>
+        <w:rPr>
+          <w:rFonts w:ascii="Arial" w:cs="Arial" w:eastAsia="Arial" w:hAnsi="Arial"/>
+          <w:color w:val="243238"/>
+          <w:sz w:val="19"/>
+          <w:szCs w:val="19"/>
+        </w:rPr>
+        <w:t xml:space="preserve">Morbihan Habitat déploie une offre de logement social à l’échelle départementale et articule les adaptations PMR entre le Pôle Social, le Pôle Travaux, huit agences et plus de trente points de proximité. Le bailleur conduit une politique volontariste d’adaptation de son patrimoine au vieillissement : 312 logements adaptés PMR en 2023 et un référentiel de logements adaptables et évolutifs.</w:t>
       </w:r>
     </w:p>
     <w:tbl>
@@ -1669,7 +2812,7 @@
                 <w:sz w:val="26"/>
                 <w:szCs w:val="26"/>
               </w:rPr>
-              <w:t xml:space="preserve">185 K€</w:t>
+              <w:t xml:space="preserve">33 230</w:t>
             </w:r>
           </w:p>
         </w:tc>
@@ -1698,7 +2841,7 @@
                 <w:sz w:val="26"/>
                 <w:szCs w:val="26"/>
               </w:rPr>
-              <w:t xml:space="preserve">630 K€</w:t>
+              <w:t xml:space="preserve">215</w:t>
             </w:r>
           </w:p>
         </w:tc>
@@ -1727,7 +2870,7 @@
                 <w:sz w:val="26"/>
                 <w:szCs w:val="26"/>
               </w:rPr>
-              <w:t xml:space="preserve">700 K€</w:t>
+              <w:t xml:space="preserve">8</w:t>
             </w:r>
           </w:p>
         </w:tc>
@@ -1756,7 +2899,7 @@
                 <w:sz w:val="26"/>
                 <w:szCs w:val="26"/>
               </w:rPr>
-              <w:t xml:space="preserve">105</w:t>
+              <w:t xml:space="preserve">&gt; 30</w:t>
             </w:r>
           </w:p>
         </w:tc>
@@ -1783,7 +2926,7 @@
                 <w:sz w:val="17"/>
                 <w:szCs w:val="17"/>
               </w:rPr>
-              <w:t xml:space="preserve">Chiffre d’affaires 2023</w:t>
+              <w:t xml:space="preserve">logements</w:t>
             </w:r>
           </w:p>
         </w:tc>
@@ -1808,7 +2951,7 @@
                 <w:sz w:val="17"/>
                 <w:szCs w:val="17"/>
               </w:rPr>
-              <w:t xml:space="preserve">Chiffre d’affaires 2024</w:t>
+              <w:t xml:space="preserve">communes</w:t>
             </w:r>
           </w:p>
         </w:tc>
@@ -1833,7 +2976,7 @@
                 <w:sz w:val="17"/>
                 <w:szCs w:val="17"/>
               </w:rPr>
-              <w:t xml:space="preserve">Chiffre d’affaires 2025</w:t>
+              <w:t xml:space="preserve">agences</w:t>
             </w:r>
           </w:p>
         </w:tc>
@@ -1858,7 +3001,7 @@
                 <w:sz w:val="17"/>
                 <w:szCs w:val="17"/>
               </w:rPr>
-              <w:t xml:space="preserve">chantiers Morbihan Habitat en 2025</w:t>
+              <w:t xml:space="preserve">points de proximité</w:t>
             </w:r>
           </w:p>
         </w:tc>
@@ -1866,69 +3009,19 @@
     </w:tbl>
     <w:p>
       <w:pPr>
-        <w:spacing w:after="100"/>
-      </w:pPr>
-    </w:p>
-    <w:tbl>
-      <w:tblPr>
-        <w:tblW w:type="dxa" w:w="9360"/>
-        <w:tblBorders>
-          <w:top w:val="none"/>
-          <w:left w:val="single" w:color="0F6470" w:sz="24"/>
-          <w:bottom w:val="none"/>
-          <w:right w:val="none"/>
-          <w:insideH w:val="none"/>
-          <w:insideV w:val="none"/>
-        </w:tblBorders>
-      </w:tblPr>
-      <w:tblGrid>
-        <w:gridCol w:w="9360"/>
-      </w:tblGrid>
-      <w:tr>
-        <w:tc>
-          <w:tcPr>
-            <w:tcW w:type="dxa" w:w="9360"/>
-            <w:shd w:fill="EAF2F3" w:val="clear"/>
-            <w:tcMar>
-              <w:top w:type="dxa" w:w="90"/>
-              <w:left w:type="dxa" w:w="140"/>
-              <w:bottom w:type="dxa" w:w="90"/>
-              <w:right w:type="dxa" w:w="140"/>
-            </w:tcMar>
-          </w:tcPr>
-          <w:p>
-            <w:pPr>
-              <w:spacing w:line="252"/>
-              <w:jc w:val="both"/>
-            </w:pPr>
-            <w:r>
-              <w:rPr>
-                <w:rFonts w:ascii="Arial" w:cs="Arial" w:eastAsia="Arial" w:hAnsi="Arial"/>
-                <w:b/>
-                <w:bCs/>
-                <w:color w:val="073E47"/>
-                <w:sz w:val="19"/>
-                <w:szCs w:val="19"/>
-              </w:rPr>
-              <w:t xml:space="preserve">RÉFÉRENCE MORBIHAN HABITAT  </w:t>
-            </w:r>
-            <w:r>
-              <w:rPr>
-                <w:rFonts w:ascii="Arial" w:cs="Arial" w:eastAsia="Arial" w:hAnsi="Arial"/>
-                <w:color w:val="243238"/>
-                <w:sz w:val="19"/>
-                <w:szCs w:val="19"/>
-              </w:rPr>
-              <w:t xml:space="preserve">En 2025, ADOM SENIOR a réalisé 150 K€ de chiffre d’affaires pour 105 chantiers exécutés en sous-traitance d’ASH sur le patrimoine de Morbihan Habitat. Les équipes qui interviendront sur ce marché connaissent donc déjà le parc, les locataires, les circuits de validation et les attendus du bailleur.</w:t>
-            </w:r>
-          </w:p>
-        </w:tc>
-      </w:tr>
-    </w:tbl>
-    <w:p>
-      <w:pPr>
-        <w:spacing w:after="120"/>
-      </w:pPr>
+        <w:spacing w:after="160" w:before="40"/>
+      </w:pPr>
+      <w:r>
+        <w:rPr>
+          <w:rFonts w:ascii="Arial" w:cs="Arial" w:eastAsia="Arial" w:hAnsi="Arial"/>
+          <w:i/>
+          <w:iCs/>
+          <w:color w:val="66777C"/>
+          <w:sz w:val="14"/>
+          <w:szCs w:val="14"/>
+        </w:rPr>
+        <w:t xml:space="preserve">Données publiques du bailleur — sources officielles détaillées en fin de document.</w:t>
+      </w:r>
     </w:p>
     <w:p>
       <w:pPr>
@@ -1944,7 +3037,7 @@
           <w:sz w:val="22"/>
           <w:szCs w:val="22"/>
         </w:rPr>
-        <w:t xml:space="preserve">Un ancrage breton assumé</w:t>
+        <w:t xml:space="preserve">Les enjeux du maintien à domicile</w:t>
       </w:r>
     </w:p>
     <w:p>
@@ -1959,7 +3052,24 @@
           <w:sz w:val="19"/>
           <w:szCs w:val="19"/>
         </w:rPr>
-        <w:t xml:space="preserve">Contrairement aux opérateurs nationaux, ADOM SENIOR concentre son activité sur la Bretagne. Ce choix de proximité est un engagement de service : des équipes locales, des délais de déplacement courts, une connaissance fine du tissu territorial (agences de proximité, fournisseurs locaux, entreprises partenaires) et une réactivité réelle en cas de SAV ou d’urgence.</w:t>
+        <w:t xml:space="preserve">Face au vieillissement de la population, les bailleurs sociaux développent des offres de logements et de services adaptés. Aujourd’hui, environ 30 % des locataires du parc social ont plus de 60 ans, et 11 % plus de 75 ans. La grande majorité d’entre eux souhaite rester à domicile dans des conditions de sécurité et de confort optimales. L’adaptation de la salle de bains — remplacement de la baignoire par une douche de plain-pied sécurisée — est l’intervention la plus déterminante pour prévenir les chutes et prolonger l’autonomie.</w:t>
+      </w:r>
+    </w:p>
+    <w:p>
+      <w:pPr>
+        <w:pStyle w:val="Heading2"/>
+        <w:spacing w:after="100" w:before="200"/>
+      </w:pPr>
+      <w:r>
+        <w:rPr>
+          <w:rFonts w:ascii="Arial" w:cs="Arial" w:eastAsia="Arial" w:hAnsi="Arial"/>
+          <w:b/>
+          <w:bCs/>
+          <w:color w:val="0F6470"/>
+          <w:sz w:val="22"/>
+          <w:szCs w:val="22"/>
+        </w:rPr>
+        <w:t xml:space="preserve">Notre lecture de vos priorités</w:t>
       </w:r>
     </w:p>
     <w:p>
@@ -1979,7 +3089,7 @@
           <w:sz w:val="19"/>
           <w:szCs w:val="19"/>
         </w:rPr>
-        <w:t xml:space="preserve">Des tournées optimisées à l’échelle du département — pas de poseurs « détachés » venant de l’autre bout de la France ;</w:t>
+        <w:t xml:space="preserve">Traiter les demandes d’adaptation qualifiées par le Pôle Social sans délais d’attente excessifs pour les locataires ;</w:t>
       </w:r>
     </w:p>
     <w:p>
@@ -1999,7 +3109,7 @@
           <w:sz w:val="19"/>
           <w:szCs w:val="19"/>
         </w:rPr>
-        <w:t xml:space="preserve">Un approvisionnement de proximité via le réseau CEDEO du Morbihan (Lorient, Lanester, Auray, Theix–Vannes, Vannes Ouest, Ploërmel, Saint-Thuriau) ;</w:t>
+        <w:t xml:space="preserve">Garantir une intervention respectueuse en logement occupé, sans relogement ni immobilisation longue de la salle d’eau ;</w:t>
       </w:r>
     </w:p>
     <w:p>
@@ -2019,44 +3129,7 @@
           <w:sz w:val="19"/>
           <w:szCs w:val="19"/>
         </w:rPr>
-        <w:t xml:space="preserve">Une capacité à se rendre sur site sous 48 h pour toute situation urgente ou visite complémentaire.</w:t>
-      </w:r>
-    </w:p>
-    <w:p>
-      <w:pPr>
-        <w:spacing w:after="60"/>
-      </w:pPr>
-    </w:p>
-    <w:p>
-      <w:pPr>
-        <w:pStyle w:val="Heading2"/>
-        <w:spacing w:after="100" w:before="200"/>
-      </w:pPr>
-      <w:r>
-        <w:rPr>
-          <w:rFonts w:ascii="Arial" w:cs="Arial" w:eastAsia="Arial" w:hAnsi="Arial"/>
-          <w:b/>
-          <w:bCs/>
-          <w:color w:val="0F6470"/>
-          <w:sz w:val="22"/>
-          <w:szCs w:val="22"/>
-        </w:rPr>
-        <w:t xml:space="preserve">Notre histoire : l’organisation qui réalisait déjà les poses</w:t>
-      </w:r>
-    </w:p>
-    <w:p>
-      <w:pPr>
-        <w:spacing w:after="120" w:line="264"/>
-        <w:jc w:val="both"/>
-      </w:pPr>
-      <w:r>
-        <w:rPr>
-          <w:rFonts w:ascii="Arial" w:cs="Arial" w:eastAsia="Arial" w:hAnsi="Arial"/>
-          <w:color w:val="243238"/>
-          <w:sz w:val="19"/>
-          <w:szCs w:val="19"/>
-        </w:rPr>
-        <w:t xml:space="preserve">ADOM SENIOR s’est structurée autour du savoir-faire des équipes qui exécutaient la majorité des interventions d’adaptation PMR réalisées en Bretagne en sous-traitance d’ASH (Aménagement Séniors Habitat). À la suite de la liquidation d’ASH, ADOM SENIOR a repris les actifs et intégré les hommes clés de cette organisation :</w:t>
+        <w:t xml:space="preserve">Maintenir la coordination entre les agences, le Pôle Travaux, les locataires et l’entreprise ;</w:t>
       </w:r>
     </w:p>
     <w:p>
@@ -2076,7 +3149,7 @@
           <w:sz w:val="19"/>
           <w:szCs w:val="19"/>
         </w:rPr>
-        <w:t xml:space="preserve">Loyk Duporge, ancien salarié d’ASH, encadrant technique et chantier SS4, assure la direction et la supervision des engagements de l’entreprise ;</w:t>
+        <w:t xml:space="preserve">Disposer d’une traçabilité complète : visite, devis, validation, pose, réception, SAV ;</w:t>
       </w:r>
     </w:p>
     <w:p>
@@ -2096,708 +3169,9 @@
           <w:sz w:val="19"/>
           <w:szCs w:val="19"/>
         </w:rPr>
-        <w:t xml:space="preserve">Charles de Lestrange, ancien commercial Bretagne d’ASH, demeure l’interlocuteur unique des bailleurs sur le territoire breton ;</w:t>
-      </w:r>
-    </w:p>
-    <w:p>
-      <w:pPr>
-        <w:pStyle w:val="ListParagraph"/>
-        <w:numPr>
-          <w:ilvl w:val="0"/>
-          <w:numId w:val="2"/>
-        </w:numPr>
-        <w:spacing w:after="60" w:line="252"/>
-        <w:jc w:val="both"/>
-      </w:pPr>
-      <w:r>
-        <w:rPr>
-          <w:rFonts w:ascii="Arial" w:cs="Arial" w:eastAsia="Arial" w:hAnsi="Arial"/>
-          <w:color w:val="243238"/>
-          <w:sz w:val="19"/>
-          <w:szCs w:val="19"/>
-        </w:rPr>
-        <w:t xml:space="preserve">Les équipes de pose expérimentées, formées aux produits, aux méthodes et à l’intervention en logement occupé.</w:t>
-      </w:r>
-    </w:p>
-    <w:p>
-      <w:pPr>
-        <w:spacing w:after="120" w:line="264"/>
-        <w:jc w:val="both"/>
-      </w:pPr>
-      <w:r>
-        <w:rPr>
-          <w:rFonts w:ascii="Arial" w:cs="Arial" w:eastAsia="Arial" w:hAnsi="Arial"/>
-          <w:color w:val="243238"/>
-          <w:sz w:val="19"/>
-          <w:szCs w:val="19"/>
-        </w:rPr>
-        <w:t xml:space="preserve">Cette continuité humaine et technique signifie qu’ADOM SENIOR n’a pas de « phase de rodage » : les gestes techniques, les produits, les contrôles et la relation avec les locataires en logement occupé sont éprouvés.</w:t>
-      </w:r>
-    </w:p>
-    <w:p>
-      <w:pPr>
-        <w:pStyle w:val="Heading2"/>
-        <w:spacing w:after="100" w:before="200"/>
-      </w:pPr>
-      <w:r>
-        <w:rPr>
-          <w:rFonts w:ascii="Arial" w:cs="Arial" w:eastAsia="Arial" w:hAnsi="Arial"/>
-          <w:b/>
-          <w:bCs/>
-          <w:color w:val="0F6470"/>
-          <w:sz w:val="22"/>
-          <w:szCs w:val="22"/>
-        </w:rPr>
-        <w:t xml:space="preserve">Nos valeurs</w:t>
-      </w:r>
-    </w:p>
-    <w:p>
-      <w:pPr>
-        <w:pStyle w:val="ListParagraph"/>
-        <w:numPr>
-          <w:ilvl w:val="0"/>
-          <w:numId w:val="2"/>
-        </w:numPr>
-        <w:spacing w:after="60" w:line="252"/>
-        <w:jc w:val="both"/>
-      </w:pPr>
-      <w:r>
-        <w:rPr>
-          <w:rFonts w:ascii="Arial" w:cs="Arial" w:eastAsia="Arial" w:hAnsi="Arial"/>
-          <w:color w:val="243238"/>
-          <w:sz w:val="19"/>
-          <w:szCs w:val="19"/>
-        </w:rPr>
-        <w:t xml:space="preserve">Le respect du locataire : intervenir chez une personne âgée ou fragile exige écoute, douceur et rigueur ;</w:t>
-      </w:r>
-    </w:p>
-    <w:p>
-      <w:pPr>
-        <w:pStyle w:val="ListParagraph"/>
-        <w:numPr>
-          <w:ilvl w:val="0"/>
-          <w:numId w:val="2"/>
-        </w:numPr>
-        <w:spacing w:after="60" w:line="252"/>
-        <w:jc w:val="both"/>
-      </w:pPr>
-      <w:r>
-        <w:rPr>
-          <w:rFonts w:ascii="Arial" w:cs="Arial" w:eastAsia="Arial" w:hAnsi="Arial"/>
-          <w:color w:val="243238"/>
-          <w:sz w:val="19"/>
-          <w:szCs w:val="19"/>
-        </w:rPr>
-        <w:t xml:space="preserve">La qualité d’exécution : des finitions soignées, contrôlées et documentées à chaque étape ;</w:t>
-      </w:r>
-    </w:p>
-    <w:p>
-      <w:pPr>
-        <w:pStyle w:val="ListParagraph"/>
-        <w:numPr>
-          <w:ilvl w:val="0"/>
-          <w:numId w:val="2"/>
-        </w:numPr>
-        <w:spacing w:after="60" w:line="252"/>
-        <w:jc w:val="both"/>
-      </w:pPr>
-      <w:r>
-        <w:rPr>
-          <w:rFonts w:ascii="Arial" w:cs="Arial" w:eastAsia="Arial" w:hAnsi="Arial"/>
-          <w:color w:val="243238"/>
-          <w:sz w:val="19"/>
-          <w:szCs w:val="19"/>
-        </w:rPr>
-        <w:t xml:space="preserve">La transparence : un suivi partagé avec le bailleur, des preuves photographiques et des documents structurés ;</w:t>
-      </w:r>
-    </w:p>
-    <w:p>
-      <w:pPr>
-        <w:pStyle w:val="ListParagraph"/>
-        <w:numPr>
-          <w:ilvl w:val="0"/>
-          <w:numId w:val="2"/>
-        </w:numPr>
-        <w:spacing w:after="60" w:line="252"/>
-        <w:jc w:val="both"/>
-      </w:pPr>
-      <w:r>
-        <w:rPr>
-          <w:rFonts w:ascii="Arial" w:cs="Arial" w:eastAsia="Arial" w:hAnsi="Arial"/>
-          <w:color w:val="243238"/>
-          <w:sz w:val="19"/>
-          <w:szCs w:val="19"/>
-        </w:rPr>
-        <w:t xml:space="preserve">La proximité : une entreprise bretonne, au service des bailleurs bretons.</w:t>
-      </w:r>
-    </w:p>
-    <w:p>
-      <w:r>
-        <w:br w:type="page"/>
-      </w:r>
-    </w:p>
-    <w:tbl>
-      <w:tblPr>
-        <w:tblW w:type="dxa" w:w="3600"/>
-        <w:tblBorders>
-          <w:top w:val="none" w:color="FFFFFF" w:sz="0"/>
-          <w:left w:val="none" w:color="FFFFFF" w:sz="0"/>
-          <w:bottom w:val="none" w:color="FFFFFF" w:sz="0"/>
-          <w:right w:val="none" w:color="FFFFFF" w:sz="0"/>
-          <w:insideH w:val="none" w:color="FFFFFF" w:sz="0"/>
-          <w:insideV w:val="none" w:color="FFFFFF" w:sz="0"/>
-        </w:tblBorders>
-      </w:tblPr>
-      <w:tblGrid>
-        <w:gridCol w:w="3600"/>
-      </w:tblGrid>
-      <w:tr>
-        <w:tc>
-          <w:tcPr>
-            <w:tcW w:type="dxa" w:w="3600"/>
-            <w:shd w:fill="DB982D" w:val="clear"/>
-            <w:tcMar>
-              <w:top w:type="dxa" w:w="60"/>
-              <w:left w:type="dxa" w:w="100"/>
-              <w:bottom w:type="dxa" w:w="60"/>
-              <w:right w:type="dxa" w:w="100"/>
-            </w:tcMar>
-          </w:tcPr>
-          <w:p>
-            <w:r>
-              <w:rPr>
-                <w:rFonts w:ascii="Arial" w:cs="Arial" w:eastAsia="Arial" w:hAnsi="Arial"/>
-                <w:b/>
-                <w:bCs/>
-                <w:color w:val="FFFFFF"/>
-                <w:sz w:val="16"/>
-                <w:szCs w:val="16"/>
-              </w:rPr>
-              <w:t xml:space="preserve">VOTRE MARCHÉ</w:t>
-            </w:r>
-          </w:p>
-        </w:tc>
-      </w:tr>
-    </w:tbl>
-    <w:p>
-      <w:pPr>
-        <w:spacing w:after="60"/>
-      </w:pPr>
-    </w:p>
-    <w:p>
-      <w:pPr>
-        <w:pStyle w:val="Heading1"/>
-        <w:spacing w:after="120" w:before="120"/>
-      </w:pPr>
-      <w:r>
-        <w:rPr>
-          <w:rFonts w:ascii="Arial" w:cs="Arial" w:eastAsia="Arial" w:hAnsi="Arial"/>
-          <w:b/>
-          <w:bCs/>
-          <w:color w:val="073E47"/>
-          <w:sz w:val="30"/>
-          <w:szCs w:val="30"/>
-        </w:rPr>
-        <w:t xml:space="preserve">2. Notre compréhension de votre marché</w:t>
-      </w:r>
-    </w:p>
-    <w:p>
-      <w:pPr>
-        <w:pStyle w:val="Heading2"/>
-        <w:spacing w:after="100" w:before="200"/>
-      </w:pPr>
-      <w:r>
-        <w:rPr>
-          <w:rFonts w:ascii="Arial" w:cs="Arial" w:eastAsia="Arial" w:hAnsi="Arial"/>
-          <w:b/>
-          <w:bCs/>
-          <w:color w:val="0F6470"/>
-          <w:sz w:val="22"/>
-          <w:szCs w:val="22"/>
-        </w:rPr>
-        <w:t xml:space="preserve">Morbihan Habitat, un acteur territorial de premier plan</w:t>
-      </w:r>
-    </w:p>
-    <w:p>
-      <w:pPr>
-        <w:spacing w:after="120" w:line="264"/>
-        <w:jc w:val="both"/>
-      </w:pPr>
-      <w:r>
-        <w:rPr>
-          <w:rFonts w:ascii="Arial" w:cs="Arial" w:eastAsia="Arial" w:hAnsi="Arial"/>
-          <w:color w:val="243238"/>
-          <w:sz w:val="19"/>
-          <w:szCs w:val="19"/>
-        </w:rPr>
-        <w:t xml:space="preserve">Morbihan Habitat déploie une offre de logement social à l’échelle départementale et articule les adaptations PMR entre le Pôle Social, le Pôle Travaux, huit agences et plus de trente points de proximité. Le bailleur conduit une politique volontariste d’adaptation de son patrimoine au vieillissement : 312 logements adaptés PMR en 2023 et un référentiel de logements adaptables et évolutifs.</w:t>
-      </w:r>
-    </w:p>
-    <w:tbl>
-      <w:tblPr>
-        <w:tblW w:type="dxa" w:w="9360"/>
-        <w:tblBorders>
-          <w:top w:val="single" w:color="C9D8DB" w:sz="4"/>
-          <w:left w:val="single" w:color="C9D8DB" w:sz="4"/>
-          <w:bottom w:val="single" w:color="C9D8DB" w:sz="4"/>
-          <w:right w:val="single" w:color="C9D8DB" w:sz="4"/>
-          <w:insideH w:val="single" w:color="C9D8DB" w:sz="4"/>
-          <w:insideV w:val="single" w:color="C9D8DB" w:sz="4"/>
-        </w:tblBorders>
-      </w:tblPr>
-      <w:tblGrid>
-        <w:gridCol w:w="2340"/>
-        <w:gridCol w:w="2340"/>
-        <w:gridCol w:w="2340"/>
-        <w:gridCol w:w="2340"/>
-      </w:tblGrid>
-      <w:tr>
-        <w:tc>
-          <w:tcPr>
-            <w:tcW w:type="dxa" w:w="2340"/>
-            <w:shd w:fill="0F6470" w:val="clear"/>
-            <w:tcMar>
-              <w:top w:type="dxa" w:w="80"/>
-              <w:left w:type="dxa" w:w="60"/>
-              <w:bottom w:type="dxa" w:w="80"/>
-              <w:right w:type="dxa" w:w="60"/>
-            </w:tcMar>
-            <w:vAlign w:val="center"/>
-          </w:tcPr>
-          <w:p>
-            <w:pPr>
-              <w:jc w:val="center"/>
-            </w:pPr>
-            <w:r>
-              <w:rPr>
-                <w:rFonts w:ascii="Arial" w:cs="Arial" w:eastAsia="Arial" w:hAnsi="Arial"/>
-                <w:b/>
-                <w:bCs/>
-                <w:color w:val="FFFFFF"/>
-                <w:sz w:val="26"/>
-                <w:szCs w:val="26"/>
-              </w:rPr>
-              <w:t xml:space="preserve">33 230</w:t>
-            </w:r>
-          </w:p>
-        </w:tc>
-        <w:tc>
-          <w:tcPr>
-            <w:tcW w:type="dxa" w:w="2340"/>
-            <w:shd w:fill="DB982D" w:val="clear"/>
-            <w:tcMar>
-              <w:top w:type="dxa" w:w="80"/>
-              <w:left w:type="dxa" w:w="60"/>
-              <w:bottom w:type="dxa" w:w="80"/>
-              <w:right w:type="dxa" w:w="60"/>
-            </w:tcMar>
-            <w:vAlign w:val="center"/>
-          </w:tcPr>
-          <w:p>
-            <w:pPr>
-              <w:jc w:val="center"/>
-            </w:pPr>
-            <w:r>
-              <w:rPr>
-                <w:rFonts w:ascii="Arial" w:cs="Arial" w:eastAsia="Arial" w:hAnsi="Arial"/>
-                <w:b/>
-                <w:bCs/>
-                <w:color w:val="FFFFFF"/>
-                <w:sz w:val="26"/>
-                <w:szCs w:val="26"/>
-              </w:rPr>
-              <w:t xml:space="preserve">215</w:t>
-            </w:r>
-          </w:p>
-        </w:tc>
-        <w:tc>
-          <w:tcPr>
-            <w:tcW w:type="dxa" w:w="2340"/>
-            <w:shd w:fill="0F6470" w:val="clear"/>
-            <w:tcMar>
-              <w:top w:type="dxa" w:w="80"/>
-              <w:left w:type="dxa" w:w="60"/>
-              <w:bottom w:type="dxa" w:w="80"/>
-              <w:right w:type="dxa" w:w="60"/>
-            </w:tcMar>
-            <w:vAlign w:val="center"/>
-          </w:tcPr>
-          <w:p>
-            <w:pPr>
-              <w:jc w:val="center"/>
-            </w:pPr>
-            <w:r>
-              <w:rPr>
-                <w:rFonts w:ascii="Arial" w:cs="Arial" w:eastAsia="Arial" w:hAnsi="Arial"/>
-                <w:b/>
-                <w:bCs/>
-                <w:color w:val="FFFFFF"/>
-                <w:sz w:val="26"/>
-                <w:szCs w:val="26"/>
-              </w:rPr>
-              <w:t xml:space="preserve">8</w:t>
-            </w:r>
-          </w:p>
-        </w:tc>
-        <w:tc>
-          <w:tcPr>
-            <w:tcW w:type="dxa" w:w="2340"/>
-            <w:shd w:fill="DB982D" w:val="clear"/>
-            <w:tcMar>
-              <w:top w:type="dxa" w:w="80"/>
-              <w:left w:type="dxa" w:w="60"/>
-              <w:bottom w:type="dxa" w:w="80"/>
-              <w:right w:type="dxa" w:w="60"/>
-            </w:tcMar>
-            <w:vAlign w:val="center"/>
-          </w:tcPr>
-          <w:p>
-            <w:pPr>
-              <w:jc w:val="center"/>
-            </w:pPr>
-            <w:r>
-              <w:rPr>
-                <w:rFonts w:ascii="Arial" w:cs="Arial" w:eastAsia="Arial" w:hAnsi="Arial"/>
-                <w:b/>
-                <w:bCs/>
-                <w:color w:val="FFFFFF"/>
-                <w:sz w:val="26"/>
-                <w:szCs w:val="26"/>
-              </w:rPr>
-              <w:t xml:space="preserve">&gt; 30</w:t>
-            </w:r>
-          </w:p>
-        </w:tc>
-      </w:tr>
-      <w:tr>
-        <w:tc>
-          <w:tcPr>
-            <w:tcW w:type="dxa" w:w="2340"/>
-            <w:tcMar>
-              <w:top w:type="dxa" w:w="50"/>
-              <w:left w:type="dxa" w:w="60"/>
-              <w:bottom w:type="dxa" w:w="50"/>
-              <w:right w:type="dxa" w:w="60"/>
-            </w:tcMar>
-          </w:tcPr>
-          <w:p>
-            <w:pPr>
-              <w:jc w:val="center"/>
-            </w:pPr>
-            <w:r>
-              <w:rPr>
-                <w:rFonts w:ascii="Arial" w:cs="Arial" w:eastAsia="Arial" w:hAnsi="Arial"/>
-                <w:color w:val="243238"/>
-                <w:sz w:val="17"/>
-                <w:szCs w:val="17"/>
-              </w:rPr>
-              <w:t xml:space="preserve">logements</w:t>
-            </w:r>
-          </w:p>
-        </w:tc>
-        <w:tc>
-          <w:tcPr>
-            <w:tcW w:type="dxa" w:w="2340"/>
-            <w:tcMar>
-              <w:top w:type="dxa" w:w="50"/>
-              <w:left w:type="dxa" w:w="60"/>
-              <w:bottom w:type="dxa" w:w="50"/>
-              <w:right w:type="dxa" w:w="60"/>
-            </w:tcMar>
-          </w:tcPr>
-          <w:p>
-            <w:pPr>
-              <w:jc w:val="center"/>
-            </w:pPr>
-            <w:r>
-              <w:rPr>
-                <w:rFonts w:ascii="Arial" w:cs="Arial" w:eastAsia="Arial" w:hAnsi="Arial"/>
-                <w:color w:val="243238"/>
-                <w:sz w:val="17"/>
-                <w:szCs w:val="17"/>
-              </w:rPr>
-              <w:t xml:space="preserve">communes</w:t>
-            </w:r>
-          </w:p>
-        </w:tc>
-        <w:tc>
-          <w:tcPr>
-            <w:tcW w:type="dxa" w:w="2340"/>
-            <w:tcMar>
-              <w:top w:type="dxa" w:w="50"/>
-              <w:left w:type="dxa" w:w="60"/>
-              <w:bottom w:type="dxa" w:w="50"/>
-              <w:right w:type="dxa" w:w="60"/>
-            </w:tcMar>
-          </w:tcPr>
-          <w:p>
-            <w:pPr>
-              <w:jc w:val="center"/>
-            </w:pPr>
-            <w:r>
-              <w:rPr>
-                <w:rFonts w:ascii="Arial" w:cs="Arial" w:eastAsia="Arial" w:hAnsi="Arial"/>
-                <w:color w:val="243238"/>
-                <w:sz w:val="17"/>
-                <w:szCs w:val="17"/>
-              </w:rPr>
-              <w:t xml:space="preserve">agences</w:t>
-            </w:r>
-          </w:p>
-        </w:tc>
-        <w:tc>
-          <w:tcPr>
-            <w:tcW w:type="dxa" w:w="2340"/>
-            <w:tcMar>
-              <w:top w:type="dxa" w:w="50"/>
-              <w:left w:type="dxa" w:w="60"/>
-              <w:bottom w:type="dxa" w:w="50"/>
-              <w:right w:type="dxa" w:w="60"/>
-            </w:tcMar>
-          </w:tcPr>
-          <w:p>
-            <w:pPr>
-              <w:jc w:val="center"/>
-            </w:pPr>
-            <w:r>
-              <w:rPr>
-                <w:rFonts w:ascii="Arial" w:cs="Arial" w:eastAsia="Arial" w:hAnsi="Arial"/>
-                <w:color w:val="243238"/>
-                <w:sz w:val="17"/>
-                <w:szCs w:val="17"/>
-              </w:rPr>
-              <w:t xml:space="preserve">points de proximité</w:t>
-            </w:r>
-          </w:p>
-        </w:tc>
-      </w:tr>
-    </w:tbl>
-    <w:p>
-      <w:pPr>
-        <w:spacing w:after="160" w:before="40"/>
-      </w:pPr>
-      <w:r>
-        <w:rPr>
-          <w:rFonts w:ascii="Arial" w:cs="Arial" w:eastAsia="Arial" w:hAnsi="Arial"/>
-          <w:i/>
-          <w:iCs/>
-          <w:color w:val="66777C"/>
-          <w:sz w:val="14"/>
-          <w:szCs w:val="14"/>
-        </w:rPr>
-        <w:t xml:space="preserve">Données publiques du bailleur — sources officielles détaillées en fin de document.</w:t>
-      </w:r>
-    </w:p>
-    <w:p>
-      <w:pPr>
-        <w:pStyle w:val="Heading2"/>
-        <w:spacing w:after="100" w:before="200"/>
-      </w:pPr>
-      <w:r>
-        <w:rPr>
-          <w:rFonts w:ascii="Arial" w:cs="Arial" w:eastAsia="Arial" w:hAnsi="Arial"/>
-          <w:b/>
-          <w:bCs/>
-          <w:color w:val="0F6470"/>
-          <w:sz w:val="22"/>
-          <w:szCs w:val="22"/>
-        </w:rPr>
-        <w:t xml:space="preserve">Les enjeux du maintien à domicile</w:t>
-      </w:r>
-    </w:p>
-    <w:p>
-      <w:pPr>
-        <w:spacing w:after="120" w:line="264"/>
-        <w:jc w:val="both"/>
-      </w:pPr>
-      <w:r>
-        <w:rPr>
-          <w:rFonts w:ascii="Arial" w:cs="Arial" w:eastAsia="Arial" w:hAnsi="Arial"/>
-          <w:color w:val="243238"/>
-          <w:sz w:val="19"/>
-          <w:szCs w:val="19"/>
-        </w:rPr>
-        <w:t xml:space="preserve">Face au vieillissement de la population, les bailleurs sociaux développent des offres de logements et de services adaptés. Aujourd’hui, environ 30 % des locataires du parc social ont plus de 60 ans, et 11 % plus de 75 ans. La grande majorité d’entre eux souhaite rester à domicile dans des conditions de sécurité et de confort optimales. L’adaptation de la salle de bains — remplacement de la baignoire par une douche de plain-pied sécurisée — est l’intervention la plus déterminante pour prévenir les chutes et prolonger l’autonomie.</w:t>
-      </w:r>
-    </w:p>
-    <w:p>
-      <w:pPr>
-        <w:pStyle w:val="Heading2"/>
-        <w:spacing w:after="100" w:before="200"/>
-      </w:pPr>
-      <w:r>
-        <w:rPr>
-          <w:rFonts w:ascii="Arial" w:cs="Arial" w:eastAsia="Arial" w:hAnsi="Arial"/>
-          <w:b/>
-          <w:bCs/>
-          <w:color w:val="0F6470"/>
-          <w:sz w:val="22"/>
-          <w:szCs w:val="22"/>
-        </w:rPr>
-        <w:t xml:space="preserve">Notre lecture de vos priorités</w:t>
-      </w:r>
-    </w:p>
-    <w:p>
-      <w:pPr>
-        <w:pStyle w:val="ListParagraph"/>
-        <w:numPr>
-          <w:ilvl w:val="0"/>
-          <w:numId w:val="2"/>
-        </w:numPr>
-        <w:spacing w:after="60" w:line="252"/>
-        <w:jc w:val="both"/>
-      </w:pPr>
-      <w:r>
-        <w:rPr>
-          <w:rFonts w:ascii="Arial" w:cs="Arial" w:eastAsia="Arial" w:hAnsi="Arial"/>
-          <w:color w:val="243238"/>
-          <w:sz w:val="19"/>
-          <w:szCs w:val="19"/>
-        </w:rPr>
-        <w:t xml:space="preserve">Traiter les demandes d’adaptation qualifiées par le Pôle Social sans délais d’attente excessifs pour les locataires ;</w:t>
-      </w:r>
-    </w:p>
-    <w:p>
-      <w:pPr>
-        <w:pStyle w:val="ListParagraph"/>
-        <w:numPr>
-          <w:ilvl w:val="0"/>
-          <w:numId w:val="2"/>
-        </w:numPr>
-        <w:spacing w:after="60" w:line="252"/>
-        <w:jc w:val="both"/>
-      </w:pPr>
-      <w:r>
-        <w:rPr>
-          <w:rFonts w:ascii="Arial" w:cs="Arial" w:eastAsia="Arial" w:hAnsi="Arial"/>
-          <w:color w:val="243238"/>
-          <w:sz w:val="19"/>
-          <w:szCs w:val="19"/>
-        </w:rPr>
-        <w:t xml:space="preserve">Garantir une intervention respectueuse en logement occupé, sans relogement ni immobilisation longue de la salle d’eau ;</w:t>
-      </w:r>
-    </w:p>
-    <w:p>
-      <w:pPr>
-        <w:pStyle w:val="ListParagraph"/>
-        <w:numPr>
-          <w:ilvl w:val="0"/>
-          <w:numId w:val="2"/>
-        </w:numPr>
-        <w:spacing w:after="60" w:line="252"/>
-        <w:jc w:val="both"/>
-      </w:pPr>
-      <w:r>
-        <w:rPr>
-          <w:rFonts w:ascii="Arial" w:cs="Arial" w:eastAsia="Arial" w:hAnsi="Arial"/>
-          <w:color w:val="243238"/>
-          <w:sz w:val="19"/>
-          <w:szCs w:val="19"/>
-        </w:rPr>
-        <w:t xml:space="preserve">Maintenir la coordination entre les agences, le Pôle Travaux, les locataires et l’entreprise ;</w:t>
-      </w:r>
-    </w:p>
-    <w:p>
-      <w:pPr>
-        <w:pStyle w:val="ListParagraph"/>
-        <w:numPr>
-          <w:ilvl w:val="0"/>
-          <w:numId w:val="2"/>
-        </w:numPr>
-        <w:spacing w:after="60" w:line="252"/>
-        <w:jc w:val="both"/>
-      </w:pPr>
-      <w:r>
-        <w:rPr>
-          <w:rFonts w:ascii="Arial" w:cs="Arial" w:eastAsia="Arial" w:hAnsi="Arial"/>
-          <w:color w:val="243238"/>
-          <w:sz w:val="19"/>
-          <w:szCs w:val="19"/>
-        </w:rPr>
-        <w:t xml:space="preserve">Disposer d’une traçabilité complète : visite, devis, validation, pose, réception, SAV ;</w:t>
-      </w:r>
-    </w:p>
-    <w:p>
-      <w:pPr>
-        <w:pStyle w:val="ListParagraph"/>
-        <w:numPr>
-          <w:ilvl w:val="0"/>
-          <w:numId w:val="2"/>
-        </w:numPr>
-        <w:spacing w:after="60" w:line="252"/>
-        <w:jc w:val="both"/>
-      </w:pPr>
-      <w:r>
-        <w:rPr>
-          <w:rFonts w:ascii="Arial" w:cs="Arial" w:eastAsia="Arial" w:hAnsi="Arial"/>
-          <w:color w:val="243238"/>
-          <w:sz w:val="19"/>
-          <w:szCs w:val="19"/>
-        </w:rPr>
         <w:t xml:space="preserve">Couvrir de façon homogène les secteurs Est et Ouest du département, sur 215 communes.</w:t>
       </w:r>
     </w:p>
-    <w:p>
-      <w:pPr>
-        <w:spacing w:after="60"/>
-      </w:pPr>
-    </w:p>
-    <w:tbl>
-      <w:tblPr>
-        <w:tblW w:type="dxa" w:w="9360"/>
-        <w:tblBorders>
-          <w:top w:val="none"/>
-          <w:left w:val="single" w:color="0F6470" w:sz="24"/>
-          <w:bottom w:val="none"/>
-          <w:right w:val="none"/>
-          <w:insideH w:val="none"/>
-          <w:insideV w:val="none"/>
-        </w:tblBorders>
-      </w:tblPr>
-      <w:tblGrid>
-        <w:gridCol w:w="9360"/>
-      </w:tblGrid>
-      <w:tr>
-        <w:tc>
-          <w:tcPr>
-            <w:tcW w:type="dxa" w:w="9360"/>
-            <w:shd w:fill="EAF2F3" w:val="clear"/>
-            <w:tcMar>
-              <w:top w:type="dxa" w:w="90"/>
-              <w:left w:type="dxa" w:w="140"/>
-              <w:bottom w:type="dxa" w:w="90"/>
-              <w:right w:type="dxa" w:w="140"/>
-            </w:tcMar>
-          </w:tcPr>
-          <w:p>
-            <w:pPr>
-              <w:spacing w:line="252"/>
-              <w:jc w:val="both"/>
-            </w:pPr>
-            <w:r>
-              <w:rPr>
-                <w:rFonts w:ascii="Arial" w:cs="Arial" w:eastAsia="Arial" w:hAnsi="Arial"/>
-                <w:b/>
-                <w:bCs/>
-                <w:color w:val="073E47"/>
-                <w:sz w:val="19"/>
-                <w:szCs w:val="19"/>
-              </w:rPr>
-              <w:t xml:space="preserve">NOTRE ATOUT  </w:t>
-            </w:r>
-            <w:r>
-              <w:rPr>
-                <w:rFonts w:ascii="Arial" w:cs="Arial" w:eastAsia="Arial" w:hAnsi="Arial"/>
-                <w:color w:val="243238"/>
-                <w:sz w:val="19"/>
-                <w:szCs w:val="19"/>
-              </w:rPr>
-              <w:t xml:space="preserve">ADOM SENIOR connaît déjà ce marché pour y avoir réalisé 105 chantiers en 2025. Nous connaissons les configurations du patrimoine, les produits posés, les circuits de validation et les attentes des équipes de Morbihan Habitat.</w:t>
-            </w:r>
-          </w:p>
-        </w:tc>
-      </w:tr>
-    </w:tbl>
     <w:p>
       <w:r>
         <w:br w:type="page"/>
@@ -3148,7 +3522,7 @@
                 <w:sz w:val="18"/>
                 <w:szCs w:val="18"/>
               </w:rPr>
-              <w:t xml:space="preserve">Direction et supervision des engagements de l’entreprise ; encadrant technique et chantier SS4 (amiante). Ancien salarié d’ASH.</w:t>
+              <w:t xml:space="preserve">Direction et supervision des engagements de l’entreprise ; conducteur de travaux (5 ans d’expérience) et encadrant technique SS4 (amiante). Ancien salarié d’ASH.</w:t>
             </w:r>
           </w:p>
         </w:tc>
@@ -3527,6 +3901,38 @@
           <w:szCs w:val="19"/>
         </w:rPr>
         <w:t xml:space="preserve">L’approche de nos poseurs est douce et rassurante : présentation systématique, explications simples, respect du rythme de la personne et attention portée à ses besoins essentiels pendant toute la durée du chantier.</w:t>
+      </w:r>
+    </w:p>
+    <w:p>
+      <w:pPr>
+        <w:pStyle w:val="Heading2"/>
+        <w:spacing w:after="100" w:before="200"/>
+      </w:pPr>
+      <w:r>
+        <w:rPr>
+          <w:rFonts w:ascii="Arial" w:cs="Arial" w:eastAsia="Arial" w:hAnsi="Arial"/>
+          <w:b/>
+          <w:bCs/>
+          <w:color w:val="0F6470"/>
+          <w:sz w:val="22"/>
+          <w:szCs w:val="22"/>
+        </w:rPr>
+        <w:t xml:space="preserve">L’habitude de travailler avec les ergothérapeutes</w:t>
+      </w:r>
+    </w:p>
+    <w:p>
+      <w:pPr>
+        <w:spacing w:after="120" w:line="264"/>
+        <w:jc w:val="both"/>
+      </w:pPr>
+      <w:r>
+        <w:rPr>
+          <w:rFonts w:ascii="Arial" w:cs="Arial" w:eastAsia="Arial" w:hAnsi="Arial"/>
+          <w:color w:val="243238"/>
+          <w:sz w:val="19"/>
+          <w:szCs w:val="19"/>
+        </w:rPr>
+        <w:t xml:space="preserve">Nous travaillons régulièrement avec les ergothérapeutes et les conseillères en économie sociale et familiale (CESF) mandatés par les bailleurs. Leurs préconisations (hauteurs d’assise, barres de maintien, sens de transfert, dégagements) sont intégrées dès la visite VISAP et tracées dans le dossier du logement. Nos équipes savent lire une prescription d’ergothérapeute, la traduire en implantation technique et signaler toute impossibilité avant la commande — jamais pendant la pose.</w:t>
       </w:r>
     </w:p>
     <w:p>
@@ -4051,8 +4457,69 @@
           <w:sz w:val="22"/>
           <w:szCs w:val="22"/>
         </w:rPr>
-        <w:t xml:space="preserve">Qualifications et formations</w:t>
-      </w:r>
+        <w:t xml:space="preserve">Qualifications, labels et formations</w:t>
+      </w:r>
+    </w:p>
+    <w:tbl>
+      <w:tblPr>
+        <w:tblW w:type="dxa" w:w="9360"/>
+        <w:tblBorders>
+          <w:top w:val="none"/>
+          <w:left w:val="single" w:color="0F6470" w:sz="24"/>
+          <w:bottom w:val="none"/>
+          <w:right w:val="none"/>
+          <w:insideH w:val="none"/>
+          <w:insideV w:val="none"/>
+        </w:tblBorders>
+      </w:tblPr>
+      <w:tblGrid>
+        <w:gridCol w:w="9360"/>
+      </w:tblGrid>
+      <w:tr>
+        <w:tc>
+          <w:tcPr>
+            <w:tcW w:type="dxa" w:w="9360"/>
+            <w:shd w:fill="EAF2F3" w:val="clear"/>
+            <w:tcMar>
+              <w:top w:type="dxa" w:w="90"/>
+              <w:left w:type="dxa" w:w="140"/>
+              <w:bottom w:type="dxa" w:w="90"/>
+              <w:right w:type="dxa" w:w="140"/>
+            </w:tcMar>
+          </w:tcPr>
+          <w:p>
+            <w:pPr>
+              <w:spacing w:line="252"/>
+              <w:jc w:val="both"/>
+            </w:pPr>
+            <w:r>
+              <w:rPr>
+                <w:rFonts w:ascii="Arial" w:cs="Arial" w:eastAsia="Arial" w:hAnsi="Arial"/>
+                <w:b/>
+                <w:bCs/>
+                <w:color w:val="073E47"/>
+                <w:sz w:val="19"/>
+                <w:szCs w:val="19"/>
+              </w:rPr>
+              <w:t xml:space="preserve">LABELS  </w:t>
+            </w:r>
+            <w:r>
+              <w:rPr>
+                <w:rFonts w:ascii="Arial" w:cs="Arial" w:eastAsia="Arial" w:hAnsi="Arial"/>
+                <w:color w:val="243238"/>
+                <w:sz w:val="19"/>
+                <w:szCs w:val="19"/>
+              </w:rPr>
+              <w:t xml:space="preserve">ADOM SENIOR est labélisée HANDIBAT, la marque de qualification des professionnels de l’accessibilité et de l’adaptation du cadre de vie. La qualification QUALIBAT est en cours d’obtention.</w:t>
+            </w:r>
+          </w:p>
+        </w:tc>
+      </w:tr>
+    </w:tbl>
+    <w:p>
+      <w:pPr>
+        <w:spacing w:after="80"/>
+      </w:pPr>
     </w:p>
     <w:p>
       <w:pPr>
@@ -4086,7 +4553,7 @@
           <w:sz w:val="19"/>
           <w:szCs w:val="19"/>
         </w:rPr>
-        <w:t xml:space="preserve">Formation amiante sous-section 4 (SS4) — opérateurs et encadrement (attestations à jour jointes en annexe) ;</w:t>
+        <w:t xml:space="preserve">Formation amiante sous-section 4 (SS4) — opérateurs et encadrement ;</w:t>
       </w:r>
     </w:p>
     <w:p>
@@ -4441,7 +4908,7 @@
                 <w:sz w:val="18"/>
                 <w:szCs w:val="18"/>
               </w:rPr>
-              <w:t xml:space="preserve">Le locataire est appelé sous 24 h pour fixer la visite. En cas de non-réponse : message vocal + SMS, nouvel essai à 24 h, puis avis de passage et carte de visite sous 48 h. Le bailleur est informé de toute difficulté de contact.</w:t>
+              <w:t xml:space="preserve">Le locataire est appelé sous 24 h pour fixer la visite. En cas de non-réponse : message vocal + SMS, nouvel essai à 24 h, puis avis de passage et carte de visite sous 48h. Le bailleur est informé de toute difficulté de contact.</w:t>
             </w:r>
           </w:p>
         </w:tc>
@@ -4615,7 +5082,7 @@
                 <w:sz w:val="18"/>
                 <w:szCs w:val="18"/>
               </w:rPr>
-              <w:t xml:space="preserve">Dès réception du bon de commande, le matériel est commandé ; environ 10 jours de délai d’approvisionnement, le rendez-vous de pose est pris immédiatement.</w:t>
+              <w:t xml:space="preserve">Dès réception du bon de commande, le matériel est commandé et livré sous environ 5 jours ouvrés par notre partenaire GEODIS ; le rendez-vous de pose est pris immédiatement.</w:t>
             </w:r>
           </w:p>
         </w:tc>
@@ -4732,6 +5199,67 @@
                 <w:szCs w:val="18"/>
               </w:rPr>
               <w:t xml:space="preserve">PV de réception signé, notice d’utilisation remise, photos finales et éventuelles réserves enregistrées ; documents mis à disposition du bailleur.</w:t>
+            </w:r>
+          </w:p>
+        </w:tc>
+      </w:tr>
+    </w:tbl>
+    <w:p>
+      <w:pPr>
+        <w:spacing w:after="80"/>
+      </w:pPr>
+    </w:p>
+    <w:tbl>
+      <w:tblPr>
+        <w:tblW w:type="dxa" w:w="9360"/>
+        <w:tblBorders>
+          <w:top w:val="none"/>
+          <w:left w:val="single" w:color="0F6470" w:sz="24"/>
+          <w:bottom w:val="none"/>
+          <w:right w:val="none"/>
+          <w:insideH w:val="none"/>
+          <w:insideV w:val="none"/>
+        </w:tblBorders>
+      </w:tblPr>
+      <w:tblGrid>
+        <w:gridCol w:w="9360"/>
+      </w:tblGrid>
+      <w:tr>
+        <w:tc>
+          <w:tcPr>
+            <w:tcW w:type="dxa" w:w="9360"/>
+            <w:shd w:fill="EAF2F3" w:val="clear"/>
+            <w:tcMar>
+              <w:top w:type="dxa" w:w="90"/>
+              <w:left w:type="dxa" w:w="140"/>
+              <w:bottom w:type="dxa" w:w="90"/>
+              <w:right w:type="dxa" w:w="140"/>
+            </w:tcMar>
+          </w:tcPr>
+          <w:p>
+            <w:pPr>
+              <w:spacing w:line="252"/>
+              <w:jc w:val="both"/>
+            </w:pPr>
+            <w:r>
+              <w:rPr>
+                <w:rFonts w:ascii="Arial" w:cs="Arial" w:eastAsia="Arial" w:hAnsi="Arial"/>
+                <w:b/>
+                <w:bCs/>
+                <w:color w:val="073E47"/>
+                <w:sz w:val="19"/>
+                <w:szCs w:val="19"/>
+              </w:rPr>
+              <w:t xml:space="preserve">ENGAGEMENT FORT  </w:t>
+            </w:r>
+            <w:r>
+              <w:rPr>
+                <w:rFonts w:ascii="Arial" w:cs="Arial" w:eastAsia="Arial" w:hAnsi="Arial"/>
+                <w:color w:val="243238"/>
+                <w:sz w:val="19"/>
+                <w:szCs w:val="19"/>
+              </w:rPr>
+              <w:t xml:space="preserve">De la réception du bon de commande à la réalisation des travaux : 4 semaines maximum. Ce délai est permis par notre stock dédié, la livraison GEODIS sous ≈ 5 jours ouvrés et des équipes locales (voir la chronologie détaillée en section 7).</w:t>
             </w:r>
           </w:p>
         </w:tc>
@@ -4906,7 +5434,7 @@
                 <w:sz w:val="18"/>
                 <w:szCs w:val="18"/>
               </w:rPr>
-              <w:t xml:space="preserve">Mobilité, transferts, appuis, présence d’un aidant, portes, circulations, étage, ascenseur, stationnement.</w:t>
+              <w:t xml:space="preserve">Mobilité, transferts, appuis, présence d’un aidant, portes, circulations, étage, ascenseur, stationnement ; préconisations de l’ergothérapeute intégrées lorsqu’une prescription existe.</w:t>
             </w:r>
           </w:p>
         </w:tc>
@@ -5557,7 +6085,7 @@
                 <w:sz w:val="19"/>
                 <w:szCs w:val="19"/>
               </w:rPr>
-              <w:t xml:space="preserve">Selon les besoins : WC, lavabo / miroir / réglette lumineuse, meuble, sol, dépose / pose de bidet, porte à glissement ou changement de sens de porte, rabotage de porte. Ces travaux peuvent porter l’intervention à 1 journée ½, voire 48 h. Le binôme de poseurs est alors constitué selon les qualifications requises (maçonnerie, peinture, électricité, menuiserie).</w:t>
+              <w:t xml:space="preserve">Selon les besoins : WC, lavabo / miroir / réglette lumineuse, meuble, sol, dépose / pose de bidet, porte à glissement ou changement de sens de porte, rabotage de porte. Ces travaux peuvent porter l’intervention à 1 journée ½, voire 48h. Le binôme de poseurs est alors constitué selon les qualifications requises (maçonnerie, peinture, électricité, menuiserie).</w:t>
             </w:r>
           </w:p>
         </w:tc>
@@ -6831,6 +7359,89 @@
           <w:sz w:val="22"/>
           <w:szCs w:val="22"/>
         </w:rPr>
+        <w:t xml:space="preserve">Logistique nationale : notre partenariat GEODIS</w:t>
+      </w:r>
+    </w:p>
+    <w:p>
+      <w:pPr>
+        <w:spacing w:after="120" w:line="264"/>
+        <w:jc w:val="both"/>
+      </w:pPr>
+      <w:r>
+        <w:rPr>
+          <w:rFonts w:ascii="Arial" w:cs="Arial" w:eastAsia="Arial" w:hAnsi="Arial"/>
+          <w:color w:val="243238"/>
+          <w:sz w:val="19"/>
+          <w:szCs w:val="19"/>
+        </w:rPr>
+        <w:t xml:space="preserve">Pour les équipements principaux (panneaux, receveurs, parois), notre chaîne logistique s’appuie sur GEODIS : les matériaux commandés dès réception du bon de commande sont livrés en environ 5 jours ouvrés, au plus près du lieu d’intervention, où nos poseurs les réceptionnent et les contrôlent. Ce circuit court entre le stock, le transporteur et le chantier est l’un des piliers de notre engagement de délai de 4 semaines.</w:t>
+      </w:r>
+    </w:p>
+    <w:p>
+      <w:pPr>
+        <w:spacing w:after="120" w:before="80"/>
+        <w:jc w:val="center"/>
+      </w:pPr>
+      <w:r>
+        <w:drawing>
+          <wp:inline distT="0" distB="0" distL="0" distR="0">
+            <wp:extent cx="6286500" cy="2514600"/>
+            <wp:effectExtent t="0" r="0" b="0" l="0"/>
+            <wp:docPr id="1" name="" descr="" title=""/>
+            <wp:cNvGraphicFramePr>
+              <a:graphicFrameLocks xmlns:a="http://schemas.openxmlformats.org/drawingml/2006/main" noChangeAspect="1"/>
+            </wp:cNvGraphicFramePr>
+            <a:graphic xmlns:a="http://schemas.openxmlformats.org/drawingml/2006/main">
+              <a:graphicData uri="http://schemas.openxmlformats.org/drawingml/2006/picture">
+                <pic:pic xmlns:pic="http://schemas.openxmlformats.org/drawingml/2006/picture">
+                  <pic:nvPicPr>
+                    <pic:cNvPr id="0" name="" descr=""/>
+                    <pic:cNvPicPr>
+                      <a:picLocks noChangeAspect="1" noChangeArrowheads="1"/>
+                    </pic:cNvPicPr>
+                  </pic:nvPicPr>
+                  <pic:blipFill>
+                    <a:blip r:embed="rId13" cstate="none"/>
+                    <a:srcRect/>
+                    <a:stretch>
+                      <a:fillRect/>
+                    </a:stretch>
+                  </pic:blipFill>
+                  <pic:spPr bwMode="auto">
+                    <a:xfrm>
+                      <a:off x="0" y="0"/>
+                      <a:ext cx="6286500" cy="2514600"/>
+                    </a:xfrm>
+                    <a:prstGeom prst="rect">
+                      <a:avLst/>
+                    </a:prstGeom>
+                  </pic:spPr>
+                </pic:pic>
+              </a:graphicData>
+            </a:graphic>
+          </wp:inline>
+        </w:drawing>
+      </w:r>
+    </w:p>
+    <w:p>
+      <w:pPr>
+        <w:spacing w:after="60"/>
+      </w:pPr>
+    </w:p>
+    <w:p>
+      <w:pPr>
+        <w:pStyle w:val="Heading2"/>
+        <w:spacing w:after="100" w:before="200"/>
+      </w:pPr>
+      <w:r>
+        <w:rPr>
+          <w:rFonts w:ascii="Arial" w:cs="Arial" w:eastAsia="Arial" w:hAnsi="Arial"/>
+          <w:b/>
+          <w:bCs/>
+          <w:color w:val="0F6470"/>
+          <w:sz w:val="22"/>
+          <w:szCs w:val="22"/>
+        </w:rPr>
         <w:t xml:space="preserve">Véhicules et outillage</w:t>
       </w:r>
     </w:p>
@@ -7323,8 +7934,59 @@
           <w:sz w:val="19"/>
           <w:szCs w:val="19"/>
         </w:rPr>
-        <w:t xml:space="preserve">ADOM SENIOR propose d’ouvrir à Morbihan Habitat un accès nominatif à son portail client INTERFAST. Pour chaque chantier partagé, le référent du bailleur retrouve 24 h/24, sur ordinateur et mobile, les informations générales, les interventions terminées, les rapports et photographies ainsi que les documents sélectionnés.</w:t>
-      </w:r>
+        <w:t xml:space="preserve">ADOM SENIOR propose d’ouvrir à Morbihan Habitat un accès nominatif à son portail client INTERFAST. Pour chaque chantier partagé, le référent du bailleur retrouve 24h/24, sur ordinateur et mobile, les informations générales, les interventions terminées, les rapports et photographies ainsi que les documents sélectionnés.</w:t>
+      </w:r>
+    </w:p>
+    <w:p>
+      <w:pPr>
+        <w:spacing w:after="120" w:before="80"/>
+        <w:jc w:val="center"/>
+      </w:pPr>
+      <w:r>
+        <w:drawing>
+          <wp:inline distT="0" distB="0" distL="0" distR="0">
+            <wp:extent cx="6096000" cy="3686175"/>
+            <wp:effectExtent t="0" r="0" b="0" l="0"/>
+            <wp:docPr id="1" name="" descr="" title=""/>
+            <wp:cNvGraphicFramePr>
+              <a:graphicFrameLocks xmlns:a="http://schemas.openxmlformats.org/drawingml/2006/main" noChangeAspect="1"/>
+            </wp:cNvGraphicFramePr>
+            <a:graphic xmlns:a="http://schemas.openxmlformats.org/drawingml/2006/main">
+              <a:graphicData uri="http://schemas.openxmlformats.org/drawingml/2006/picture">
+                <pic:pic xmlns:pic="http://schemas.openxmlformats.org/drawingml/2006/picture">
+                  <pic:nvPicPr>
+                    <pic:cNvPr id="0" name="" descr=""/>
+                    <pic:cNvPicPr>
+                      <a:picLocks noChangeAspect="1" noChangeArrowheads="1"/>
+                    </pic:cNvPicPr>
+                  </pic:nvPicPr>
+                  <pic:blipFill>
+                    <a:blip r:embed="rId14" cstate="none"/>
+                    <a:srcRect/>
+                    <a:stretch>
+                      <a:fillRect/>
+                    </a:stretch>
+                  </pic:blipFill>
+                  <pic:spPr bwMode="auto">
+                    <a:xfrm>
+                      <a:off x="0" y="0"/>
+                      <a:ext cx="6096000" cy="3686175"/>
+                    </a:xfrm>
+                    <a:prstGeom prst="rect">
+                      <a:avLst/>
+                    </a:prstGeom>
+                  </pic:spPr>
+                </pic:pic>
+              </a:graphicData>
+            </a:graphic>
+          </wp:inline>
+        </w:drawing>
+      </w:r>
+    </w:p>
+    <w:p>
+      <w:pPr>
+        <w:spacing w:after="40"/>
+      </w:pPr>
     </w:p>
     <w:tbl>
       <w:tblPr>
@@ -8336,77 +8998,24 @@
           <w:sz w:val="19"/>
           <w:szCs w:val="19"/>
         </w:rPr>
-        <w:t xml:space="preserve">Un tableau de bord unique rassemble toutes les demandes du département ; le secteur (Est / Ouest), l’agence, l’origine de la demande et la priorité sont de simples filtres de pilotage. Des réunions de suivi régulières (trimestrielles recommandées, en présentiel ou visioconférence) et un bilan annuel complètent ce dispositif.</w:t>
-      </w:r>
-    </w:p>
-    <w:p>
-      <w:r>
-        <w:br w:type="page"/>
-      </w:r>
-    </w:p>
-    <w:tbl>
-      <w:tblPr>
-        <w:tblW w:type="dxa" w:w="3600"/>
-        <w:tblBorders>
-          <w:top w:val="none" w:color="FFFFFF" w:sz="0"/>
-          <w:left w:val="none" w:color="FFFFFF" w:sz="0"/>
-          <w:bottom w:val="none" w:color="FFFFFF" w:sz="0"/>
-          <w:right w:val="none" w:color="FFFFFF" w:sz="0"/>
-          <w:insideH w:val="none" w:color="FFFFFF" w:sz="0"/>
-          <w:insideV w:val="none" w:color="FFFFFF" w:sz="0"/>
-        </w:tblBorders>
-      </w:tblPr>
-      <w:tblGrid>
-        <w:gridCol w:w="3600"/>
-      </w:tblGrid>
-      <w:tr>
-        <w:tc>
-          <w:tcPr>
-            <w:tcW w:type="dxa" w:w="3600"/>
-            <w:shd w:fill="DB982D" w:val="clear"/>
-            <w:tcMar>
-              <w:top w:type="dxa" w:w="60"/>
-              <w:left w:type="dxa" w:w="100"/>
-              <w:bottom w:type="dxa" w:w="60"/>
-              <w:right w:type="dxa" w:w="100"/>
-            </w:tcMar>
-          </w:tcPr>
-          <w:p>
-            <w:r>
-              <w:rPr>
-                <w:rFonts w:ascii="Arial" w:cs="Arial" w:eastAsia="Arial" w:hAnsi="Arial"/>
-                <w:b/>
-                <w:bCs/>
-                <w:color w:val="FFFFFF"/>
-                <w:sz w:val="16"/>
-                <w:szCs w:val="16"/>
-              </w:rPr>
-              <w:t xml:space="preserve">DÉLAIS</w:t>
-            </w:r>
-          </w:p>
-        </w:tc>
-      </w:tr>
-    </w:tbl>
-    <w:p>
-      <w:pPr>
-        <w:spacing w:after="60"/>
-      </w:pPr>
-    </w:p>
-    <w:p>
-      <w:pPr>
-        <w:pStyle w:val="Heading1"/>
-        <w:spacing w:after="120" w:before="120"/>
+        <w:t xml:space="preserve">Un tableau de bord unique rassemble toutes les demandes du département ; le secteur (Est / Ouest), l’agence, l’origine de la demande et la priorité sont de simples filtres de pilotage.</w:t>
+      </w:r>
+    </w:p>
+    <w:p>
+      <w:pPr>
+        <w:pStyle w:val="Heading2"/>
+        <w:spacing w:after="100" w:before="200"/>
       </w:pPr>
       <w:r>
         <w:rPr>
           <w:rFonts w:ascii="Arial" w:cs="Arial" w:eastAsia="Arial" w:hAnsi="Arial"/>
           <w:b/>
           <w:bCs/>
-          <w:color w:val="073E47"/>
-          <w:sz w:val="30"/>
-          <w:szCs w:val="30"/>
-        </w:rPr>
-        <w:t xml:space="preserve">7. Chronologie et délais de traitement</w:t>
+          <w:color w:val="0F6470"/>
+          <w:sz w:val="22"/>
+          <w:szCs w:val="22"/>
+        </w:rPr>
+        <w:t xml:space="preserve">Gouvernance du marché : des réunions régulières</w:t>
       </w:r>
     </w:p>
     <w:p>
@@ -8421,7 +9030,7 @@
           <w:sz w:val="19"/>
           <w:szCs w:val="19"/>
         </w:rPr>
-        <w:t xml:space="preserve">Nos engagements de délais sont calibrés sur notre organisation réelle : des équipes locales, un approvisionnement de proximité et une préparation rigoureuse qui évite les seconds déplacements.</w:t>
+        <w:t xml:space="preserve">Au-delà du suivi au fil de l’eau dans INTERFAST, nous proposons à Morbihan Habitat un rythme de rencontres structuré, garant d’une communication fluide et d’une amélioration continue des prestations :</w:t>
       </w:r>
     </w:p>
     <w:tbl>
@@ -8469,7 +9078,7 @@
                 <w:sz w:val="18"/>
                 <w:szCs w:val="18"/>
               </w:rPr>
-              <w:t xml:space="preserve">Jalon</w:t>
+              <w:t xml:space="preserve">Rendez-vous</w:t>
             </w:r>
           </w:p>
         </w:tc>
@@ -8498,7 +9107,7 @@
                 <w:sz w:val="18"/>
                 <w:szCs w:val="18"/>
               </w:rPr>
-              <w:t xml:space="preserve">Engagement cible</w:t>
+              <w:t xml:space="preserve">Objet</w:t>
             </w:r>
           </w:p>
         </w:tc>
@@ -8528,7 +9137,7 @@
                 <w:sz w:val="18"/>
                 <w:szCs w:val="18"/>
               </w:rPr>
-              <w:t xml:space="preserve">J0 — Demande</w:t>
+              <w:t xml:space="preserve">Réunion de lancement</w:t>
             </w:r>
           </w:p>
         </w:tc>
@@ -8556,7 +9165,7 @@
                 <w:sz w:val="18"/>
                 <w:szCs w:val="18"/>
               </w:rPr>
-              <w:t xml:space="preserve">Demande intégrée dans le tableau de bord et accusée sous 24 h ouvrées.</w:t>
+              <w:t xml:space="preserve">Marque le démarrage du marché : relation de travail entre les parties, rappel des éléments clés du contrat, organisation de la mise en œuvre des prestations et plan de prévention des risques.</w:t>
             </w:r>
           </w:p>
         </w:tc>
@@ -8586,7 +9195,7 @@
                 <w:sz w:val="18"/>
                 <w:szCs w:val="18"/>
               </w:rPr>
-              <w:t xml:space="preserve">J0–J1 — Contact</w:t>
+              <w:t xml:space="preserve">Points de suivi trimestriels</w:t>
             </w:r>
           </w:p>
         </w:tc>
@@ -8614,7 +9223,7 @@
                 <w:sz w:val="18"/>
                 <w:szCs w:val="18"/>
               </w:rPr>
-              <w:t xml:space="preserve">Le locataire est contacté sous 24 h ; relances à 24 h puis avis de passage sous 48 h en cas de non-réponse.</w:t>
+              <w:t xml:space="preserve">En présentiel ou en visioconférence : aspects techniques, organisationnels et relationnels avec les locataires ; revue des indicateurs et des dossiers sensibles.</w:t>
             </w:r>
           </w:p>
         </w:tc>
@@ -8644,7 +9253,7 @@
                 <w:sz w:val="18"/>
                 <w:szCs w:val="18"/>
               </w:rPr>
-              <w:t xml:space="preserve">≤ 15 jours</w:t>
+              <w:t xml:space="preserve">Bilan annuel</w:t>
             </w:r>
           </w:p>
         </w:tc>
@@ -8672,7 +9281,7 @@
                 <w:sz w:val="18"/>
                 <w:szCs w:val="18"/>
               </w:rPr>
-              <w:t xml:space="preserve">Visite VISAP réalisée, chiffrage et proposition transmis au bailleur (sous réserve d’accès au logement).</w:t>
+              <w:t xml:space="preserve">Évaluation de la qualité des prestations, identification des améliorations, anticipation des besoins futurs et état des lieux du contrat. Un compte-rendu écrit est remis par ADOM SENIOR.</w:t>
             </w:r>
           </w:p>
         </w:tc>
@@ -8702,7 +9311,7 @@
                 <w:sz w:val="18"/>
                 <w:szCs w:val="18"/>
               </w:rPr>
-              <w:t xml:space="preserve">Validation + 10 jours</w:t>
+              <w:t xml:space="preserve">À la demande</w:t>
             </w:r>
           </w:p>
         </w:tc>
@@ -8730,37 +9339,263 @@
                 <w:sz w:val="18"/>
                 <w:szCs w:val="18"/>
               </w:rPr>
-              <w:t xml:space="preserve">Réception du matériel commandé ; rendez-vous de pose fixé dès l’envoi de la commande.</w:t>
-            </w:r>
-          </w:p>
-        </w:tc>
-      </w:tr>
-      <w:tr>
+              <w:t xml:space="preserve">Charles de Lestrange se rend disponible sur convocation du bailleur, sous 48h en cas de situation urgente.</w:t>
+            </w:r>
+          </w:p>
+        </w:tc>
+      </w:tr>
+    </w:tbl>
+    <w:p>
+      <w:r>
+        <w:br w:type="page"/>
+      </w:r>
+    </w:p>
+    <w:tbl>
+      <w:tblPr>
+        <w:tblW w:type="dxa" w:w="3600"/>
+        <w:tblBorders>
+          <w:top w:val="none" w:color="FFFFFF" w:sz="0"/>
+          <w:left w:val="none" w:color="FFFFFF" w:sz="0"/>
+          <w:bottom w:val="none" w:color="FFFFFF" w:sz="0"/>
+          <w:right w:val="none" w:color="FFFFFF" w:sz="0"/>
+          <w:insideH w:val="none" w:color="FFFFFF" w:sz="0"/>
+          <w:insideV w:val="none" w:color="FFFFFF" w:sz="0"/>
+        </w:tblBorders>
+      </w:tblPr>
+      <w:tblGrid>
+        <w:gridCol w:w="3600"/>
+      </w:tblGrid>
+      <w:tr>
+        <w:tc>
+          <w:tcPr>
+            <w:tcW w:type="dxa" w:w="3600"/>
+            <w:shd w:fill="DB982D" w:val="clear"/>
+            <w:tcMar>
+              <w:top w:type="dxa" w:w="60"/>
+              <w:left w:type="dxa" w:w="100"/>
+              <w:bottom w:type="dxa" w:w="60"/>
+              <w:right w:type="dxa" w:w="100"/>
+            </w:tcMar>
+          </w:tcPr>
+          <w:p>
+            <w:r>
+              <w:rPr>
+                <w:rFonts w:ascii="Arial" w:cs="Arial" w:eastAsia="Arial" w:hAnsi="Arial"/>
+                <w:b/>
+                <w:bCs/>
+                <w:color w:val="FFFFFF"/>
+                <w:sz w:val="16"/>
+                <w:szCs w:val="16"/>
+              </w:rPr>
+              <w:t xml:space="preserve">DÉLAIS</w:t>
+            </w:r>
+          </w:p>
+        </w:tc>
+      </w:tr>
+    </w:tbl>
+    <w:p>
+      <w:pPr>
+        <w:spacing w:after="60"/>
+      </w:pPr>
+    </w:p>
+    <w:p>
+      <w:pPr>
+        <w:pStyle w:val="Heading1"/>
+        <w:spacing w:after="120" w:before="120"/>
+      </w:pPr>
+      <w:r>
+        <w:rPr>
+          <w:rFonts w:ascii="Arial" w:cs="Arial" w:eastAsia="Arial" w:hAnsi="Arial"/>
+          <w:b/>
+          <w:bCs/>
+          <w:color w:val="073E47"/>
+          <w:sz w:val="30"/>
+          <w:szCs w:val="30"/>
+        </w:rPr>
+        <w:t xml:space="preserve">7. Chronologie et délais de traitement</w:t>
+      </w:r>
+    </w:p>
+    <w:p>
+      <w:pPr>
+        <w:spacing w:after="120" w:line="264"/>
+        <w:jc w:val="both"/>
+      </w:pPr>
+      <w:r>
+        <w:rPr>
+          <w:rFonts w:ascii="Arial" w:cs="Arial" w:eastAsia="Arial" w:hAnsi="Arial"/>
+          <w:color w:val="243238"/>
+          <w:sz w:val="19"/>
+          <w:szCs w:val="19"/>
+        </w:rPr>
+        <w:t xml:space="preserve">Nos engagements de délais sont calibrés sur notre organisation réelle : des équipes locales, un stock dédié, la livraison GEODIS sous ≈ 5 jours ouvrés et une préparation rigoureuse qui évite les seconds déplacements.</w:t>
+      </w:r>
+    </w:p>
+    <w:tbl>
+      <w:tblPr>
+        <w:tblW w:type="dxa" w:w="9360"/>
+        <w:tblBorders>
+          <w:top w:val="none"/>
+          <w:left w:val="single" w:color="0F6470" w:sz="24"/>
+          <w:bottom w:val="none"/>
+          <w:right w:val="none"/>
+          <w:insideH w:val="none"/>
+          <w:insideV w:val="none"/>
+        </w:tblBorders>
+      </w:tblPr>
+      <w:tblGrid>
+        <w:gridCol w:w="9360"/>
+      </w:tblGrid>
+      <w:tr>
+        <w:tc>
+          <w:tcPr>
+            <w:tcW w:type="dxa" w:w="9360"/>
+            <w:shd w:fill="EAF2F3" w:val="clear"/>
+            <w:tcMar>
+              <w:top w:type="dxa" w:w="90"/>
+              <w:left w:type="dxa" w:w="140"/>
+              <w:bottom w:type="dxa" w:w="90"/>
+              <w:right w:type="dxa" w:w="140"/>
+            </w:tcMar>
+          </w:tcPr>
+          <w:p>
+            <w:pPr>
+              <w:spacing w:line="252"/>
+              <w:jc w:val="both"/>
+            </w:pPr>
+            <w:r>
+              <w:rPr>
+                <w:rFonts w:ascii="Arial" w:cs="Arial" w:eastAsia="Arial" w:hAnsi="Arial"/>
+                <w:b/>
+                <w:bCs/>
+                <w:color w:val="073E47"/>
+                <w:sz w:val="19"/>
+                <w:szCs w:val="19"/>
+              </w:rPr>
+              <w:t xml:space="preserve">NOTRE ENGAGEMENT FORT  </w:t>
+            </w:r>
+            <w:r>
+              <w:rPr>
+                <w:rFonts w:ascii="Arial" w:cs="Arial" w:eastAsia="Arial" w:hAnsi="Arial"/>
+                <w:color w:val="243238"/>
+                <w:sz w:val="19"/>
+                <w:szCs w:val="19"/>
+              </w:rPr>
+              <w:t xml:space="preserve">Un délai d’intervention de 4 semaines maximum entre la réception du bon de commande et la réalisation des travaux.</w:t>
+            </w:r>
+          </w:p>
+        </w:tc>
+      </w:tr>
+    </w:tbl>
+    <w:p>
+      <w:pPr>
+        <w:spacing w:after="60"/>
+      </w:pPr>
+    </w:p>
+    <w:tbl>
+      <w:tblPr>
+        <w:tblW w:type="dxa" w:w="9360"/>
+        <w:tblBorders>
+          <w:top w:val="single" w:color="C9D8DB" w:sz="4"/>
+          <w:left w:val="single" w:color="C9D8DB" w:sz="4"/>
+          <w:bottom w:val="single" w:color="C9D8DB" w:sz="4"/>
+          <w:right w:val="single" w:color="C9D8DB" w:sz="4"/>
+          <w:insideH w:val="single" w:color="C9D8DB" w:sz="4"/>
+          <w:insideV w:val="single" w:color="C9D8DB" w:sz="4"/>
+        </w:tblBorders>
+      </w:tblPr>
+      <w:tblGrid>
+        <w:gridCol w:w="2800"/>
+        <w:gridCol w:w="6560"/>
+      </w:tblGrid>
+      <w:tr>
+        <w:trPr>
+          <w:tblHeader/>
+        </w:trPr>
         <w:tc>
           <w:tcPr>
             <w:tcW w:type="dxa" w:w="2800"/>
-            <w:tcMar>
-              <w:top w:type="dxa" w:w="60"/>
-              <w:left w:type="dxa" w:w="100"/>
-              <w:bottom w:type="dxa" w:w="60"/>
-              <w:right w:type="dxa" w:w="100"/>
-            </w:tcMar>
-            <w:vAlign w:val="center"/>
-          </w:tcPr>
-          <w:p>
-            <w:pPr>
-              <w:spacing w:line="240"/>
-            </w:pPr>
-            <w:r>
-              <w:rPr>
-                <w:rFonts w:ascii="Arial" w:cs="Arial" w:eastAsia="Arial" w:hAnsi="Arial"/>
-                <w:b/>
-                <w:bCs/>
-                <w:color w:val="243238"/>
-                <w:sz w:val="18"/>
-                <w:szCs w:val="18"/>
-              </w:rPr>
-              <w:t xml:space="preserve">Pose standard</w:t>
+            <w:shd w:fill="0F6470" w:val="clear"/>
+            <w:tcMar>
+              <w:top w:type="dxa" w:w="60"/>
+              <w:left w:type="dxa" w:w="100"/>
+              <w:bottom w:type="dxa" w:w="60"/>
+              <w:right w:type="dxa" w:w="100"/>
+            </w:tcMar>
+            <w:vAlign w:val="center"/>
+          </w:tcPr>
+          <w:p>
+            <w:pPr>
+              <w:jc w:val="left"/>
+            </w:pPr>
+            <w:r>
+              <w:rPr>
+                <w:rFonts w:ascii="Arial" w:cs="Arial" w:eastAsia="Arial" w:hAnsi="Arial"/>
+                <w:b/>
+                <w:bCs/>
+                <w:color w:val="FFFFFF"/>
+                <w:sz w:val="18"/>
+                <w:szCs w:val="18"/>
+              </w:rPr>
+              <w:t xml:space="preserve">Jalon</w:t>
+            </w:r>
+          </w:p>
+        </w:tc>
+        <w:tc>
+          <w:tcPr>
+            <w:tcW w:type="dxa" w:w="6560"/>
+            <w:shd w:fill="0F6470" w:val="clear"/>
+            <w:tcMar>
+              <w:top w:type="dxa" w:w="60"/>
+              <w:left w:type="dxa" w:w="100"/>
+              <w:bottom w:type="dxa" w:w="60"/>
+              <w:right w:type="dxa" w:w="100"/>
+            </w:tcMar>
+            <w:vAlign w:val="center"/>
+          </w:tcPr>
+          <w:p>
+            <w:pPr>
+              <w:jc w:val="left"/>
+            </w:pPr>
+            <w:r>
+              <w:rPr>
+                <w:rFonts w:ascii="Arial" w:cs="Arial" w:eastAsia="Arial" w:hAnsi="Arial"/>
+                <w:b/>
+                <w:bCs/>
+                <w:color w:val="FFFFFF"/>
+                <w:sz w:val="18"/>
+                <w:szCs w:val="18"/>
+              </w:rPr>
+              <w:t xml:space="preserve">Engagement cible</w:t>
+            </w:r>
+          </w:p>
+        </w:tc>
+      </w:tr>
+      <w:tr>
+        <w:tc>
+          <w:tcPr>
+            <w:tcW w:type="dxa" w:w="2800"/>
+            <w:tcMar>
+              <w:top w:type="dxa" w:w="60"/>
+              <w:left w:type="dxa" w:w="100"/>
+              <w:bottom w:type="dxa" w:w="60"/>
+              <w:right w:type="dxa" w:w="100"/>
+            </w:tcMar>
+            <w:vAlign w:val="center"/>
+          </w:tcPr>
+          <w:p>
+            <w:pPr>
+              <w:spacing w:line="240"/>
+            </w:pPr>
+            <w:r>
+              <w:rPr>
+                <w:rFonts w:ascii="Arial" w:cs="Arial" w:eastAsia="Arial" w:hAnsi="Arial"/>
+                <w:b/>
+                <w:bCs/>
+                <w:color w:val="243238"/>
+                <w:sz w:val="18"/>
+                <w:szCs w:val="18"/>
+              </w:rPr>
+              <w:t xml:space="preserve">J0 — Demande</w:t>
             </w:r>
           </w:p>
         </w:tc>
@@ -8788,7 +9623,7 @@
                 <w:sz w:val="18"/>
                 <w:szCs w:val="18"/>
               </w:rPr>
-              <w:t xml:space="preserve">Transformation réalisée en une journée lorsque la configuration et le diagnostic le permettent ; 1 j ½ à 48 h avec travaux annexes.</w:t>
+              <w:t xml:space="preserve">Demande intégrée dans le tableau de bord et accusée sous 24 h ouvrées.</w:t>
             </w:r>
           </w:p>
         </w:tc>
@@ -8818,7 +9653,7 @@
                 <w:sz w:val="18"/>
                 <w:szCs w:val="18"/>
               </w:rPr>
-              <w:t xml:space="preserve">Après réception</w:t>
+              <w:t xml:space="preserve">J0–J1 — Contact</w:t>
             </w:r>
           </w:p>
         </w:tc>
@@ -8846,7 +9681,239 @@
                 <w:sz w:val="18"/>
                 <w:szCs w:val="18"/>
               </w:rPr>
-              <w:t xml:space="preserve">PV, notice et photos partagés ; SAV qualifié sous 48 h ouvrées.</w:t>
+              <w:t xml:space="preserve">Le locataire est contacté sous 24 h ; relances à 24 h puis avis de passage sous 48h en cas de non-réponse.</w:t>
+            </w:r>
+          </w:p>
+        </w:tc>
+      </w:tr>
+      <w:tr>
+        <w:tc>
+          <w:tcPr>
+            <w:tcW w:type="dxa" w:w="2800"/>
+            <w:tcMar>
+              <w:top w:type="dxa" w:w="60"/>
+              <w:left w:type="dxa" w:w="100"/>
+              <w:bottom w:type="dxa" w:w="60"/>
+              <w:right w:type="dxa" w:w="100"/>
+            </w:tcMar>
+            <w:vAlign w:val="center"/>
+          </w:tcPr>
+          <w:p>
+            <w:pPr>
+              <w:spacing w:line="240"/>
+            </w:pPr>
+            <w:r>
+              <w:rPr>
+                <w:rFonts w:ascii="Arial" w:cs="Arial" w:eastAsia="Arial" w:hAnsi="Arial"/>
+                <w:b/>
+                <w:bCs/>
+                <w:color w:val="243238"/>
+                <w:sz w:val="18"/>
+                <w:szCs w:val="18"/>
+              </w:rPr>
+              <w:t xml:space="preserve">≤ 15 jours</w:t>
+            </w:r>
+          </w:p>
+        </w:tc>
+        <w:tc>
+          <w:tcPr>
+            <w:tcW w:type="dxa" w:w="6560"/>
+            <w:tcMar>
+              <w:top w:type="dxa" w:w="60"/>
+              <w:left w:type="dxa" w:w="100"/>
+              <w:bottom w:type="dxa" w:w="60"/>
+              <w:right w:type="dxa" w:w="100"/>
+            </w:tcMar>
+            <w:vAlign w:val="center"/>
+          </w:tcPr>
+          <w:p>
+            <w:pPr>
+              <w:spacing w:line="240"/>
+            </w:pPr>
+            <w:r>
+              <w:rPr>
+                <w:rFonts w:ascii="Arial" w:cs="Arial" w:eastAsia="Arial" w:hAnsi="Arial"/>
+                <w:b w:val="false"/>
+                <w:bCs w:val="false"/>
+                <w:color w:val="243238"/>
+                <w:sz w:val="18"/>
+                <w:szCs w:val="18"/>
+              </w:rPr>
+              <w:t xml:space="preserve">Visite VISAP réalisée, chiffrage et proposition transmis au bailleur (sous réserve d’accès au logement).</w:t>
+            </w:r>
+          </w:p>
+        </w:tc>
+      </w:tr>
+      <w:tr>
+        <w:tc>
+          <w:tcPr>
+            <w:tcW w:type="dxa" w:w="2800"/>
+            <w:tcMar>
+              <w:top w:type="dxa" w:w="60"/>
+              <w:left w:type="dxa" w:w="100"/>
+              <w:bottom w:type="dxa" w:w="60"/>
+              <w:right w:type="dxa" w:w="100"/>
+            </w:tcMar>
+            <w:vAlign w:val="center"/>
+          </w:tcPr>
+          <w:p>
+            <w:pPr>
+              <w:spacing w:line="240"/>
+            </w:pPr>
+            <w:r>
+              <w:rPr>
+                <w:rFonts w:ascii="Arial" w:cs="Arial" w:eastAsia="Arial" w:hAnsi="Arial"/>
+                <w:b/>
+                <w:bCs/>
+                <w:color w:val="243238"/>
+                <w:sz w:val="18"/>
+                <w:szCs w:val="18"/>
+              </w:rPr>
+              <w:t xml:space="preserve">BC + 5 j ouvrés</w:t>
+            </w:r>
+          </w:p>
+        </w:tc>
+        <w:tc>
+          <w:tcPr>
+            <w:tcW w:type="dxa" w:w="6560"/>
+            <w:tcMar>
+              <w:top w:type="dxa" w:w="60"/>
+              <w:left w:type="dxa" w:w="100"/>
+              <w:bottom w:type="dxa" w:w="60"/>
+              <w:right w:type="dxa" w:w="100"/>
+            </w:tcMar>
+            <w:vAlign w:val="center"/>
+          </w:tcPr>
+          <w:p>
+            <w:pPr>
+              <w:spacing w:line="240"/>
+            </w:pPr>
+            <w:r>
+              <w:rPr>
+                <w:rFonts w:ascii="Arial" w:cs="Arial" w:eastAsia="Arial" w:hAnsi="Arial"/>
+                <w:b w:val="false"/>
+                <w:bCs w:val="false"/>
+                <w:color w:val="243238"/>
+                <w:sz w:val="18"/>
+                <w:szCs w:val="18"/>
+              </w:rPr>
+              <w:t xml:space="preserve">Matériel livré par GEODIS au plus près du chantier ; rendez-vous de pose fixé dès l’envoi de la commande.</w:t>
+            </w:r>
+          </w:p>
+        </w:tc>
+      </w:tr>
+      <w:tr>
+        <w:tc>
+          <w:tcPr>
+            <w:tcW w:type="dxa" w:w="2800"/>
+            <w:tcMar>
+              <w:top w:type="dxa" w:w="60"/>
+              <w:left w:type="dxa" w:w="100"/>
+              <w:bottom w:type="dxa" w:w="60"/>
+              <w:right w:type="dxa" w:w="100"/>
+            </w:tcMar>
+            <w:vAlign w:val="center"/>
+          </w:tcPr>
+          <w:p>
+            <w:pPr>
+              <w:spacing w:line="240"/>
+            </w:pPr>
+            <w:r>
+              <w:rPr>
+                <w:rFonts w:ascii="Arial" w:cs="Arial" w:eastAsia="Arial" w:hAnsi="Arial"/>
+                <w:b/>
+                <w:bCs/>
+                <w:color w:val="243238"/>
+                <w:sz w:val="18"/>
+                <w:szCs w:val="18"/>
+              </w:rPr>
+              <w:t xml:space="preserve">BC + 4 semaines</w:t>
+            </w:r>
+          </w:p>
+        </w:tc>
+        <w:tc>
+          <w:tcPr>
+            <w:tcW w:type="dxa" w:w="6560"/>
+            <w:tcMar>
+              <w:top w:type="dxa" w:w="60"/>
+              <w:left w:type="dxa" w:w="100"/>
+              <w:bottom w:type="dxa" w:w="60"/>
+              <w:right w:type="dxa" w:w="100"/>
+            </w:tcMar>
+            <w:vAlign w:val="center"/>
+          </w:tcPr>
+          <w:p>
+            <w:pPr>
+              <w:spacing w:line="240"/>
+            </w:pPr>
+            <w:r>
+              <w:rPr>
+                <w:rFonts w:ascii="Arial" w:cs="Arial" w:eastAsia="Arial" w:hAnsi="Arial"/>
+                <w:b w:val="false"/>
+                <w:bCs w:val="false"/>
+                <w:color w:val="243238"/>
+                <w:sz w:val="18"/>
+                <w:szCs w:val="18"/>
+              </w:rPr>
+              <w:t xml:space="preserve">Travaux réalisés : pose en une journée lorsque la configuration et le diagnostic le permettent ; 1 j ½ à 48h avec travaux annexes.</w:t>
+            </w:r>
+          </w:p>
+        </w:tc>
+      </w:tr>
+      <w:tr>
+        <w:tc>
+          <w:tcPr>
+            <w:tcW w:type="dxa" w:w="2800"/>
+            <w:tcMar>
+              <w:top w:type="dxa" w:w="60"/>
+              <w:left w:type="dxa" w:w="100"/>
+              <w:bottom w:type="dxa" w:w="60"/>
+              <w:right w:type="dxa" w:w="100"/>
+            </w:tcMar>
+            <w:vAlign w:val="center"/>
+          </w:tcPr>
+          <w:p>
+            <w:pPr>
+              <w:spacing w:line="240"/>
+            </w:pPr>
+            <w:r>
+              <w:rPr>
+                <w:rFonts w:ascii="Arial" w:cs="Arial" w:eastAsia="Arial" w:hAnsi="Arial"/>
+                <w:b/>
+                <w:bCs/>
+                <w:color w:val="243238"/>
+                <w:sz w:val="18"/>
+                <w:szCs w:val="18"/>
+              </w:rPr>
+              <w:t xml:space="preserve">Après réception</w:t>
+            </w:r>
+          </w:p>
+        </w:tc>
+        <w:tc>
+          <w:tcPr>
+            <w:tcW w:type="dxa" w:w="6560"/>
+            <w:tcMar>
+              <w:top w:type="dxa" w:w="60"/>
+              <w:left w:type="dxa" w:w="100"/>
+              <w:bottom w:type="dxa" w:w="60"/>
+              <w:right w:type="dxa" w:w="100"/>
+            </w:tcMar>
+            <w:vAlign w:val="center"/>
+          </w:tcPr>
+          <w:p>
+            <w:pPr>
+              <w:spacing w:line="240"/>
+            </w:pPr>
+            <w:r>
+              <w:rPr>
+                <w:rFonts w:ascii="Arial" w:cs="Arial" w:eastAsia="Arial" w:hAnsi="Arial"/>
+                <w:b w:val="false"/>
+                <w:bCs w:val="false"/>
+                <w:color w:val="243238"/>
+                <w:sz w:val="18"/>
+                <w:szCs w:val="18"/>
+              </w:rPr>
+              <w:t xml:space="preserve">PV, notice et photos partagés ; SAV qualifié sous 48h ouvrées.</w:t>
             </w:r>
           </w:p>
         </w:tc>
@@ -8856,6 +9923,52 @@
       <w:pPr>
         <w:spacing w:after="80"/>
       </w:pPr>
+    </w:p>
+    <w:p>
+      <w:pPr>
+        <w:spacing w:after="120" w:before="80"/>
+        <w:jc w:val="center"/>
+      </w:pPr>
+      <w:r>
+        <w:drawing>
+          <wp:inline distT="0" distB="0" distL="0" distR="0">
+            <wp:extent cx="5715000" cy="7324725"/>
+            <wp:effectExtent t="0" r="0" b="0" l="0"/>
+            <wp:docPr id="1" name="" descr="" title=""/>
+            <wp:cNvGraphicFramePr>
+              <a:graphicFrameLocks xmlns:a="http://schemas.openxmlformats.org/drawingml/2006/main" noChangeAspect="1"/>
+            </wp:cNvGraphicFramePr>
+            <a:graphic xmlns:a="http://schemas.openxmlformats.org/drawingml/2006/main">
+              <a:graphicData uri="http://schemas.openxmlformats.org/drawingml/2006/picture">
+                <pic:pic xmlns:pic="http://schemas.openxmlformats.org/drawingml/2006/picture">
+                  <pic:nvPicPr>
+                    <pic:cNvPr id="0" name="" descr=""/>
+                    <pic:cNvPicPr>
+                      <a:picLocks noChangeAspect="1" noChangeArrowheads="1"/>
+                    </pic:cNvPicPr>
+                  </pic:nvPicPr>
+                  <pic:blipFill>
+                    <a:blip r:embed="rId15" cstate="none"/>
+                    <a:srcRect/>
+                    <a:stretch>
+                      <a:fillRect/>
+                    </a:stretch>
+                  </pic:blipFill>
+                  <pic:spPr bwMode="auto">
+                    <a:xfrm>
+                      <a:off x="0" y="0"/>
+                      <a:ext cx="5715000" cy="7324725"/>
+                    </a:xfrm>
+                    <a:prstGeom prst="rect">
+                      <a:avLst/>
+                    </a:prstGeom>
+                  </pic:spPr>
+                </pic:pic>
+              </a:graphicData>
+            </a:graphic>
+          </wp:inline>
+        </w:drawing>
+      </w:r>
     </w:p>
     <w:p>
       <w:pPr>
@@ -9397,7 +10510,7 @@
                 <w:sz w:val="18"/>
                 <w:szCs w:val="18"/>
               </w:rPr>
-              <w:t xml:space="preserve">Qualification sous 48 h ouvrées, historique et preuve de clôture dans INTERFAST.</w:t>
+              <w:t xml:space="preserve">Qualification sous 48h ouvrées, historique et preuve de clôture dans INTERFAST.</w:t>
             </w:r>
           </w:p>
         </w:tc>
@@ -9423,183 +10536,6 @@
           <w:szCs w:val="22"/>
         </w:rPr>
         <w:t xml:space="preserve">Les garanties</w:t>
-      </w:r>
-    </w:p>
-    <w:p>
-      <w:pPr>
-        <w:pStyle w:val="ListParagraph"/>
-        <w:numPr>
-          <w:ilvl w:val="0"/>
-          <w:numId w:val="2"/>
-        </w:numPr>
-        <w:spacing w:after="60" w:line="252"/>
-        <w:jc w:val="both"/>
-      </w:pPr>
-      <w:r>
-        <w:rPr>
-          <w:rFonts w:ascii="Arial" w:cs="Arial" w:eastAsia="Arial" w:hAnsi="Arial"/>
-          <w:color w:val="243238"/>
-          <w:sz w:val="19"/>
-          <w:szCs w:val="19"/>
-        </w:rPr>
-        <w:t xml:space="preserve">Garantie de parfait achèvement (article 1792-6 du Code civil) : tous les désordres signalés à la réception ou dans l’année qui suit sont repris à nos frais ;</w:t>
-      </w:r>
-    </w:p>
-    <w:p>
-      <w:pPr>
-        <w:pStyle w:val="ListParagraph"/>
-        <w:numPr>
-          <w:ilvl w:val="0"/>
-          <w:numId w:val="2"/>
-        </w:numPr>
-        <w:spacing w:after="60" w:line="252"/>
-        <w:jc w:val="both"/>
-      </w:pPr>
-      <w:r>
-        <w:rPr>
-          <w:rFonts w:ascii="Arial" w:cs="Arial" w:eastAsia="Arial" w:hAnsi="Arial"/>
-          <w:color w:val="243238"/>
-          <w:sz w:val="19"/>
-          <w:szCs w:val="19"/>
-        </w:rPr>
-        <w:t xml:space="preserve">Garantie décennale : assurance responsabilité civile et décennale plomberie / sanitaire et maintenance en cours de validité (attestations jointes) ;</w:t>
-      </w:r>
-    </w:p>
-    <w:p>
-      <w:pPr>
-        <w:pStyle w:val="ListParagraph"/>
-        <w:numPr>
-          <w:ilvl w:val="0"/>
-          <w:numId w:val="2"/>
-        </w:numPr>
-        <w:spacing w:after="60" w:line="252"/>
-        <w:jc w:val="both"/>
-      </w:pPr>
-      <w:r>
-        <w:rPr>
-          <w:rFonts w:ascii="Arial" w:cs="Arial" w:eastAsia="Arial" w:hAnsi="Arial"/>
-          <w:color w:val="243238"/>
-          <w:sz w:val="19"/>
-          <w:szCs w:val="19"/>
-        </w:rPr>
-        <w:t xml:space="preserve">Garanties fabricant sur les produits posés (panneaux, receveurs, robinetterie, parois) selon les fiches en vigueur ;</w:t>
-      </w:r>
-    </w:p>
-    <w:p>
-      <w:pPr>
-        <w:pStyle w:val="ListParagraph"/>
-        <w:numPr>
-          <w:ilvl w:val="0"/>
-          <w:numId w:val="2"/>
-        </w:numPr>
-        <w:spacing w:after="60" w:line="252"/>
-        <w:jc w:val="both"/>
-      </w:pPr>
-      <w:r>
-        <w:rPr>
-          <w:rFonts w:ascii="Arial" w:cs="Arial" w:eastAsia="Arial" w:hAnsi="Arial"/>
-          <w:color w:val="243238"/>
-          <w:sz w:val="19"/>
-          <w:szCs w:val="19"/>
-        </w:rPr>
-        <w:t xml:space="preserve">Modularité des systèmes posés : possibilité de remplacer uniquement la pièce défectueuse, sans changer l’ensemble de la cabine — une maintenance simplifiée, économique et durable.</w:t>
-      </w:r>
-    </w:p>
-    <w:p>
-      <w:pPr>
-        <w:pStyle w:val="Heading2"/>
-        <w:spacing w:after="100" w:before="200"/>
-      </w:pPr>
-      <w:r>
-        <w:rPr>
-          <w:rFonts w:ascii="Arial" w:cs="Arial" w:eastAsia="Arial" w:hAnsi="Arial"/>
-          <w:b/>
-          <w:bCs/>
-          <w:color w:val="0F6470"/>
-          <w:sz w:val="22"/>
-          <w:szCs w:val="22"/>
-        </w:rPr>
-        <w:t xml:space="preserve">Le circuit SAV</w:t>
-      </w:r>
-    </w:p>
-    <w:p>
-      <w:pPr>
-        <w:pStyle w:val="ListParagraph"/>
-        <w:numPr>
-          <w:ilvl w:val="0"/>
-          <w:numId w:val="6"/>
-        </w:numPr>
-        <w:spacing w:after="60" w:line="252"/>
-        <w:jc w:val="both"/>
-      </w:pPr>
-      <w:r>
-        <w:rPr>
-          <w:rFonts w:ascii="Arial" w:cs="Arial" w:eastAsia="Arial" w:hAnsi="Arial"/>
-          <w:color w:val="243238"/>
-          <w:sz w:val="19"/>
-          <w:szCs w:val="19"/>
-        </w:rPr>
-        <w:t xml:space="preserve">Signalement par le locataire ou le bailleur, enregistré dans INTERFAST ;</w:t>
-      </w:r>
-    </w:p>
-    <w:p>
-      <w:pPr>
-        <w:pStyle w:val="ListParagraph"/>
-        <w:numPr>
-          <w:ilvl w:val="0"/>
-          <w:numId w:val="6"/>
-        </w:numPr>
-        <w:spacing w:after="60" w:line="252"/>
-        <w:jc w:val="both"/>
-      </w:pPr>
-      <w:r>
-        <w:rPr>
-          <w:rFonts w:ascii="Arial" w:cs="Arial" w:eastAsia="Arial" w:hAnsi="Arial"/>
-          <w:color w:val="243238"/>
-          <w:sz w:val="19"/>
-          <w:szCs w:val="19"/>
-        </w:rPr>
-        <w:t xml:space="preserve">Pré-diagnostic sous 48 h ouvrées, avec demande de photos si nécessaire ;</w:t>
-      </w:r>
-    </w:p>
-    <w:p>
-      <w:pPr>
-        <w:pStyle w:val="ListParagraph"/>
-        <w:numPr>
-          <w:ilvl w:val="0"/>
-          <w:numId w:val="6"/>
-        </w:numPr>
-        <w:spacing w:after="60" w:line="252"/>
-        <w:jc w:val="both"/>
-      </w:pPr>
-      <w:r>
-        <w:rPr>
-          <w:rFonts w:ascii="Arial" w:cs="Arial" w:eastAsia="Arial" w:hAnsi="Arial"/>
-          <w:color w:val="243238"/>
-          <w:sz w:val="19"/>
-          <w:szCs w:val="19"/>
-        </w:rPr>
-        <w:t xml:space="preserve">Intervention planifiée avec le locataire par un poseur qualifié ;</w:t>
-      </w:r>
-    </w:p>
-    <w:p>
-      <w:pPr>
-        <w:pStyle w:val="ListParagraph"/>
-        <w:numPr>
-          <w:ilvl w:val="0"/>
-          <w:numId w:val="6"/>
-        </w:numPr>
-        <w:spacing w:after="60" w:line="252"/>
-        <w:jc w:val="both"/>
-      </w:pPr>
-      <w:r>
-        <w:rPr>
-          <w:rFonts w:ascii="Arial" w:cs="Arial" w:eastAsia="Arial" w:hAnsi="Arial"/>
-          <w:color w:val="243238"/>
-          <w:sz w:val="19"/>
-          <w:szCs w:val="19"/>
-        </w:rPr>
-        <w:t xml:space="preserve">Clôture documentée : action réalisée, délai et preuve enregistrés, visibles par le bailleur.</w:t>
       </w:r>
     </w:p>
     <w:tbl>
@@ -9643,6 +10579,334 @@
                 <w:sz w:val="19"/>
                 <w:szCs w:val="19"/>
               </w:rPr>
+              <w:t xml:space="preserve">GARANTIE PRODUIT 10 ANS  </w:t>
+            </w:r>
+            <w:r>
+              <w:rPr>
+                <w:rFonts w:ascii="Arial" w:cs="Arial" w:eastAsia="Arial" w:hAnsi="Arial"/>
+                <w:color w:val="243238"/>
+                <w:sz w:val="19"/>
+                <w:szCs w:val="19"/>
+              </w:rPr>
+              <w:t xml:space="preserve">Tous nos produits sont garantis 10 ans : qualité des matériaux, fabrication et performances des équipements sanitaires. Une réclamation SAV ne se discute pas — elle se traite.</w:t>
+            </w:r>
+          </w:p>
+        </w:tc>
+      </w:tr>
+    </w:tbl>
+    <w:p>
+      <w:pPr>
+        <w:spacing w:after="80"/>
+      </w:pPr>
+    </w:p>
+    <w:p>
+      <w:pPr>
+        <w:spacing w:after="120" w:line="264"/>
+        <w:jc w:val="both"/>
+      </w:pPr>
+      <w:r>
+        <w:rPr>
+          <w:rFonts w:ascii="Arial" w:cs="Arial" w:eastAsia="Arial" w:hAnsi="Arial"/>
+          <w:color w:val="243238"/>
+          <w:sz w:val="19"/>
+          <w:szCs w:val="19"/>
+        </w:rPr>
+        <w:t xml:space="preserve">Cette garantie de 10 ans couvre notamment :</w:t>
+      </w:r>
+    </w:p>
+    <w:p>
+      <w:pPr>
+        <w:pStyle w:val="ListParagraph"/>
+        <w:numPr>
+          <w:ilvl w:val="0"/>
+          <w:numId w:val="2"/>
+        </w:numPr>
+        <w:spacing w:after="60" w:line="252"/>
+        <w:jc w:val="both"/>
+      </w:pPr>
+      <w:r>
+        <w:rPr>
+          <w:rFonts w:ascii="Arial" w:cs="Arial" w:eastAsia="Arial" w:hAnsi="Arial"/>
+          <w:color w:val="243238"/>
+          <w:sz w:val="19"/>
+          <w:szCs w:val="19"/>
+        </w:rPr>
+        <w:t xml:space="preserve">La garantie légale de conformité : réparation, remplacement ou remboursement des éléments non conformes ;</w:t>
+      </w:r>
+    </w:p>
+    <w:p>
+      <w:pPr>
+        <w:pStyle w:val="ListParagraph"/>
+        <w:numPr>
+          <w:ilvl w:val="0"/>
+          <w:numId w:val="2"/>
+        </w:numPr>
+        <w:spacing w:after="60" w:line="252"/>
+        <w:jc w:val="both"/>
+      </w:pPr>
+      <w:r>
+        <w:rPr>
+          <w:rFonts w:ascii="Arial" w:cs="Arial" w:eastAsia="Arial" w:hAnsi="Arial"/>
+          <w:color w:val="243238"/>
+          <w:sz w:val="19"/>
+          <w:szCs w:val="19"/>
+        </w:rPr>
+        <w:t xml:space="preserve">La garantie des matériaux : délamination, fissures ou décoloration prématurée des panneaux ;</w:t>
+      </w:r>
+    </w:p>
+    <w:p>
+      <w:pPr>
+        <w:pStyle w:val="ListParagraph"/>
+        <w:numPr>
+          <w:ilvl w:val="0"/>
+          <w:numId w:val="2"/>
+        </w:numPr>
+        <w:spacing w:after="60" w:line="252"/>
+        <w:jc w:val="both"/>
+      </w:pPr>
+      <w:r>
+        <w:rPr>
+          <w:rFonts w:ascii="Arial" w:cs="Arial" w:eastAsia="Arial" w:hAnsi="Arial"/>
+          <w:color w:val="243238"/>
+          <w:sz w:val="19"/>
+          <w:szCs w:val="19"/>
+        </w:rPr>
+        <w:t xml:space="preserve">La garantie fabricant : défauts de fabrication, fuites et durabilité des finitions (chrome, inox) ;</w:t>
+      </w:r>
+    </w:p>
+    <w:p>
+      <w:pPr>
+        <w:pStyle w:val="ListParagraph"/>
+        <w:numPr>
+          <w:ilvl w:val="0"/>
+          <w:numId w:val="2"/>
+        </w:numPr>
+        <w:spacing w:after="60" w:line="252"/>
+        <w:jc w:val="both"/>
+      </w:pPr>
+      <w:r>
+        <w:rPr>
+          <w:rFonts w:ascii="Arial" w:cs="Arial" w:eastAsia="Arial" w:hAnsi="Arial"/>
+          <w:color w:val="243238"/>
+          <w:sz w:val="19"/>
+          <w:szCs w:val="19"/>
+        </w:rPr>
+        <w:t xml:space="preserve">La garantie de performance : respect des normes et certifications (débit d’eau, résistance à la pression, NF, CE).</w:t>
+      </w:r>
+    </w:p>
+    <w:p>
+      <w:pPr>
+        <w:spacing w:after="120" w:line="264"/>
+        <w:jc w:val="both"/>
+      </w:pPr>
+      <w:r>
+        <w:rPr>
+          <w:rFonts w:ascii="Arial" w:cs="Arial" w:eastAsia="Arial" w:hAnsi="Arial"/>
+          <w:color w:val="243238"/>
+          <w:sz w:val="19"/>
+          <w:szCs w:val="19"/>
+        </w:rPr>
+        <w:t xml:space="preserve">S’y ajoutent les garanties légales de l’entreprise :</w:t>
+      </w:r>
+    </w:p>
+    <w:p>
+      <w:pPr>
+        <w:pStyle w:val="ListParagraph"/>
+        <w:numPr>
+          <w:ilvl w:val="0"/>
+          <w:numId w:val="2"/>
+        </w:numPr>
+        <w:spacing w:after="60" w:line="252"/>
+        <w:jc w:val="both"/>
+      </w:pPr>
+      <w:r>
+        <w:rPr>
+          <w:rFonts w:ascii="Arial" w:cs="Arial" w:eastAsia="Arial" w:hAnsi="Arial"/>
+          <w:color w:val="243238"/>
+          <w:sz w:val="19"/>
+          <w:szCs w:val="19"/>
+        </w:rPr>
+        <w:t xml:space="preserve">Garantie de parfait achèvement (article 1792-6 du Code civil) : tous les désordres signalés à la réception ou dans l’année qui suit sont repris à nos frais ;</w:t>
+      </w:r>
+    </w:p>
+    <w:p>
+      <w:pPr>
+        <w:pStyle w:val="ListParagraph"/>
+        <w:numPr>
+          <w:ilvl w:val="0"/>
+          <w:numId w:val="2"/>
+        </w:numPr>
+        <w:spacing w:after="60" w:line="252"/>
+        <w:jc w:val="both"/>
+      </w:pPr>
+      <w:r>
+        <w:rPr>
+          <w:rFonts w:ascii="Arial" w:cs="Arial" w:eastAsia="Arial" w:hAnsi="Arial"/>
+          <w:color w:val="243238"/>
+          <w:sz w:val="19"/>
+          <w:szCs w:val="19"/>
+        </w:rPr>
+        <w:t xml:space="preserve">Garantie décennale : assurance responsabilité civile et décennale plomberie / sanitaire et maintenance en cours de validité ;</w:t>
+      </w:r>
+    </w:p>
+    <w:p>
+      <w:pPr>
+        <w:pStyle w:val="ListParagraph"/>
+        <w:numPr>
+          <w:ilvl w:val="0"/>
+          <w:numId w:val="2"/>
+        </w:numPr>
+        <w:spacing w:after="60" w:line="252"/>
+        <w:jc w:val="both"/>
+      </w:pPr>
+      <w:r>
+        <w:rPr>
+          <w:rFonts w:ascii="Arial" w:cs="Arial" w:eastAsia="Arial" w:hAnsi="Arial"/>
+          <w:color w:val="243238"/>
+          <w:sz w:val="19"/>
+          <w:szCs w:val="19"/>
+        </w:rPr>
+        <w:t xml:space="preserve">Modularité des systèmes posés : possibilité de remplacer uniquement la pièce défectueuse, sans changer l’ensemble de la cabine — une maintenance simplifiée, économique et durable.</w:t>
+      </w:r>
+    </w:p>
+    <w:p>
+      <w:pPr>
+        <w:pStyle w:val="Heading2"/>
+        <w:spacing w:after="100" w:before="200"/>
+      </w:pPr>
+      <w:r>
+        <w:rPr>
+          <w:rFonts w:ascii="Arial" w:cs="Arial" w:eastAsia="Arial" w:hAnsi="Arial"/>
+          <w:b/>
+          <w:bCs/>
+          <w:color w:val="0F6470"/>
+          <w:sz w:val="22"/>
+          <w:szCs w:val="22"/>
+        </w:rPr>
+        <w:t xml:space="preserve">Le circuit SAV</w:t>
+      </w:r>
+    </w:p>
+    <w:p>
+      <w:pPr>
+        <w:pStyle w:val="ListParagraph"/>
+        <w:numPr>
+          <w:ilvl w:val="0"/>
+          <w:numId w:val="6"/>
+        </w:numPr>
+        <w:spacing w:after="60" w:line="252"/>
+        <w:jc w:val="both"/>
+      </w:pPr>
+      <w:r>
+        <w:rPr>
+          <w:rFonts w:ascii="Arial" w:cs="Arial" w:eastAsia="Arial" w:hAnsi="Arial"/>
+          <w:color w:val="243238"/>
+          <w:sz w:val="19"/>
+          <w:szCs w:val="19"/>
+        </w:rPr>
+        <w:t xml:space="preserve">Signalement par le locataire ou le bailleur, enregistré dans INTERFAST ;</w:t>
+      </w:r>
+    </w:p>
+    <w:p>
+      <w:pPr>
+        <w:pStyle w:val="ListParagraph"/>
+        <w:numPr>
+          <w:ilvl w:val="0"/>
+          <w:numId w:val="6"/>
+        </w:numPr>
+        <w:spacing w:after="60" w:line="252"/>
+        <w:jc w:val="both"/>
+      </w:pPr>
+      <w:r>
+        <w:rPr>
+          <w:rFonts w:ascii="Arial" w:cs="Arial" w:eastAsia="Arial" w:hAnsi="Arial"/>
+          <w:color w:val="243238"/>
+          <w:sz w:val="19"/>
+          <w:szCs w:val="19"/>
+        </w:rPr>
+        <w:t xml:space="preserve">Pré-diagnostic sous 48h ouvrées, avec demande de photos si nécessaire ;</w:t>
+      </w:r>
+    </w:p>
+    <w:p>
+      <w:pPr>
+        <w:pStyle w:val="ListParagraph"/>
+        <w:numPr>
+          <w:ilvl w:val="0"/>
+          <w:numId w:val="6"/>
+        </w:numPr>
+        <w:spacing w:after="60" w:line="252"/>
+        <w:jc w:val="both"/>
+      </w:pPr>
+      <w:r>
+        <w:rPr>
+          <w:rFonts w:ascii="Arial" w:cs="Arial" w:eastAsia="Arial" w:hAnsi="Arial"/>
+          <w:color w:val="243238"/>
+          <w:sz w:val="19"/>
+          <w:szCs w:val="19"/>
+        </w:rPr>
+        <w:t xml:space="preserve">Intervention planifiée avec le locataire par un poseur qualifié ;</w:t>
+      </w:r>
+    </w:p>
+    <w:p>
+      <w:pPr>
+        <w:pStyle w:val="ListParagraph"/>
+        <w:numPr>
+          <w:ilvl w:val="0"/>
+          <w:numId w:val="6"/>
+        </w:numPr>
+        <w:spacing w:after="60" w:line="252"/>
+        <w:jc w:val="both"/>
+      </w:pPr>
+      <w:r>
+        <w:rPr>
+          <w:rFonts w:ascii="Arial" w:cs="Arial" w:eastAsia="Arial" w:hAnsi="Arial"/>
+          <w:color w:val="243238"/>
+          <w:sz w:val="19"/>
+          <w:szCs w:val="19"/>
+        </w:rPr>
+        <w:t xml:space="preserve">Clôture documentée : action réalisée, délai et preuve enregistrés, visibles par le bailleur.</w:t>
+      </w:r>
+    </w:p>
+    <w:tbl>
+      <w:tblPr>
+        <w:tblW w:type="dxa" w:w="9360"/>
+        <w:tblBorders>
+          <w:top w:val="none"/>
+          <w:left w:val="single" w:color="0F6470" w:sz="24"/>
+          <w:bottom w:val="none"/>
+          <w:right w:val="none"/>
+          <w:insideH w:val="none"/>
+          <w:insideV w:val="none"/>
+        </w:tblBorders>
+      </w:tblPr>
+      <w:tblGrid>
+        <w:gridCol w:w="9360"/>
+      </w:tblGrid>
+      <w:tr>
+        <w:tc>
+          <w:tcPr>
+            <w:tcW w:type="dxa" w:w="9360"/>
+            <w:shd w:fill="EAF2F3" w:val="clear"/>
+            <w:tcMar>
+              <w:top w:type="dxa" w:w="90"/>
+              <w:left w:type="dxa" w:w="140"/>
+              <w:bottom w:type="dxa" w:w="90"/>
+              <w:right w:type="dxa" w:w="140"/>
+            </w:tcMar>
+          </w:tcPr>
+          <w:p>
+            <w:pPr>
+              <w:spacing w:line="252"/>
+              <w:jc w:val="both"/>
+            </w:pPr>
+            <w:r>
+              <w:rPr>
+                <w:rFonts w:ascii="Arial" w:cs="Arial" w:eastAsia="Arial" w:hAnsi="Arial"/>
+                <w:b/>
+                <w:bCs/>
+                <w:color w:val="073E47"/>
+                <w:sz w:val="19"/>
+                <w:szCs w:val="19"/>
+              </w:rPr>
               <w:t xml:space="preserve">PROXIMITÉ SAV  </w:t>
             </w:r>
             <w:r>
@@ -9772,7 +11036,7 @@
           <w:sz w:val="19"/>
           <w:szCs w:val="19"/>
         </w:rPr>
-        <w:t xml:space="preserve">Nos équipes utilisent systématiquement les équipements de protection individuelle (EPI) adaptés à chaque poste. Tous les EPI sont régulièrement inspectés et maintenus en bon état. Notre plan de prévention des risques et un extrait de notre DUER sont disponibles à la demande.</w:t>
+        <w:t xml:space="preserve">Nos équipes utilisent systématiquement les équipements de protection individuelle (EPI) adaptés à chaque poste. Tous les EPI sont régulièrement inspectés et maintenus en bon état. L’ensemble des risques de nos activités est évalué et référencé dans notre DUERP (document unique d’évaluation des risques professionnels), dont un extrait est disponible à la demande, ainsi que notre plan de prévention.</w:t>
       </w:r>
     </w:p>
     <w:p>
@@ -9804,8 +11068,69 @@
           <w:sz w:val="19"/>
           <w:szCs w:val="19"/>
         </w:rPr>
-        <w:t xml:space="preserve">Avant toute intervention susceptible d’affecter un matériau, l’équipe consulte les diagnostics et repérages avant travaux applicables. En présence d’un risque, ADOM SENIOR applique son mode opératoire SS4 : évaluation, processus adapté, protections, réduction de l’empoussièrement, décontamination, gestion des déchets et traçabilité complète.</w:t>
-      </w:r>
+        <w:t xml:space="preserve">Avant toute intervention susceptible d’affecter un matériau, l’équipe consulte les diagnostics et repérages avant travaux applicables. En présence d’un risque, ADOM SENIOR applique ses modes opératoires SS4 : évaluation, processus adapté, protections, réduction de l’empoussièrement, décontamination, gestion des déchets et traçabilité complète.</w:t>
+      </w:r>
+    </w:p>
+    <w:tbl>
+      <w:tblPr>
+        <w:tblW w:type="dxa" w:w="9360"/>
+        <w:tblBorders>
+          <w:top w:val="none"/>
+          <w:left w:val="single" w:color="0F6470" w:sz="24"/>
+          <w:bottom w:val="none"/>
+          <w:right w:val="none"/>
+          <w:insideH w:val="none"/>
+          <w:insideV w:val="none"/>
+        </w:tblBorders>
+      </w:tblPr>
+      <w:tblGrid>
+        <w:gridCol w:w="9360"/>
+      </w:tblGrid>
+      <w:tr>
+        <w:tc>
+          <w:tcPr>
+            <w:tcW w:type="dxa" w:w="9360"/>
+            <w:shd w:fill="EAF2F3" w:val="clear"/>
+            <w:tcMar>
+              <w:top w:type="dxa" w:w="90"/>
+              <w:left w:type="dxa" w:w="140"/>
+              <w:bottom w:type="dxa" w:w="90"/>
+              <w:right w:type="dxa" w:w="140"/>
+            </w:tcMar>
+          </w:tcPr>
+          <w:p>
+            <w:pPr>
+              <w:spacing w:line="252"/>
+              <w:jc w:val="both"/>
+            </w:pPr>
+            <w:r>
+              <w:rPr>
+                <w:rFonts w:ascii="Arial" w:cs="Arial" w:eastAsia="Arial" w:hAnsi="Arial"/>
+                <w:b/>
+                <w:bCs/>
+                <w:color w:val="073E47"/>
+                <w:sz w:val="19"/>
+                <w:szCs w:val="19"/>
+              </w:rPr>
+              <w:t xml:space="preserve">6 MODES OPÉRATOIRES SS4  </w:t>
+            </w:r>
+            <w:r>
+              <w:rPr>
+                <w:rFonts w:ascii="Arial" w:cs="Arial" w:eastAsia="Arial" w:hAnsi="Arial"/>
+                <w:color w:val="243238"/>
+                <w:sz w:val="19"/>
+                <w:szCs w:val="19"/>
+              </w:rPr>
+              <w:t xml:space="preserve">Six modes opératoires SS4 sont aujourd’hui rédigés et couvrent l’ensemble de nos prestations. Ils sont, au besoin, validés par des mesures d’empoussièrement. L’ensemble est référencé dans notre DUERP, dont un extrait est disponible à la demande.</w:t>
+            </w:r>
+          </w:p>
+        </w:tc>
+      </w:tr>
+    </w:tbl>
+    <w:p>
+      <w:pPr>
+        <w:spacing w:after="80"/>
+      </w:pPr>
     </w:p>
     <w:tbl>
       <w:tblPr>
@@ -9997,7 +11322,65 @@
                 <w:sz w:val="18"/>
                 <w:szCs w:val="18"/>
               </w:rPr>
-              <w:t xml:space="preserve">Interventions supervisées par Loyk Duporge, encadrant technique et chantier SS4 ; opérateurs formés SS4 (attestations à jour en annexe).</w:t>
+              <w:t xml:space="preserve">Interventions supervisées par Loyk Duporge, encadrant technique SS4 ; opérateurs formés SS4.</w:t>
+            </w:r>
+          </w:p>
+        </w:tc>
+      </w:tr>
+      <w:tr>
+        <w:tc>
+          <w:tcPr>
+            <w:tcW w:type="dxa" w:w="2600"/>
+            <w:tcMar>
+              <w:top w:type="dxa" w:w="60"/>
+              <w:left w:type="dxa" w:w="100"/>
+              <w:bottom w:type="dxa" w:w="60"/>
+              <w:right w:type="dxa" w:w="100"/>
+            </w:tcMar>
+            <w:vAlign w:val="center"/>
+          </w:tcPr>
+          <w:p>
+            <w:pPr>
+              <w:spacing w:line="240"/>
+            </w:pPr>
+            <w:r>
+              <w:rPr>
+                <w:rFonts w:ascii="Arial" w:cs="Arial" w:eastAsia="Arial" w:hAnsi="Arial"/>
+                <w:b/>
+                <w:bCs/>
+                <w:color w:val="243238"/>
+                <w:sz w:val="18"/>
+                <w:szCs w:val="18"/>
+              </w:rPr>
+              <w:t xml:space="preserve">Modes opératoires</w:t>
+            </w:r>
+          </w:p>
+        </w:tc>
+        <w:tc>
+          <w:tcPr>
+            <w:tcW w:type="dxa" w:w="6760"/>
+            <w:tcMar>
+              <w:top w:type="dxa" w:w="60"/>
+              <w:left w:type="dxa" w:w="100"/>
+              <w:bottom w:type="dxa" w:w="60"/>
+              <w:right w:type="dxa" w:w="100"/>
+            </w:tcMar>
+            <w:vAlign w:val="center"/>
+          </w:tcPr>
+          <w:p>
+            <w:pPr>
+              <w:spacing w:line="240"/>
+            </w:pPr>
+            <w:r>
+              <w:rPr>
+                <w:rFonts w:ascii="Arial" w:cs="Arial" w:eastAsia="Arial" w:hAnsi="Arial"/>
+                <w:b w:val="false"/>
+                <w:bCs w:val="false"/>
+                <w:color w:val="243238"/>
+                <w:sz w:val="18"/>
+                <w:szCs w:val="18"/>
+              </w:rPr>
+              <w:t xml:space="preserve">Six modes opératoires couvrant l’ensemble des prestations, validés au besoin par des mesures d’empoussièrement et référencés dans le DUERP.</w:t>
             </w:r>
           </w:p>
         </w:tc>
@@ -10712,7 +12095,7 @@
           <w:sz w:val="22"/>
           <w:szCs w:val="22"/>
         </w:rPr>
-        <w:t xml:space="preserve">Nos principes</w:t>
+        <w:t xml:space="preserve">Nos principes : tri systématique, revalorisation chaque fois que possible</w:t>
       </w:r>
     </w:p>
     <w:p>
@@ -10733,6 +12116,26 @@
           <w:szCs w:val="19"/>
         </w:rPr>
         <w:t xml:space="preserve">Tri sélectif systématique sur site, dès la dépose ;</w:t>
+      </w:r>
+    </w:p>
+    <w:p>
+      <w:pPr>
+        <w:pStyle w:val="ListParagraph"/>
+        <w:numPr>
+          <w:ilvl w:val="0"/>
+          <w:numId w:val="2"/>
+        </w:numPr>
+        <w:spacing w:after="60" w:line="252"/>
+        <w:jc w:val="both"/>
+      </w:pPr>
+      <w:r>
+        <w:rPr>
+          <w:rFonts w:ascii="Arial" w:cs="Arial" w:eastAsia="Arial" w:hAnsi="Arial"/>
+          <w:color w:val="243238"/>
+          <w:sz w:val="19"/>
+          <w:szCs w:val="19"/>
+        </w:rPr>
+        <w:t xml:space="preserve">Revalorisation des matériaux chaque fois que la filière existe : métaux, cartons, plastiques et sanitaires orientés vers le recyclage plutôt que l’enfouissement ;</w:t>
       </w:r>
     </w:p>
     <w:p>
@@ -10994,7 +12397,7 @@
           <w:sz w:val="19"/>
           <w:szCs w:val="19"/>
         </w:rPr>
-        <w:t xml:space="preserve">Tri et valorisation des déchets sur chaque chantier (voir section 10).</w:t>
+        <w:t xml:space="preserve">Tri systématique des déchets sur chaque chantier et revalorisation chaque fois que possible (voir section 10).</w:t>
       </w:r>
     </w:p>
     <w:p>
@@ -11491,7 +12894,7 @@
                 <w:sz w:val="18"/>
                 <w:szCs w:val="18"/>
               </w:rPr>
-              <w:t xml:space="preserve">A1–A2</w:t>
+              <w:t xml:space="preserve">A1</w:t>
             </w:r>
           </w:p>
         </w:tc>
@@ -11519,7 +12922,7 @@
                 <w:sz w:val="18"/>
                 <w:szCs w:val="18"/>
               </w:rPr>
-              <w:t xml:space="preserve">Attestations de formation opérateur et encadrant SS4.</w:t>
+              <w:t xml:space="preserve">Dossier VISAP trois volets — reproduit dans ce document.</w:t>
             </w:r>
           </w:p>
         </w:tc>
@@ -11549,7 +12952,7 @@
                 <w:sz w:val="18"/>
                 <w:szCs w:val="18"/>
               </w:rPr>
-              <w:t xml:space="preserve">A3–A4</w:t>
+              <w:t xml:space="preserve">A2</w:t>
             </w:r>
           </w:p>
         </w:tc>
@@ -11577,7 +12980,7 @@
                 <w:sz w:val="18"/>
                 <w:szCs w:val="18"/>
               </w:rPr>
-              <w:t xml:space="preserve">Dossier VISAP trois volets — extraits opérationnels.</w:t>
+              <w:t xml:space="preserve">Procès-verbal de réception ADOM SENIOR — reproduit dans ce document.</w:t>
             </w:r>
           </w:p>
         </w:tc>
@@ -11607,7 +13010,7 @@
                 <w:sz w:val="18"/>
                 <w:szCs w:val="18"/>
               </w:rPr>
-              <w:t xml:space="preserve">A5</w:t>
+              <w:t xml:space="preserve">A3</w:t>
             </w:r>
           </w:p>
         </w:tc>
@@ -11635,7 +13038,7 @@
                 <w:sz w:val="18"/>
                 <w:szCs w:val="18"/>
               </w:rPr>
-              <w:t xml:space="preserve">Procès-verbal de réception ADOM SENIOR.</w:t>
+              <w:t xml:space="preserve">Notice d’utilisation et d’entretien de la douche — reproduite dans ce document.</w:t>
             </w:r>
           </w:p>
         </w:tc>
@@ -11665,7 +13068,7 @@
                 <w:sz w:val="18"/>
                 <w:szCs w:val="18"/>
               </w:rPr>
-              <w:t xml:space="preserve">A6–A7</w:t>
+              <w:t xml:space="preserve">A4</w:t>
             </w:r>
           </w:p>
         </w:tc>
@@ -11693,7 +13096,7 @@
                 <w:sz w:val="18"/>
                 <w:szCs w:val="18"/>
               </w:rPr>
-              <w:t xml:space="preserve">Notice d’utilisation et d’entretien de la douche.</w:t>
+              <w:t xml:space="preserve">Attestations de formation opérateur et encadrant SS4 — fournies avec le dossier de candidature.</w:t>
             </w:r>
           </w:p>
         </w:tc>
@@ -11723,7 +13126,7 @@
                 <w:sz w:val="18"/>
                 <w:szCs w:val="18"/>
               </w:rPr>
-              <w:t xml:space="preserve">A8</w:t>
+              <w:t xml:space="preserve">A5</w:t>
             </w:r>
           </w:p>
         </w:tc>
@@ -11751,6 +13154,64 @@
                 <w:sz w:val="18"/>
                 <w:szCs w:val="18"/>
               </w:rPr>
+              <w:t xml:space="preserve">Modes opératoires SS4 et extrait du DUERP — disponibles à la demande.</w:t>
+            </w:r>
+          </w:p>
+        </w:tc>
+      </w:tr>
+      <w:tr>
+        <w:tc>
+          <w:tcPr>
+            <w:tcW w:type="dxa" w:w="1800"/>
+            <w:tcMar>
+              <w:top w:type="dxa" w:w="60"/>
+              <w:left w:type="dxa" w:w="100"/>
+              <w:bottom w:type="dxa" w:w="60"/>
+              <w:right w:type="dxa" w:w="100"/>
+            </w:tcMar>
+            <w:vAlign w:val="center"/>
+          </w:tcPr>
+          <w:p>
+            <w:pPr>
+              <w:spacing w:line="240"/>
+            </w:pPr>
+            <w:r>
+              <w:rPr>
+                <w:rFonts w:ascii="Arial" w:cs="Arial" w:eastAsia="Arial" w:hAnsi="Arial"/>
+                <w:b/>
+                <w:bCs/>
+                <w:color w:val="243238"/>
+                <w:sz w:val="18"/>
+                <w:szCs w:val="18"/>
+              </w:rPr>
+              <w:t xml:space="preserve">A6</w:t>
+            </w:r>
+          </w:p>
+        </w:tc>
+        <w:tc>
+          <w:tcPr>
+            <w:tcW w:type="dxa" w:w="7560"/>
+            <w:tcMar>
+              <w:top w:type="dxa" w:w="60"/>
+              <w:left w:type="dxa" w:w="100"/>
+              <w:bottom w:type="dxa" w:w="60"/>
+              <w:right w:type="dxa" w:w="100"/>
+            </w:tcMar>
+            <w:vAlign w:val="center"/>
+          </w:tcPr>
+          <w:p>
+            <w:pPr>
+              <w:spacing w:line="240"/>
+            </w:pPr>
+            <w:r>
+              <w:rPr>
+                <w:rFonts w:ascii="Arial" w:cs="Arial" w:eastAsia="Arial" w:hAnsi="Arial"/>
+                <w:b w:val="false"/>
+                <w:bCs w:val="false"/>
+                <w:color w:val="243238"/>
+                <w:sz w:val="18"/>
+                <w:szCs w:val="18"/>
+              </w:rPr>
               <w:t xml:space="preserve">Attestations d’assurance responsabilité civile et décennale — période 2026.</w:t>
             </w:r>
           </w:p>
@@ -11781,7 +13242,7 @@
                 <w:sz w:val="18"/>
                 <w:szCs w:val="18"/>
               </w:rPr>
-              <w:t xml:space="preserve">A9</w:t>
+              <w:t xml:space="preserve">A7</w:t>
             </w:r>
           </w:p>
         </w:tc>
@@ -11876,6 +13337,586 @@
         </w:tc>
       </w:tr>
     </w:tbl>
+    <w:p>
+      <w:r>
+        <w:br w:type="page"/>
+      </w:r>
+    </w:p>
+    <w:tbl>
+      <w:tblPr>
+        <w:tblW w:type="dxa" w:w="3600"/>
+        <w:tblBorders>
+          <w:top w:val="none" w:color="FFFFFF" w:sz="0"/>
+          <w:left w:val="none" w:color="FFFFFF" w:sz="0"/>
+          <w:bottom w:val="none" w:color="FFFFFF" w:sz="0"/>
+          <w:right w:val="none" w:color="FFFFFF" w:sz="0"/>
+          <w:insideH w:val="none" w:color="FFFFFF" w:sz="0"/>
+          <w:insideV w:val="none" w:color="FFFFFF" w:sz="0"/>
+        </w:tblBorders>
+      </w:tblPr>
+      <w:tblGrid>
+        <w:gridCol w:w="3600"/>
+      </w:tblGrid>
+      <w:tr>
+        <w:tc>
+          <w:tcPr>
+            <w:tcW w:type="dxa" w:w="3600"/>
+            <w:shd w:fill="DB982D" w:val="clear"/>
+            <w:tcMar>
+              <w:top w:type="dxa" w:w="60"/>
+              <w:left w:type="dxa" w:w="100"/>
+              <w:bottom w:type="dxa" w:w="60"/>
+              <w:right w:type="dxa" w:w="100"/>
+            </w:tcMar>
+          </w:tcPr>
+          <w:p>
+            <w:r>
+              <w:rPr>
+                <w:rFonts w:ascii="Arial" w:cs="Arial" w:eastAsia="Arial" w:hAnsi="Arial"/>
+                <w:b/>
+                <w:bCs/>
+                <w:color w:val="FFFFFF"/>
+                <w:sz w:val="16"/>
+                <w:szCs w:val="16"/>
+              </w:rPr>
+              <w:t xml:space="preserve">ANNEXE A1</w:t>
+            </w:r>
+          </w:p>
+        </w:tc>
+      </w:tr>
+    </w:tbl>
+    <w:p>
+      <w:pPr>
+        <w:spacing w:after="60"/>
+      </w:pPr>
+    </w:p>
+    <w:p>
+      <w:pPr>
+        <w:pStyle w:val="Heading1"/>
+        <w:spacing w:after="120" w:before="120"/>
+      </w:pPr>
+      <w:r>
+        <w:rPr>
+          <w:rFonts w:ascii="Arial" w:cs="Arial" w:eastAsia="Arial" w:hAnsi="Arial"/>
+          <w:b/>
+          <w:bCs/>
+          <w:color w:val="073E47"/>
+          <w:sz w:val="30"/>
+          <w:szCs w:val="30"/>
+        </w:rPr>
+        <w:t xml:space="preserve">Annexe A1 — Dossier VISAP trois volets</w:t>
+      </w:r>
+    </w:p>
+    <w:p>
+      <w:pPr>
+        <w:spacing w:after="120" w:line="264"/>
+        <w:jc w:val="both"/>
+      </w:pPr>
+      <w:r>
+        <w:rPr>
+          <w:rFonts w:ascii="Arial" w:cs="Arial" w:eastAsia="Arial" w:hAnsi="Arial"/>
+          <w:color w:val="243238"/>
+          <w:sz w:val="19"/>
+          <w:szCs w:val="19"/>
+        </w:rPr>
+        <w:t xml:space="preserve">Le support terrain utilisé lors de chaque visite avant-projet : accès et usage, contrôles rapides, cotes essentielles, croquis d’implantation avant / après, observations et fiche produit à commander.</w:t>
+      </w:r>
+    </w:p>
+    <w:p>
+      <w:pPr>
+        <w:spacing w:after="40" w:before="80"/>
+        <w:jc w:val="center"/>
+      </w:pPr>
+      <w:r>
+        <w:drawing>
+          <wp:inline distT="0" distB="0" distL="0" distR="0">
+            <wp:extent cx="6286500" cy="2962275"/>
+            <wp:effectExtent t="0" r="0" b="0" l="0"/>
+            <wp:docPr id="1" name="" descr="" title=""/>
+            <wp:cNvGraphicFramePr>
+              <a:graphicFrameLocks xmlns:a="http://schemas.openxmlformats.org/drawingml/2006/main" noChangeAspect="1"/>
+            </wp:cNvGraphicFramePr>
+            <a:graphic xmlns:a="http://schemas.openxmlformats.org/drawingml/2006/main">
+              <a:graphicData uri="http://schemas.openxmlformats.org/drawingml/2006/picture">
+                <pic:pic xmlns:pic="http://schemas.openxmlformats.org/drawingml/2006/picture">
+                  <pic:nvPicPr>
+                    <pic:cNvPr id="0" name="" descr=""/>
+                    <pic:cNvPicPr>
+                      <a:picLocks noChangeAspect="1" noChangeArrowheads="1"/>
+                    </pic:cNvPicPr>
+                  </pic:nvPicPr>
+                  <pic:blipFill>
+                    <a:blip r:embed="rId16" cstate="none"/>
+                    <a:srcRect/>
+                    <a:stretch>
+                      <a:fillRect/>
+                    </a:stretch>
+                  </pic:blipFill>
+                  <pic:spPr bwMode="auto">
+                    <a:xfrm>
+                      <a:off x="0" y="0"/>
+                      <a:ext cx="6286500" cy="2962275"/>
+                    </a:xfrm>
+                    <a:prstGeom prst="rect">
+                      <a:avLst/>
+                    </a:prstGeom>
+                  </pic:spPr>
+                </pic:pic>
+              </a:graphicData>
+            </a:graphic>
+          </wp:inline>
+        </w:drawing>
+      </w:r>
+    </w:p>
+    <w:p>
+      <w:pPr>
+        <w:spacing w:after="140"/>
+        <w:jc w:val="center"/>
+      </w:pPr>
+      <w:r>
+        <w:rPr>
+          <w:rFonts w:ascii="Arial" w:cs="Arial" w:eastAsia="Arial" w:hAnsi="Arial"/>
+          <w:i/>
+          <w:iCs/>
+          <w:color w:val="66777C"/>
+          <w:sz w:val="14"/>
+          <w:szCs w:val="14"/>
+        </w:rPr>
+        <w:t xml:space="preserve">Dossier VISAP — couverture du triptyque (format d’impression 630 × 297 mm).</w:t>
+      </w:r>
+    </w:p>
+    <w:p>
+      <w:pPr>
+        <w:spacing w:after="60"/>
+      </w:pPr>
+    </w:p>
+    <w:p>
+      <w:pPr>
+        <w:spacing w:after="40" w:before="80"/>
+        <w:jc w:val="center"/>
+      </w:pPr>
+      <w:r>
+        <w:drawing>
+          <wp:inline distT="0" distB="0" distL="0" distR="0">
+            <wp:extent cx="6286500" cy="2962275"/>
+            <wp:effectExtent t="0" r="0" b="0" l="0"/>
+            <wp:docPr id="1" name="" descr="" title=""/>
+            <wp:cNvGraphicFramePr>
+              <a:graphicFrameLocks xmlns:a="http://schemas.openxmlformats.org/drawingml/2006/main" noChangeAspect="1"/>
+            </wp:cNvGraphicFramePr>
+            <a:graphic xmlns:a="http://schemas.openxmlformats.org/drawingml/2006/main">
+              <a:graphicData uri="http://schemas.openxmlformats.org/drawingml/2006/picture">
+                <pic:pic xmlns:pic="http://schemas.openxmlformats.org/drawingml/2006/picture">
+                  <pic:nvPicPr>
+                    <pic:cNvPr id="0" name="" descr=""/>
+                    <pic:cNvPicPr>
+                      <a:picLocks noChangeAspect="1" noChangeArrowheads="1"/>
+                    </pic:cNvPicPr>
+                  </pic:nvPicPr>
+                  <pic:blipFill>
+                    <a:blip r:embed="rId17" cstate="none"/>
+                    <a:srcRect/>
+                    <a:stretch>
+                      <a:fillRect/>
+                    </a:stretch>
+                  </pic:blipFill>
+                  <pic:spPr bwMode="auto">
+                    <a:xfrm>
+                      <a:off x="0" y="0"/>
+                      <a:ext cx="6286500" cy="2962275"/>
+                    </a:xfrm>
+                    <a:prstGeom prst="rect">
+                      <a:avLst/>
+                    </a:prstGeom>
+                  </pic:spPr>
+                </pic:pic>
+              </a:graphicData>
+            </a:graphic>
+          </wp:inline>
+        </w:drawing>
+      </w:r>
+    </w:p>
+    <w:p>
+      <w:pPr>
+        <w:spacing w:after="140"/>
+        <w:jc w:val="center"/>
+      </w:pPr>
+      <w:r>
+        <w:rPr>
+          <w:rFonts w:ascii="Arial" w:cs="Arial" w:eastAsia="Arial" w:hAnsi="Arial"/>
+          <w:i/>
+          <w:iCs/>
+          <w:color w:val="66777C"/>
+          <w:sz w:val="14"/>
+          <w:szCs w:val="14"/>
+        </w:rPr>
+        <w:t xml:space="preserve">Dossier VISAP — volets intérieurs : fiche terrain, croquis et fiche produit.</w:t>
+      </w:r>
+    </w:p>
+    <w:p>
+      <w:r>
+        <w:br w:type="page"/>
+      </w:r>
+    </w:p>
+    <w:tbl>
+      <w:tblPr>
+        <w:tblW w:type="dxa" w:w="3600"/>
+        <w:tblBorders>
+          <w:top w:val="none" w:color="FFFFFF" w:sz="0"/>
+          <w:left w:val="none" w:color="FFFFFF" w:sz="0"/>
+          <w:bottom w:val="none" w:color="FFFFFF" w:sz="0"/>
+          <w:right w:val="none" w:color="FFFFFF" w:sz="0"/>
+          <w:insideH w:val="none" w:color="FFFFFF" w:sz="0"/>
+          <w:insideV w:val="none" w:color="FFFFFF" w:sz="0"/>
+        </w:tblBorders>
+      </w:tblPr>
+      <w:tblGrid>
+        <w:gridCol w:w="3600"/>
+      </w:tblGrid>
+      <w:tr>
+        <w:tc>
+          <w:tcPr>
+            <w:tcW w:type="dxa" w:w="3600"/>
+            <w:shd w:fill="DB982D" w:val="clear"/>
+            <w:tcMar>
+              <w:top w:type="dxa" w:w="60"/>
+              <w:left w:type="dxa" w:w="100"/>
+              <w:bottom w:type="dxa" w:w="60"/>
+              <w:right w:type="dxa" w:w="100"/>
+            </w:tcMar>
+          </w:tcPr>
+          <w:p>
+            <w:r>
+              <w:rPr>
+                <w:rFonts w:ascii="Arial" w:cs="Arial" w:eastAsia="Arial" w:hAnsi="Arial"/>
+                <w:b/>
+                <w:bCs/>
+                <w:color w:val="FFFFFF"/>
+                <w:sz w:val="16"/>
+                <w:szCs w:val="16"/>
+              </w:rPr>
+              <w:t xml:space="preserve">ANNEXE A2</w:t>
+            </w:r>
+          </w:p>
+        </w:tc>
+      </w:tr>
+    </w:tbl>
+    <w:p>
+      <w:pPr>
+        <w:spacing w:after="60"/>
+      </w:pPr>
+    </w:p>
+    <w:p>
+      <w:pPr>
+        <w:pStyle w:val="Heading1"/>
+        <w:spacing w:after="120" w:before="120"/>
+      </w:pPr>
+      <w:r>
+        <w:rPr>
+          <w:rFonts w:ascii="Arial" w:cs="Arial" w:eastAsia="Arial" w:hAnsi="Arial"/>
+          <w:b/>
+          <w:bCs/>
+          <w:color w:val="073E47"/>
+          <w:sz w:val="30"/>
+          <w:szCs w:val="30"/>
+        </w:rPr>
+        <w:t xml:space="preserve">Annexe A2 — Procès-verbal de réception</w:t>
+      </w:r>
+    </w:p>
+    <w:p>
+      <w:pPr>
+        <w:spacing w:after="120" w:line="264"/>
+        <w:jc w:val="both"/>
+      </w:pPr>
+      <w:r>
+        <w:rPr>
+          <w:rFonts w:ascii="Arial" w:cs="Arial" w:eastAsia="Arial" w:hAnsi="Arial"/>
+          <w:color w:val="243238"/>
+          <w:sz w:val="19"/>
+          <w:szCs w:val="19"/>
+        </w:rPr>
+        <w:t xml:space="preserve">Le PV signé contradictoirement avec le bénéficiaire dès la fin de l’installation : installation réalisée, contrôles, décision, réserves éventuelles et documents remis.</w:t>
+      </w:r>
+    </w:p>
+    <w:p>
+      <w:pPr>
+        <w:spacing w:after="40" w:before="80"/>
+        <w:jc w:val="center"/>
+      </w:pPr>
+      <w:r>
+        <w:drawing>
+          <wp:inline distT="0" distB="0" distL="0" distR="0">
+            <wp:extent cx="4476750" cy="6324600"/>
+            <wp:effectExtent t="0" r="0" b="0" l="0"/>
+            <wp:docPr id="1" name="" descr="" title=""/>
+            <wp:cNvGraphicFramePr>
+              <a:graphicFrameLocks xmlns:a="http://schemas.openxmlformats.org/drawingml/2006/main" noChangeAspect="1"/>
+            </wp:cNvGraphicFramePr>
+            <a:graphic xmlns:a="http://schemas.openxmlformats.org/drawingml/2006/main">
+              <a:graphicData uri="http://schemas.openxmlformats.org/drawingml/2006/picture">
+                <pic:pic xmlns:pic="http://schemas.openxmlformats.org/drawingml/2006/picture">
+                  <pic:nvPicPr>
+                    <pic:cNvPr id="0" name="" descr=""/>
+                    <pic:cNvPicPr>
+                      <a:picLocks noChangeAspect="1" noChangeArrowheads="1"/>
+                    </pic:cNvPicPr>
+                  </pic:nvPicPr>
+                  <pic:blipFill>
+                    <a:blip r:embed="rId18" cstate="none"/>
+                    <a:srcRect/>
+                    <a:stretch>
+                      <a:fillRect/>
+                    </a:stretch>
+                  </pic:blipFill>
+                  <pic:spPr bwMode="auto">
+                    <a:xfrm>
+                      <a:off x="0" y="0"/>
+                      <a:ext cx="4476750" cy="6324600"/>
+                    </a:xfrm>
+                    <a:prstGeom prst="rect">
+                      <a:avLst/>
+                    </a:prstGeom>
+                  </pic:spPr>
+                </pic:pic>
+              </a:graphicData>
+            </a:graphic>
+          </wp:inline>
+        </w:drawing>
+      </w:r>
+    </w:p>
+    <w:p>
+      <w:pPr>
+        <w:spacing w:after="140"/>
+        <w:jc w:val="center"/>
+      </w:pPr>
+      <w:r>
+        <w:rPr>
+          <w:rFonts w:ascii="Arial" w:cs="Arial" w:eastAsia="Arial" w:hAnsi="Arial"/>
+          <w:i/>
+          <w:iCs/>
+          <w:color w:val="66777C"/>
+          <w:sz w:val="14"/>
+          <w:szCs w:val="14"/>
+        </w:rPr>
+        <w:t xml:space="preserve">Procès-verbal de réception ADOM SENIOR (CLI-RECEPTION-01).</w:t>
+      </w:r>
+    </w:p>
+    <w:p>
+      <w:r>
+        <w:br w:type="page"/>
+      </w:r>
+    </w:p>
+    <w:tbl>
+      <w:tblPr>
+        <w:tblW w:type="dxa" w:w="3600"/>
+        <w:tblBorders>
+          <w:top w:val="none" w:color="FFFFFF" w:sz="0"/>
+          <w:left w:val="none" w:color="FFFFFF" w:sz="0"/>
+          <w:bottom w:val="none" w:color="FFFFFF" w:sz="0"/>
+          <w:right w:val="none" w:color="FFFFFF" w:sz="0"/>
+          <w:insideH w:val="none" w:color="FFFFFF" w:sz="0"/>
+          <w:insideV w:val="none" w:color="FFFFFF" w:sz="0"/>
+        </w:tblBorders>
+      </w:tblPr>
+      <w:tblGrid>
+        <w:gridCol w:w="3600"/>
+      </w:tblGrid>
+      <w:tr>
+        <w:tc>
+          <w:tcPr>
+            <w:tcW w:type="dxa" w:w="3600"/>
+            <w:shd w:fill="DB982D" w:val="clear"/>
+            <w:tcMar>
+              <w:top w:type="dxa" w:w="60"/>
+              <w:left w:type="dxa" w:w="100"/>
+              <w:bottom w:type="dxa" w:w="60"/>
+              <w:right w:type="dxa" w:w="100"/>
+            </w:tcMar>
+          </w:tcPr>
+          <w:p>
+            <w:r>
+              <w:rPr>
+                <w:rFonts w:ascii="Arial" w:cs="Arial" w:eastAsia="Arial" w:hAnsi="Arial"/>
+                <w:b/>
+                <w:bCs/>
+                <w:color w:val="FFFFFF"/>
+                <w:sz w:val="16"/>
+                <w:szCs w:val="16"/>
+              </w:rPr>
+              <w:t xml:space="preserve">ANNEXE A3</w:t>
+            </w:r>
+          </w:p>
+        </w:tc>
+      </w:tr>
+    </w:tbl>
+    <w:p>
+      <w:pPr>
+        <w:spacing w:after="60"/>
+      </w:pPr>
+    </w:p>
+    <w:p>
+      <w:pPr>
+        <w:pStyle w:val="Heading1"/>
+        <w:spacing w:after="120" w:before="120"/>
+      </w:pPr>
+      <w:r>
+        <w:rPr>
+          <w:rFonts w:ascii="Arial" w:cs="Arial" w:eastAsia="Arial" w:hAnsi="Arial"/>
+          <w:b/>
+          <w:bCs/>
+          <w:color w:val="073E47"/>
+          <w:sz w:val="30"/>
+          <w:szCs w:val="30"/>
+        </w:rPr>
+        <w:t xml:space="preserve">Annexe A3 — Notice d’utilisation et d’entretien</w:t>
+      </w:r>
+    </w:p>
+    <w:p>
+      <w:pPr>
+        <w:spacing w:after="120" w:line="264"/>
+        <w:jc w:val="both"/>
+      </w:pPr>
+      <w:r>
+        <w:rPr>
+          <w:rFonts w:ascii="Arial" w:cs="Arial" w:eastAsia="Arial" w:hAnsi="Arial"/>
+          <w:color w:val="243238"/>
+          <w:sz w:val="19"/>
+          <w:szCs w:val="19"/>
+        </w:rPr>
+        <w:t xml:space="preserve">La notice remise et expliquée au locataire à la réception : gestes quotidiens, entretien hebdomadaire, produits à éviter et contact SAV.</w:t>
+      </w:r>
+    </w:p>
+    <w:p>
+      <w:pPr>
+        <w:spacing w:after="40" w:before="80"/>
+        <w:jc w:val="center"/>
+      </w:pPr>
+      <w:r>
+        <w:drawing>
+          <wp:inline distT="0" distB="0" distL="0" distR="0">
+            <wp:extent cx="4191000" cy="5924550"/>
+            <wp:effectExtent t="0" r="0" b="0" l="0"/>
+            <wp:docPr id="1" name="" descr="" title=""/>
+            <wp:cNvGraphicFramePr>
+              <a:graphicFrameLocks xmlns:a="http://schemas.openxmlformats.org/drawingml/2006/main" noChangeAspect="1"/>
+            </wp:cNvGraphicFramePr>
+            <a:graphic xmlns:a="http://schemas.openxmlformats.org/drawingml/2006/main">
+              <a:graphicData uri="http://schemas.openxmlformats.org/drawingml/2006/picture">
+                <pic:pic xmlns:pic="http://schemas.openxmlformats.org/drawingml/2006/picture">
+                  <pic:nvPicPr>
+                    <pic:cNvPr id="0" name="" descr=""/>
+                    <pic:cNvPicPr>
+                      <a:picLocks noChangeAspect="1" noChangeArrowheads="1"/>
+                    </pic:cNvPicPr>
+                  </pic:nvPicPr>
+                  <pic:blipFill>
+                    <a:blip r:embed="rId19" cstate="none"/>
+                    <a:srcRect/>
+                    <a:stretch>
+                      <a:fillRect/>
+                    </a:stretch>
+                  </pic:blipFill>
+                  <pic:spPr bwMode="auto">
+                    <a:xfrm>
+                      <a:off x="0" y="0"/>
+                      <a:ext cx="4191000" cy="5924550"/>
+                    </a:xfrm>
+                    <a:prstGeom prst="rect">
+                      <a:avLst/>
+                    </a:prstGeom>
+                  </pic:spPr>
+                </pic:pic>
+              </a:graphicData>
+            </a:graphic>
+          </wp:inline>
+        </w:drawing>
+      </w:r>
+    </w:p>
+    <w:p>
+      <w:pPr>
+        <w:spacing w:after="140"/>
+        <w:jc w:val="center"/>
+      </w:pPr>
+      <w:r>
+        <w:rPr>
+          <w:rFonts w:ascii="Arial" w:cs="Arial" w:eastAsia="Arial" w:hAnsi="Arial"/>
+          <w:i/>
+          <w:iCs/>
+          <w:color w:val="66777C"/>
+          <w:sz w:val="14"/>
+          <w:szCs w:val="14"/>
+        </w:rPr>
+        <w:t xml:space="preserve">Notice client — utilisation et entretien de la douche (page 1).</w:t>
+      </w:r>
+    </w:p>
+    <w:p>
+      <w:r>
+        <w:br w:type="page"/>
+      </w:r>
+    </w:p>
+    <w:p>
+      <w:pPr>
+        <w:spacing w:after="40" w:before="80"/>
+        <w:jc w:val="center"/>
+      </w:pPr>
+      <w:r>
+        <w:drawing>
+          <wp:inline distT="0" distB="0" distL="0" distR="0">
+            <wp:extent cx="4191000" cy="5924550"/>
+            <wp:effectExtent t="0" r="0" b="0" l="0"/>
+            <wp:docPr id="1" name="" descr="" title=""/>
+            <wp:cNvGraphicFramePr>
+              <a:graphicFrameLocks xmlns:a="http://schemas.openxmlformats.org/drawingml/2006/main" noChangeAspect="1"/>
+            </wp:cNvGraphicFramePr>
+            <a:graphic xmlns:a="http://schemas.openxmlformats.org/drawingml/2006/main">
+              <a:graphicData uri="http://schemas.openxmlformats.org/drawingml/2006/picture">
+                <pic:pic xmlns:pic="http://schemas.openxmlformats.org/drawingml/2006/picture">
+                  <pic:nvPicPr>
+                    <pic:cNvPr id="0" name="" descr=""/>
+                    <pic:cNvPicPr>
+                      <a:picLocks noChangeAspect="1" noChangeArrowheads="1"/>
+                    </pic:cNvPicPr>
+                  </pic:nvPicPr>
+                  <pic:blipFill>
+                    <a:blip r:embed="rId20" cstate="none"/>
+                    <a:srcRect/>
+                    <a:stretch>
+                      <a:fillRect/>
+                    </a:stretch>
+                  </pic:blipFill>
+                  <pic:spPr bwMode="auto">
+                    <a:xfrm>
+                      <a:off x="0" y="0"/>
+                      <a:ext cx="4191000" cy="5924550"/>
+                    </a:xfrm>
+                    <a:prstGeom prst="rect">
+                      <a:avLst/>
+                    </a:prstGeom>
+                  </pic:spPr>
+                </pic:pic>
+              </a:graphicData>
+            </a:graphic>
+          </wp:inline>
+        </w:drawing>
+      </w:r>
+    </w:p>
+    <w:p>
+      <w:pPr>
+        <w:spacing w:after="140"/>
+        <w:jc w:val="center"/>
+      </w:pPr>
+      <w:r>
+        <w:rPr>
+          <w:rFonts w:ascii="Arial" w:cs="Arial" w:eastAsia="Arial" w:hAnsi="Arial"/>
+          <w:i/>
+          <w:iCs/>
+          <w:color w:val="66777C"/>
+          <w:sz w:val="14"/>
+          <w:szCs w:val="14"/>
+        </w:rPr>
+        <w:t xml:space="preserve">Notice client — utilisation et entretien de la douche (page 2).</w:t>
+      </w:r>
+    </w:p>
     <w:sectPr>
       <w:headerReference w:type="default" r:id="rId7"/>
       <w:footerReference w:type="default" r:id="rId8"/>

</xml_diff>